<commit_message>
Change for license BSD-2
</commit_message>
<xml_diff>
--- a/Manuels/Manuel_EEGpal_Main.docx
+++ b/Manuels/Manuel_EEGpal_Main.docx
@@ -119,14 +119,14 @@
           <w:rFonts w:ascii="Calibri" w:hAnsi="Calibri" w:cs="Calibri"/>
           <w:lang w:val="en-US"/>
         </w:rPr>
-        <w:t>2.0</w:t>
-      </w:r>
-      <w:r>
-        <w:rPr>
-          <w:rFonts w:ascii="Calibri" w:hAnsi="Calibri" w:cs="Calibri"/>
-          <w:lang w:val="en-US"/>
-        </w:rPr>
-        <w:t>1</w:t>
+        <w:t>2.</w:t>
+      </w:r>
+      <w:r>
+        <w:rPr>
+          <w:rFonts w:ascii="Calibri" w:hAnsi="Calibri" w:cs="Calibri"/>
+          <w:lang w:val="en-US"/>
+        </w:rPr>
+        <w:t>14</w:t>
       </w:r>
       <w:r>
         <w:rPr>
@@ -140,14 +140,7 @@
           <w:rFonts w:ascii="Calibri" w:hAnsi="Calibri" w:cs="Calibri"/>
           <w:lang w:val="en-US"/>
         </w:rPr>
-        <w:t>2</w:t>
-      </w:r>
-      <w:r>
-        <w:rPr>
-          <w:rFonts w:ascii="Calibri" w:hAnsi="Calibri" w:cs="Calibri"/>
-          <w:lang w:val="en-US"/>
-        </w:rPr>
-        <w:t>0</w:t>
+        <w:t>04</w:t>
       </w:r>
       <w:r>
         <w:rPr>
@@ -161,7 +154,7 @@
           <w:rFonts w:ascii="Calibri" w:hAnsi="Calibri" w:cs="Calibri"/>
           <w:lang w:val="en-US"/>
         </w:rPr>
-        <w:t>11</w:t>
+        <w:t>07</w:t>
       </w:r>
       <w:r>
         <w:rPr>
@@ -175,7 +168,7 @@
           <w:rFonts w:ascii="Calibri" w:hAnsi="Calibri" w:cs="Calibri"/>
           <w:lang w:val="en-US"/>
         </w:rPr>
-        <w:t>5</w:t>
+        <w:t>6</w:t>
       </w:r>
     </w:p>
     <w:p>
@@ -549,16 +542,29 @@
         </w:rPr>
         <w:t xml:space="preserve"> DOI: </w:t>
       </w:r>
-      <w:hyperlink r:id="rId12" w:tgtFrame="_blank" w:history="1">
-        <w:r>
-          <w:rPr>
-            <w:rStyle w:val="Hyperlink"/>
-            <w:rFonts w:ascii="Calibri" w:hAnsi="Calibri" w:cs="Calibri"/>
-            <w:lang w:val="en-US"/>
-          </w:rPr>
-          <w:t xml:space="preserve">10.1016/j.jneumeth.2003.10.009 </w:t>
-        </w:r>
-      </w:hyperlink>
+      <w:r>
+        <w:fldChar w:fldCharType="begin"/>
+      </w:r>
+      <w:r>
+        <w:rPr>
+          <w:lang w:val="en-US"/>
+        </w:rPr>
+        <w:instrText>HYPERLINK "https://doi.org/10.1016/j.jneumeth.2003.10.009" \t "_blank"</w:instrText>
+      </w:r>
+      <w:r>
+        <w:fldChar w:fldCharType="separate"/>
+      </w:r>
+      <w:r>
+        <w:rPr>
+          <w:rStyle w:val="Hyperlink"/>
+          <w:rFonts w:ascii="Calibri" w:hAnsi="Calibri" w:cs="Calibri"/>
+          <w:lang w:val="en-US"/>
+        </w:rPr>
+        <w:t xml:space="preserve">10.1016/j.jneumeth.2003.10.009 </w:t>
+      </w:r>
+      <w:r>
+        <w:fldChar w:fldCharType="end"/>
+      </w:r>
       <w:r>
         <w:rPr>
           <w:rFonts w:ascii="Calibri" w:hAnsi="Calibri" w:cs="Calibri"/>
@@ -1009,6 +1015,7 @@
           <w:lang w:val="en-US"/>
         </w:rPr>
       </w:pPr>
+      <w:proofErr w:type="spellStart"/>
       <w:r>
         <w:rPr>
           <w:rFonts w:ascii="Calibri" w:hAnsi="Calibri" w:cs="Calibri"/>
@@ -1016,8 +1023,9 @@
           <w:bCs/>
           <w:lang w:val="en-US"/>
         </w:rPr>
-        <w:t>GNU General Public License v</w:t>
-      </w:r>
+        <w:t>EEGpal</w:t>
+      </w:r>
+      <w:proofErr w:type="spellEnd"/>
       <w:r>
         <w:rPr>
           <w:rFonts w:ascii="Calibri" w:hAnsi="Calibri" w:cs="Calibri"/>
@@ -1025,7 +1033,154 @@
           <w:bCs/>
           <w:lang w:val="en-US"/>
         </w:rPr>
-        <w:t>4</w:t>
+        <w:t xml:space="preserve"> is distributed under the BSD 2-Clause License.</w:t>
+      </w:r>
+    </w:p>
+    <w:p>
+      <w:pPr>
+        <w:spacing w:line="276" w:lineRule="auto"/>
+        <w:rPr>
+          <w:rFonts w:ascii="Calibri" w:hAnsi="Calibri" w:cs="Calibri"/>
+          <w:lang w:val="en-US"/>
+        </w:rPr>
+      </w:pPr>
+      <w:r>
+        <w:rPr>
+          <w:rFonts w:ascii="Calibri" w:hAnsi="Calibri" w:cs="Calibri"/>
+          <w:lang w:val="en-US"/>
+        </w:rPr>
+        <w:t>Third-party software included in this repository is distributed under</w:t>
+      </w:r>
+      <w:r>
+        <w:rPr>
+          <w:rFonts w:ascii="Calibri" w:hAnsi="Calibri" w:cs="Calibri"/>
+          <w:lang w:val="en-US"/>
+        </w:rPr>
+        <w:t xml:space="preserve"> </w:t>
+      </w:r>
+      <w:r>
+        <w:rPr>
+          <w:rFonts w:ascii="Calibri" w:hAnsi="Calibri" w:cs="Calibri"/>
+          <w:lang w:val="en-US"/>
+        </w:rPr>
+        <w:t xml:space="preserve">its own respective licenses, which may differ from the </w:t>
+      </w:r>
+      <w:proofErr w:type="spellStart"/>
+      <w:r>
+        <w:rPr>
+          <w:rFonts w:ascii="Calibri" w:hAnsi="Calibri" w:cs="Calibri"/>
+          <w:lang w:val="en-US"/>
+        </w:rPr>
+        <w:t>EEGpal</w:t>
+      </w:r>
+      <w:proofErr w:type="spellEnd"/>
+      <w:r>
+        <w:rPr>
+          <w:rFonts w:ascii="Calibri" w:hAnsi="Calibri" w:cs="Calibri"/>
+          <w:lang w:val="en-US"/>
+        </w:rPr>
+        <w:t xml:space="preserve"> license.</w:t>
+      </w:r>
+      <w:r>
+        <w:rPr>
+          <w:rFonts w:ascii="Calibri" w:hAnsi="Calibri" w:cs="Calibri"/>
+          <w:lang w:val="en-US"/>
+        </w:rPr>
+        <w:t xml:space="preserve"> </w:t>
+      </w:r>
+      <w:r>
+        <w:rPr>
+          <w:rFonts w:ascii="Calibri" w:hAnsi="Calibri" w:cs="Calibri"/>
+          <w:lang w:val="en-US"/>
+        </w:rPr>
+        <w:t>Users are responsible for complying with the license terms applicable</w:t>
+      </w:r>
+      <w:r>
+        <w:rPr>
+          <w:rFonts w:ascii="Calibri" w:hAnsi="Calibri" w:cs="Calibri"/>
+          <w:lang w:val="en-US"/>
+        </w:rPr>
+        <w:t xml:space="preserve"> </w:t>
+      </w:r>
+      <w:r>
+        <w:rPr>
+          <w:rFonts w:ascii="Calibri" w:hAnsi="Calibri" w:cs="Calibri"/>
+          <w:lang w:val="en-US"/>
+        </w:rPr>
+        <w:t>to each third-party component</w:t>
+      </w:r>
+      <w:r>
+        <w:rPr>
+          <w:rFonts w:ascii="Calibri" w:hAnsi="Calibri" w:cs="Calibri"/>
+          <w:lang w:val="en-US"/>
+        </w:rPr>
+        <w:t xml:space="preserve"> (see LICENSE.txt file)</w:t>
+      </w:r>
+      <w:r>
+        <w:rPr>
+          <w:rFonts w:ascii="Calibri" w:hAnsi="Calibri" w:cs="Calibri"/>
+          <w:lang w:val="en-US"/>
+        </w:rPr>
+        <w:t>.</w:t>
+      </w:r>
+    </w:p>
+    <w:p>
+      <w:pPr>
+        <w:spacing w:line="276" w:lineRule="auto"/>
+        <w:rPr>
+          <w:rFonts w:ascii="Calibri" w:hAnsi="Calibri" w:cs="Calibri"/>
+          <w:lang w:val="en-US"/>
+        </w:rPr>
+      </w:pPr>
+    </w:p>
+    <w:p>
+      <w:pPr>
+        <w:pStyle w:val="Heading3"/>
+        <w:rPr>
+          <w:rFonts w:ascii="Calibri" w:hAnsi="Calibri" w:cs="Calibri"/>
+          <w:lang w:val="en-US"/>
+        </w:rPr>
+      </w:pPr>
+      <w:proofErr w:type="spellStart"/>
+      <w:r>
+        <w:rPr>
+          <w:rFonts w:ascii="Calibri" w:hAnsi="Calibri" w:cs="Calibri"/>
+          <w:lang w:val="en-US"/>
+        </w:rPr>
+        <w:t>Disclamer</w:t>
+      </w:r>
+      <w:proofErr w:type="spellEnd"/>
+      <w:r>
+        <w:rPr>
+          <w:rFonts w:ascii="Calibri" w:hAnsi="Calibri" w:cs="Calibri"/>
+          <w:lang w:val="en-US"/>
+        </w:rPr>
+        <w:t xml:space="preserve"> </w:t>
+      </w:r>
+    </w:p>
+    <w:p>
+      <w:pPr>
+        <w:spacing w:line="276" w:lineRule="auto"/>
+        <w:rPr>
+          <w:rFonts w:ascii="Calibri" w:hAnsi="Calibri" w:cs="Calibri"/>
+          <w:lang w:val="en-US"/>
+        </w:rPr>
+      </w:pPr>
+      <w:proofErr w:type="spellStart"/>
+      <w:r>
+        <w:rPr>
+          <w:rFonts w:ascii="Calibri" w:hAnsi="Calibri" w:cs="Calibri"/>
+          <w:lang w:val="en-US"/>
+        </w:rPr>
+        <w:t>EEGpal</w:t>
+      </w:r>
+      <w:proofErr w:type="spellEnd"/>
+      <w:r>
+        <w:rPr>
+          <w:rFonts w:ascii="Calibri" w:hAnsi="Calibri" w:cs="Calibri"/>
+          <w:lang w:val="en-US"/>
+        </w:rPr>
+        <w:t xml:space="preserve"> is provided as an open-source toolbox to support EEG data analysis and scientific research. While every effort has been made to ensure the quality and reliability of the software, it is provided </w:t>
       </w:r>
       <w:r>
         <w:rPr>
@@ -1034,7 +1189,14 @@
           <w:bCs/>
           <w:lang w:val="en-US"/>
         </w:rPr>
-        <w:t>.0 or later</w:t>
+        <w:t>"as is"</w:t>
+      </w:r>
+      <w:r>
+        <w:rPr>
+          <w:rFonts w:ascii="Calibri" w:hAnsi="Calibri" w:cs="Calibri"/>
+          <w:lang w:val="en-US"/>
+        </w:rPr>
+        <w:t>, without warranty of any kind, express or implied.</w:t>
       </w:r>
     </w:p>
     <w:p>
@@ -1045,13 +1207,31 @@
           <w:lang w:val="en-US"/>
         </w:rPr>
       </w:pPr>
-      <w:r>
-        <w:rPr>
-          <w:rFonts w:ascii="Calibri" w:hAnsi="Calibri" w:cs="Calibri"/>
-          <w:lang w:val="en-US"/>
-        </w:rPr>
-        <w:t>Permissions of this strong copyleft license are conditioned on making available complete source code of licensed works and modifications, which include larger works using a licensed work, under the same license. Copyright and license notices must be preserved. Contributors provide an express grant of patent rights.</w:t>
-      </w:r>
+    </w:p>
+    <w:p>
+      <w:pPr>
+        <w:pStyle w:val="Heading3"/>
+        <w:rPr>
+          <w:rFonts w:ascii="Calibri" w:hAnsi="Calibri" w:cs="Calibri"/>
+          <w:lang w:val="en-US"/>
+        </w:rPr>
+      </w:pPr>
+      <w:r>
+        <w:rPr>
+          <w:rFonts w:ascii="Calibri" w:hAnsi="Calibri" w:cs="Calibri"/>
+          <w:lang w:val="en-US"/>
+        </w:rPr>
+        <w:t xml:space="preserve">Before </w:t>
+      </w:r>
+      <w:proofErr w:type="gramStart"/>
+      <w:r>
+        <w:rPr>
+          <w:rFonts w:ascii="Calibri" w:hAnsi="Calibri" w:cs="Calibri"/>
+          <w:lang w:val="en-US"/>
+        </w:rPr>
+        <w:t>to start</w:t>
+      </w:r>
+      <w:proofErr w:type="gramEnd"/>
     </w:p>
     <w:p>
       <w:pPr>
@@ -1066,224 +1246,6 @@
           <w:rFonts w:ascii="Calibri" w:hAnsi="Calibri" w:cs="Calibri"/>
           <w:lang w:val="en-US"/>
         </w:rPr>
-        <w:t xml:space="preserve">Or </w:t>
-      </w:r>
-      <w:r>
-        <w:rPr>
-          <w:rFonts w:ascii="Calibri" w:hAnsi="Calibri" w:cs="Calibri"/>
-          <w:b/>
-          <w:bCs/>
-          <w:lang w:val="en-US"/>
-        </w:rPr>
-        <w:t>Creative Commons Attribution-</w:t>
-      </w:r>
-      <w:proofErr w:type="spellStart"/>
-      <w:r>
-        <w:rPr>
-          <w:rFonts w:ascii="Calibri" w:hAnsi="Calibri" w:cs="Calibri"/>
-          <w:b/>
-          <w:bCs/>
-          <w:lang w:val="en-US"/>
-        </w:rPr>
-        <w:t>NonCommercial</w:t>
-      </w:r>
-      <w:proofErr w:type="spellEnd"/>
-      <w:r>
-        <w:rPr>
-          <w:rFonts w:ascii="Calibri" w:hAnsi="Calibri" w:cs="Calibri"/>
-          <w:b/>
-          <w:bCs/>
-          <w:lang w:val="en-US"/>
-        </w:rPr>
-        <w:t xml:space="preserve"> 4.0 International License</w:t>
-      </w:r>
-    </w:p>
-    <w:p>
-      <w:pPr>
-        <w:spacing w:line="276" w:lineRule="auto"/>
-        <w:rPr>
-          <w:rFonts w:ascii="Calibri" w:hAnsi="Calibri" w:cs="Calibri"/>
-          <w:lang w:val="en-US"/>
-        </w:rPr>
-      </w:pPr>
-    </w:p>
-    <w:p>
-      <w:pPr>
-        <w:pStyle w:val="Heading3"/>
-        <w:rPr>
-          <w:rFonts w:ascii="Calibri" w:hAnsi="Calibri" w:cs="Calibri"/>
-          <w:lang w:val="en-US"/>
-        </w:rPr>
-      </w:pPr>
-      <w:proofErr w:type="spellStart"/>
-      <w:r>
-        <w:rPr>
-          <w:rFonts w:ascii="Calibri" w:hAnsi="Calibri" w:cs="Calibri"/>
-          <w:lang w:val="en-US"/>
-        </w:rPr>
-        <w:t>Disclamer</w:t>
-      </w:r>
-      <w:proofErr w:type="spellEnd"/>
-      <w:r>
-        <w:rPr>
-          <w:rFonts w:ascii="Calibri" w:hAnsi="Calibri" w:cs="Calibri"/>
-          <w:lang w:val="en-US"/>
-        </w:rPr>
-        <w:t xml:space="preserve"> </w:t>
-      </w:r>
-    </w:p>
-    <w:p>
-      <w:pPr>
-        <w:spacing w:line="276" w:lineRule="auto"/>
-        <w:rPr>
-          <w:rFonts w:ascii="Calibri" w:hAnsi="Calibri" w:cs="Calibri"/>
-          <w:lang w:val="en-US"/>
-        </w:rPr>
-      </w:pPr>
-      <w:proofErr w:type="spellStart"/>
-      <w:r>
-        <w:rPr>
-          <w:rFonts w:ascii="Calibri" w:hAnsi="Calibri" w:cs="Calibri"/>
-          <w:lang w:val="en-US"/>
-        </w:rPr>
-        <w:t>EEGpal</w:t>
-      </w:r>
-      <w:proofErr w:type="spellEnd"/>
-      <w:r>
-        <w:rPr>
-          <w:rFonts w:ascii="Calibri" w:hAnsi="Calibri" w:cs="Calibri"/>
-          <w:lang w:val="en-US"/>
-        </w:rPr>
-        <w:t xml:space="preserve"> is distributed in the hope that it will be useful for EEG data analysis and research purposes, but </w:t>
-      </w:r>
-      <w:r>
-        <w:rPr>
-          <w:rFonts w:ascii="Calibri" w:hAnsi="Calibri" w:cs="Calibri"/>
-          <w:b/>
-          <w:bCs/>
-          <w:lang w:val="en-US"/>
-        </w:rPr>
-        <w:t>without any warranty</w:t>
-      </w:r>
-      <w:r>
-        <w:rPr>
-          <w:rFonts w:ascii="Calibri" w:hAnsi="Calibri" w:cs="Calibri"/>
-          <w:lang w:val="en-US"/>
-        </w:rPr>
-        <w:t xml:space="preserve">. The authors and contributors of </w:t>
-      </w:r>
-      <w:proofErr w:type="spellStart"/>
-      <w:r>
-        <w:rPr>
-          <w:rFonts w:ascii="Calibri" w:hAnsi="Calibri" w:cs="Calibri"/>
-          <w:lang w:val="en-US"/>
-        </w:rPr>
-        <w:t>EEGpal</w:t>
-      </w:r>
-      <w:proofErr w:type="spellEnd"/>
-      <w:r>
-        <w:rPr>
-          <w:rFonts w:ascii="Calibri" w:hAnsi="Calibri" w:cs="Calibri"/>
-          <w:lang w:val="en-US"/>
-        </w:rPr>
-        <w:t xml:space="preserve"> </w:t>
-      </w:r>
-      <w:r>
-        <w:rPr>
-          <w:rFonts w:ascii="Calibri" w:hAnsi="Calibri" w:cs="Calibri"/>
-          <w:b/>
-          <w:bCs/>
-          <w:lang w:val="en-US"/>
-        </w:rPr>
-        <w:t>make no representations or guarantees regarding the accuracy, reliability, or validity of the results</w:t>
-      </w:r>
-      <w:r>
-        <w:rPr>
-          <w:rFonts w:ascii="Calibri" w:hAnsi="Calibri" w:cs="Calibri"/>
-          <w:lang w:val="en-US"/>
-        </w:rPr>
-        <w:t xml:space="preserve"> obtained using this software. Users are solely responsible for verifying the correctness of their analyses and for any interpretations, decisions, or consequences derived from the use of </w:t>
-      </w:r>
-      <w:proofErr w:type="spellStart"/>
-      <w:r>
-        <w:rPr>
-          <w:rFonts w:ascii="Calibri" w:hAnsi="Calibri" w:cs="Calibri"/>
-          <w:lang w:val="en-US"/>
-        </w:rPr>
-        <w:t>EEGpal</w:t>
-      </w:r>
-      <w:proofErr w:type="spellEnd"/>
-      <w:r>
-        <w:rPr>
-          <w:rFonts w:ascii="Calibri" w:hAnsi="Calibri" w:cs="Calibri"/>
-          <w:lang w:val="en-US"/>
-        </w:rPr>
-        <w:t xml:space="preserve">. The software is provided </w:t>
-      </w:r>
-      <w:r>
-        <w:rPr>
-          <w:rFonts w:ascii="Calibri" w:hAnsi="Calibri" w:cs="Calibri"/>
-          <w:b/>
-          <w:bCs/>
-          <w:lang w:val="en-US"/>
-        </w:rPr>
-        <w:t>“as is”</w:t>
-      </w:r>
-      <w:r>
-        <w:rPr>
-          <w:rFonts w:ascii="Calibri" w:hAnsi="Calibri" w:cs="Calibri"/>
-          <w:lang w:val="en-US"/>
-        </w:rPr>
-        <w:t>, and the authors disclaim all liability for damages, data loss, or other issues arising from its use.</w:t>
-      </w:r>
-    </w:p>
-    <w:p>
-      <w:pPr>
-        <w:spacing w:line="276" w:lineRule="auto"/>
-        <w:rPr>
-          <w:rFonts w:ascii="Calibri" w:hAnsi="Calibri" w:cs="Calibri"/>
-          <w:lang w:val="en-US"/>
-        </w:rPr>
-      </w:pPr>
-    </w:p>
-    <w:p>
-      <w:pPr>
-        <w:pStyle w:val="Heading3"/>
-        <w:rPr>
-          <w:rFonts w:ascii="Calibri" w:hAnsi="Calibri" w:cs="Calibri"/>
-          <w:lang w:val="en-US"/>
-        </w:rPr>
-      </w:pPr>
-      <w:r>
-        <w:rPr>
-          <w:rFonts w:ascii="Calibri" w:hAnsi="Calibri" w:cs="Calibri"/>
-          <w:lang w:val="en-US"/>
-        </w:rPr>
-        <w:t xml:space="preserve">Before </w:t>
-      </w:r>
-      <w:proofErr w:type="gramStart"/>
-      <w:r>
-        <w:rPr>
-          <w:rFonts w:ascii="Calibri" w:hAnsi="Calibri" w:cs="Calibri"/>
-          <w:lang w:val="en-US"/>
-        </w:rPr>
-        <w:t>to start</w:t>
-      </w:r>
-      <w:proofErr w:type="gramEnd"/>
-    </w:p>
-    <w:p>
-      <w:pPr>
-        <w:spacing w:line="276" w:lineRule="auto"/>
-        <w:rPr>
-          <w:rFonts w:ascii="Calibri" w:hAnsi="Calibri" w:cs="Calibri"/>
-          <w:lang w:val="en-US"/>
-        </w:rPr>
-      </w:pPr>
-      <w:r>
-        <w:rPr>
-          <w:rFonts w:ascii="Calibri" w:hAnsi="Calibri" w:cs="Calibri"/>
-          <w:lang w:val="en-US"/>
-        </w:rPr>
         <w:t xml:space="preserve">This section </w:t>
       </w:r>
       <w:r>
@@ -1298,23 +1260,7 @@
           <w:rFonts w:ascii="Calibri" w:hAnsi="Calibri" w:cs="Calibri"/>
           <w:lang w:val="en-US"/>
         </w:rPr>
-        <w:t xml:space="preserve"> </w:t>
-      </w:r>
-      <w:proofErr w:type="gramStart"/>
-      <w:r>
-        <w:rPr>
-          <w:rFonts w:ascii="Calibri" w:hAnsi="Calibri" w:cs="Calibri"/>
-          <w:lang w:val="en-US"/>
-        </w:rPr>
-        <w:t>the</w:t>
-      </w:r>
-      <w:proofErr w:type="gramEnd"/>
-      <w:r>
-        <w:rPr>
-          <w:rFonts w:ascii="Calibri" w:hAnsi="Calibri" w:cs="Calibri"/>
-          <w:lang w:val="en-US"/>
-        </w:rPr>
-        <w:t xml:space="preserve"> import ter</w:t>
+        <w:t xml:space="preserve"> the import ter</w:t>
       </w:r>
       <w:r>
         <w:rPr>
@@ -1947,7 +1893,6 @@
           <w:rFonts w:ascii="Calibri" w:hAnsi="Calibri" w:cs="Calibri"/>
           <w:lang w:val="en-US"/>
         </w:rPr>
-        <w:lastRenderedPageBreak/>
         <w:t>.</w:t>
       </w:r>
       <w:proofErr w:type="spellStart"/>
@@ -2132,7 +2077,15 @@
           <w:rFonts w:ascii="Calibri" w:hAnsi="Calibri" w:cs="Calibri"/>
           <w:lang w:val="en-US"/>
         </w:rPr>
-        <w:t xml:space="preserve"> during import. It will also create a *.Events.txt file with the new trigger/event name (text to number conversion required). However, you can only import this specific file format. You must work with one of the above formats in </w:t>
+        <w:t xml:space="preserve"> during import. It will also create a *.Events.txt file with the new trigger/event </w:t>
+      </w:r>
+      <w:r>
+        <w:rPr>
+          <w:rFonts w:ascii="Calibri" w:hAnsi="Calibri" w:cs="Calibri"/>
+          <w:lang w:val="en-US"/>
+        </w:rPr>
+        <w:lastRenderedPageBreak/>
+        <w:t xml:space="preserve">name (text to number conversion required). However, you can only import this specific file format. You must work with one of the above formats in </w:t>
       </w:r>
       <w:proofErr w:type="spellStart"/>
       <w:r>
@@ -2480,7 +2433,6 @@
           <w:noProof/>
           <w:lang w:val="en-US"/>
         </w:rPr>
-        <w:lastRenderedPageBreak/>
         <w:drawing>
           <wp:inline distT="0" distB="0" distL="0" distR="0" wp14:anchorId="33124751" wp14:editId="05A21DB1">
             <wp:extent cx="5760720" cy="4087495"/>
@@ -2497,7 +2449,7 @@
                     <pic:cNvPicPr/>
                   </pic:nvPicPr>
                   <pic:blipFill>
-                    <a:blip r:embed="rId13"/>
+                    <a:blip r:embed="rId12"/>
                     <a:stretch>
                       <a:fillRect/>
                     </a:stretch>
@@ -2544,6 +2496,7 @@
           <w:bCs/>
           <w:lang w:val="en-US"/>
         </w:rPr>
+        <w:lastRenderedPageBreak/>
         <w:t xml:space="preserve">What is a typical EEG processing pipeline in </w:t>
       </w:r>
       <w:proofErr w:type="spellStart"/>
@@ -2665,7 +2618,6 @@
           <w:rFonts w:ascii="Calibri" w:hAnsi="Calibri" w:cs="Calibri"/>
           <w:lang w:val="en-US"/>
         </w:rPr>
-        <w:lastRenderedPageBreak/>
         <w:t>Main window</w:t>
       </w:r>
     </w:p>
@@ -2699,7 +2651,7 @@
                     <pic:cNvPicPr/>
                   </pic:nvPicPr>
                   <pic:blipFill>
-                    <a:blip r:embed="rId14"/>
+                    <a:blip r:embed="rId13"/>
                     <a:stretch>
                       <a:fillRect/>
                     </a:stretch>
@@ -3028,6 +2980,7 @@
           <w:bCs/>
           <w:lang w:val="en-US"/>
         </w:rPr>
+        <w:lastRenderedPageBreak/>
         <w:t>Analysis modules</w:t>
       </w:r>
       <w:r>
@@ -3120,7 +3073,6 @@
           <w:rFonts w:ascii="Calibri" w:hAnsi="Calibri" w:cs="Calibri"/>
           <w:lang w:val="en-US"/>
         </w:rPr>
-        <w:lastRenderedPageBreak/>
         <w:t>Import Data</w:t>
       </w:r>
     </w:p>
@@ -3154,7 +3106,7 @@
                     <pic:cNvPicPr/>
                   </pic:nvPicPr>
                   <pic:blipFill>
-                    <a:blip r:embed="rId15"/>
+                    <a:blip r:embed="rId14"/>
                     <a:stretch>
                       <a:fillRect/>
                     </a:stretch>
@@ -3411,6 +3363,7 @@
           <w:rFonts w:ascii="Calibri" w:hAnsi="Calibri" w:cs="Calibri"/>
           <w:lang w:val="en-US"/>
         </w:rPr>
+        <w:lastRenderedPageBreak/>
         <w:t xml:space="preserve">Optional: </w:t>
       </w:r>
       <w:r>
@@ -3443,7 +3396,6 @@
           <w:rFonts w:ascii="Calibri" w:hAnsi="Calibri" w:cs="Calibri"/>
           <w:lang w:val="en-US"/>
         </w:rPr>
-        <w:lastRenderedPageBreak/>
         <w:t>Define participant and adjust the selection</w:t>
       </w:r>
     </w:p>
@@ -3477,7 +3429,7 @@
                     <pic:cNvPicPr/>
                   </pic:nvPicPr>
                   <pic:blipFill>
-                    <a:blip r:embed="rId16"/>
+                    <a:blip r:embed="rId15"/>
                     <a:stretch>
                       <a:fillRect/>
                     </a:stretch>
@@ -3762,7 +3714,6 @@
           <w:rFonts w:ascii="Calibri" w:hAnsi="Calibri" w:cs="Calibri"/>
           <w:lang w:val="en-US"/>
         </w:rPr>
-        <w:lastRenderedPageBreak/>
         <w:t xml:space="preserve">Loading the electrode coordinate file </w:t>
       </w:r>
     </w:p>
@@ -3797,7 +3748,7 @@
                     <pic:cNvPicPr/>
                   </pic:nvPicPr>
                   <pic:blipFill>
-                    <a:blip r:embed="rId17"/>
+                    <a:blip r:embed="rId16"/>
                     <a:stretch>
                       <a:fillRect/>
                     </a:stretch>
@@ -3860,17 +3811,8 @@
           <w:rFonts w:ascii="Calibri" w:hAnsi="Calibri" w:cs="Calibri"/>
           <w:lang w:val="en-US"/>
         </w:rPr>
-        <w:t>, .</w:t>
-      </w:r>
-      <w:proofErr w:type="spellStart"/>
-      <w:r>
-        <w:rPr>
-          <w:rFonts w:ascii="Calibri" w:hAnsi="Calibri" w:cs="Calibri"/>
-          <w:lang w:val="en-US"/>
-        </w:rPr>
-        <w:t>els</w:t>
-      </w:r>
-      <w:proofErr w:type="spellEnd"/>
+        <w:t>, .els</w:t>
+      </w:r>
       <w:proofErr w:type="gramEnd"/>
       <w:r>
         <w:rPr>
@@ -4134,23 +4076,7 @@
           <w:rFonts w:ascii="Calibri" w:hAnsi="Calibri" w:cs="Calibri"/>
           <w:lang w:val="en-US"/>
         </w:rPr>
-        <w:t>The toolbox informs you of the number of electrodes present in this coordinate file, as well as the number of clusters. A cluster is a group of electrodes that can be specified within an .</w:t>
-      </w:r>
-      <w:proofErr w:type="spellStart"/>
-      <w:r>
-        <w:rPr>
-          <w:rFonts w:ascii="Calibri" w:hAnsi="Calibri" w:cs="Calibri"/>
-          <w:lang w:val="en-US"/>
-        </w:rPr>
-        <w:t>els</w:t>
-      </w:r>
-      <w:proofErr w:type="spellEnd"/>
-      <w:r>
-        <w:rPr>
-          <w:rFonts w:ascii="Calibri" w:hAnsi="Calibri" w:cs="Calibri"/>
-          <w:lang w:val="en-US"/>
-        </w:rPr>
-        <w:t xml:space="preserve"> file (e.g. to separate EEG electrodes from external channels). </w:t>
+        <w:t xml:space="preserve">The toolbox informs you of the number of electrodes present in this coordinate file, as well as the number of clusters. A cluster is a group of electrodes that can be specified within an .els file (e.g. to separate EEG electrodes from external channels). </w:t>
       </w:r>
     </w:p>
     <w:p>
@@ -4338,7 +4264,7 @@
                     <pic:cNvPicPr/>
                   </pic:nvPicPr>
                   <pic:blipFill>
-                    <a:blip r:embed="rId18"/>
+                    <a:blip r:embed="rId17"/>
                     <a:stretch>
                       <a:fillRect/>
                     </a:stretch>
@@ -4581,7 +4507,7 @@
                     <pic:cNvPicPr/>
                   </pic:nvPicPr>
                   <pic:blipFill>
-                    <a:blip r:embed="rId19"/>
+                    <a:blip r:embed="rId18"/>
                     <a:stretch>
                       <a:fillRect/>
                     </a:stretch>
@@ -4921,7 +4847,7 @@
                     <pic:cNvPicPr/>
                   </pic:nvPicPr>
                   <pic:blipFill>
-                    <a:blip r:embed="rId20"/>
+                    <a:blip r:embed="rId19"/>
                     <a:stretch>
                       <a:fillRect/>
                     </a:stretch>
@@ -5039,7 +4965,7 @@
                     <pic:cNvPicPr/>
                   </pic:nvPicPr>
                   <pic:blipFill>
-                    <a:blip r:embed="rId21"/>
+                    <a:blip r:embed="rId20"/>
                     <a:stretch>
                       <a:fillRect/>
                     </a:stretch>
@@ -6253,7 +6179,6 @@
         </w:rPr>
         <w:t xml:space="preserve">Use the </w:t>
       </w:r>
-      <w:proofErr w:type="spellStart"/>
       <w:r>
         <w:rPr>
           <w:rFonts w:ascii="Calibri" w:hAnsi="Calibri" w:cs="Calibri"/>
@@ -6263,7 +6188,6 @@
         </w:rPr>
         <w:t>Refef</w:t>
       </w:r>
-      <w:proofErr w:type="spellEnd"/>
       <w:r>
         <w:rPr>
           <w:rFonts w:ascii="Calibri" w:hAnsi="Calibri" w:cs="Calibri"/>
@@ -6309,7 +6233,7 @@
       </w:r>
     </w:p>
     <w:sectPr>
-      <w:footerReference w:type="default" r:id="rId22"/>
+      <w:footerReference w:type="default" r:id="rId21"/>
       <w:pgSz w:w="11906" w:h="16838"/>
       <w:pgMar w:top="1417" w:right="1417" w:bottom="1417" w:left="1417" w:header="708" w:footer="708" w:gutter="0"/>
       <w:cols w:space="708"/>
@@ -8342,7 +8266,6 @@
   <w:style w:type="character" w:default="1" w:styleId="DefaultParagraphFont">
     <w:name w:val="Default Paragraph Font"/>
     <w:uiPriority w:val="1"/>
-    <w:semiHidden/>
     <w:unhideWhenUsed/>
   </w:style>
   <w:style w:type="table" w:default="1" w:styleId="TableNormal">

</xml_diff>

<commit_message>
Update manuel Statistics module
</commit_message>
<xml_diff>
--- a/Manuels/Manuel_EEGpal_Main.docx
+++ b/Manuels/Manuel_EEGpal_Main.docx
@@ -74,7 +74,6 @@
           </wp:anchor>
         </w:drawing>
       </w:r>
-      <w:proofErr w:type="spellStart"/>
       <w:r>
         <w:rPr>
           <w:rFonts w:ascii="Calibri" w:hAnsi="Calibri" w:cs="Calibri"/>
@@ -84,7 +83,6 @@
         </w:rPr>
         <w:t>EEGpal</w:t>
       </w:r>
-      <w:proofErr w:type="spellEnd"/>
       <w:r>
         <w:rPr>
           <w:rFonts w:ascii="Calibri" w:hAnsi="Calibri" w:cs="Calibri"/>
@@ -126,7 +124,14 @@
           <w:rFonts w:ascii="Calibri" w:hAnsi="Calibri" w:cs="Calibri"/>
           <w:lang w:val="en-US"/>
         </w:rPr>
-        <w:t>14</w:t>
+        <w:t>1</w:t>
+      </w:r>
+      <w:r>
+        <w:rPr>
+          <w:rFonts w:ascii="Calibri" w:hAnsi="Calibri" w:cs="Calibri"/>
+          <w:lang w:val="en-US"/>
+        </w:rPr>
+        <w:t>6</w:t>
       </w:r>
       <w:r>
         <w:rPr>
@@ -140,7 +145,14 @@
           <w:rFonts w:ascii="Calibri" w:hAnsi="Calibri" w:cs="Calibri"/>
           <w:lang w:val="en-US"/>
         </w:rPr>
-        <w:t>04</w:t>
+        <w:t>1</w:t>
+      </w:r>
+      <w:r>
+        <w:rPr>
+          <w:rFonts w:ascii="Calibri" w:hAnsi="Calibri" w:cs="Calibri"/>
+          <w:lang w:val="en-US"/>
+        </w:rPr>
+        <w:t>4</w:t>
       </w:r>
       <w:r>
         <w:rPr>
@@ -154,7 +166,14 @@
           <w:rFonts w:ascii="Calibri" w:hAnsi="Calibri" w:cs="Calibri"/>
           <w:lang w:val="en-US"/>
         </w:rPr>
-        <w:t>07</w:t>
+        <w:t>0</w:t>
+      </w:r>
+      <w:r>
+        <w:rPr>
+          <w:rFonts w:ascii="Calibri" w:hAnsi="Calibri" w:cs="Calibri"/>
+          <w:lang w:val="en-US"/>
+        </w:rPr>
+        <w:t>9</w:t>
       </w:r>
       <w:r>
         <w:rPr>
@@ -183,23 +202,7 @@
           <w:rFonts w:ascii="Calibri" w:hAnsi="Calibri" w:cs="Calibri"/>
           <w:lang w:val="en-US"/>
         </w:rPr>
-        <w:t xml:space="preserve">Video </w:t>
-      </w:r>
-      <w:proofErr w:type="gramStart"/>
-      <w:r>
-        <w:rPr>
-          <w:rFonts w:ascii="Calibri" w:hAnsi="Calibri" w:cs="Calibri"/>
-          <w:lang w:val="en-US"/>
-        </w:rPr>
-        <w:t>tutorial :</w:t>
-      </w:r>
-      <w:proofErr w:type="gramEnd"/>
-      <w:r>
-        <w:rPr>
-          <w:rFonts w:ascii="Calibri" w:hAnsi="Calibri" w:cs="Calibri"/>
-          <w:lang w:val="en-US"/>
-        </w:rPr>
-        <w:t xml:space="preserve"> </w:t>
+        <w:t xml:space="preserve">Video tutorial : </w:t>
       </w:r>
       <w:hyperlink r:id="rId8" w:history="1">
         <w:r>
@@ -234,23 +237,7 @@
           <w:rFonts w:ascii="Calibri" w:hAnsi="Calibri" w:cs="Calibri"/>
           <w:lang w:val="en-US"/>
         </w:rPr>
-        <w:t xml:space="preserve">The </w:t>
-      </w:r>
-      <w:proofErr w:type="spellStart"/>
-      <w:r>
-        <w:rPr>
-          <w:rFonts w:ascii="Calibri" w:hAnsi="Calibri" w:cs="Calibri"/>
-          <w:lang w:val="en-US"/>
-        </w:rPr>
-        <w:t>EEGpal</w:t>
-      </w:r>
-      <w:proofErr w:type="spellEnd"/>
-      <w:r>
-        <w:rPr>
-          <w:rFonts w:ascii="Calibri" w:hAnsi="Calibri" w:cs="Calibri"/>
-          <w:lang w:val="en-US"/>
-        </w:rPr>
-        <w:t xml:space="preserve"> toolbox is developed by Michael DePretto (</w:t>
+        <w:t>The EEGpal toolbox is developed by Michael DePretto (</w:t>
       </w:r>
       <w:r>
         <w:rPr>
@@ -316,53 +303,12 @@
           <w:lang w:val="en-US"/>
         </w:rPr>
       </w:pPr>
-      <w:proofErr w:type="spellStart"/>
-      <w:r>
-        <w:rPr>
-          <w:rFonts w:ascii="Calibri" w:hAnsi="Calibri" w:cs="Calibri"/>
-          <w:lang w:val="en-US"/>
-        </w:rPr>
-        <w:t>EEGpal</w:t>
-      </w:r>
-      <w:proofErr w:type="spellEnd"/>
-      <w:r>
-        <w:rPr>
-          <w:rFonts w:ascii="Calibri" w:hAnsi="Calibri" w:cs="Calibri"/>
-          <w:lang w:val="en-US"/>
-        </w:rPr>
-        <w:t xml:space="preserve"> is </w:t>
-      </w:r>
-      <w:proofErr w:type="gramStart"/>
-      <w:r>
-        <w:rPr>
-          <w:rFonts w:ascii="Calibri" w:hAnsi="Calibri" w:cs="Calibri"/>
-          <w:lang w:val="en-US"/>
-        </w:rPr>
-        <w:t>an open</w:t>
-      </w:r>
-      <w:proofErr w:type="gramEnd"/>
-      <w:r>
-        <w:rPr>
-          <w:rFonts w:ascii="Calibri" w:hAnsi="Calibri" w:cs="Calibri"/>
-          <w:lang w:val="en-US"/>
-        </w:rPr>
-        <w:t xml:space="preserve">-source </w:t>
-      </w:r>
-      <w:proofErr w:type="spellStart"/>
-      <w:r>
-        <w:rPr>
-          <w:rFonts w:ascii="Calibri" w:hAnsi="Calibri" w:cs="Calibri"/>
-          <w:lang w:val="en-US"/>
-        </w:rPr>
-        <w:t>Matlab</w:t>
-      </w:r>
-      <w:proofErr w:type="spellEnd"/>
-      <w:r>
-        <w:rPr>
-          <w:rFonts w:ascii="Calibri" w:hAnsi="Calibri" w:cs="Calibri"/>
-          <w:lang w:val="en-US"/>
-        </w:rPr>
-        <w:t>-based software for automated/semi-automated EEG data pre-processing and analyses. It proposes Graphical User Interfaces (GUIs) that allow EEG pre-processing to be batched across participants with a high degree of flexibility in processing parameters.</w:t>
+      <w:r>
+        <w:rPr>
+          <w:rFonts w:ascii="Calibri" w:hAnsi="Calibri" w:cs="Calibri"/>
+          <w:lang w:val="en-US"/>
+        </w:rPr>
+        <w:t>EEGpal is an open-source Matlab-based software for automated/semi-automated EEG data pre-processing and analyses. It proposes Graphical User Interfaces (GUIs) that allow EEG pre-processing to be batched across participants with a high degree of flexibility in processing parameters.</w:t>
       </w:r>
     </w:p>
     <w:p>
@@ -394,21 +340,12 @@
         </w:rPr>
         <w:t xml:space="preserve">software </w:t>
       </w:r>
-      <w:proofErr w:type="spellStart"/>
-      <w:r>
-        <w:rPr>
-          <w:rFonts w:ascii="Calibri" w:hAnsi="Calibri" w:cs="Calibri"/>
-          <w:lang w:val="en-US"/>
-        </w:rPr>
-        <w:t>Cartool</w:t>
-      </w:r>
-      <w:proofErr w:type="spellEnd"/>
-      <w:r>
-        <w:rPr>
-          <w:rFonts w:ascii="Calibri" w:hAnsi="Calibri" w:cs="Calibri"/>
-          <w:lang w:val="en-US"/>
-        </w:rPr>
-        <w:t xml:space="preserve"> </w:t>
+      <w:r>
+        <w:rPr>
+          <w:rFonts w:ascii="Calibri" w:hAnsi="Calibri" w:cs="Calibri"/>
+          <w:lang w:val="en-US"/>
+        </w:rPr>
+        <w:t xml:space="preserve">Cartool </w:t>
       </w:r>
       <w:r>
         <w:rPr>
@@ -438,23 +375,7 @@
           <w:rFonts w:ascii="Calibri" w:hAnsi="Calibri" w:cs="Calibri"/>
           <w:lang w:val="en-US"/>
         </w:rPr>
-        <w:t xml:space="preserve">, vol. 2011, 813870. </w:t>
-      </w:r>
-      <w:proofErr w:type="gramStart"/>
-      <w:r>
-        <w:rPr>
-          <w:rFonts w:ascii="Calibri" w:hAnsi="Calibri" w:cs="Calibri"/>
-          <w:lang w:val="en-US"/>
-        </w:rPr>
-        <w:t>DOI :</w:t>
-      </w:r>
-      <w:proofErr w:type="gramEnd"/>
-      <w:r>
-        <w:rPr>
-          <w:rFonts w:ascii="Calibri" w:hAnsi="Calibri" w:cs="Calibri"/>
-          <w:lang w:val="en-US"/>
-        </w:rPr>
-        <w:t xml:space="preserve"> </w:t>
+        <w:t xml:space="preserve">, vol. 2011, 813870. DOI : </w:t>
       </w:r>
       <w:hyperlink r:id="rId11" w:tgtFrame="_blank" w:history="1">
         <w:r>
@@ -480,7 +401,6 @@
         </w:rPr>
         <w:t xml:space="preserve">It is also an alternative to the original </w:t>
       </w:r>
-      <w:proofErr w:type="spellStart"/>
       <w:r>
         <w:rPr>
           <w:rFonts w:ascii="Calibri" w:hAnsi="Calibri" w:cs="Calibri"/>
@@ -488,7 +408,6 @@
         </w:rPr>
         <w:t>eeglab</w:t>
       </w:r>
-      <w:proofErr w:type="spellEnd"/>
       <w:r>
         <w:rPr>
           <w:rFonts w:ascii="Calibri" w:hAnsi="Calibri" w:cs="Calibri"/>
@@ -501,23 +420,7 @@
           <w:rFonts w:ascii="Calibri" w:hAnsi="Calibri" w:cs="Calibri"/>
           <w:lang w:val="en-US"/>
         </w:rPr>
-        <w:t xml:space="preserve">(reference: Delorme, A., &amp; </w:t>
-      </w:r>
-      <w:proofErr w:type="spellStart"/>
-      <w:r>
-        <w:rPr>
-          <w:rFonts w:ascii="Calibri" w:hAnsi="Calibri" w:cs="Calibri"/>
-          <w:lang w:val="en-US"/>
-        </w:rPr>
-        <w:t>Makeig</w:t>
-      </w:r>
-      <w:proofErr w:type="spellEnd"/>
-      <w:r>
-        <w:rPr>
-          <w:rFonts w:ascii="Calibri" w:hAnsi="Calibri" w:cs="Calibri"/>
-          <w:lang w:val="en-US"/>
-        </w:rPr>
-        <w:t xml:space="preserve">, S. (2004). EEGLAB: an open-source toolbox for analysis of single-trial EEG dynamics. </w:t>
+        <w:t xml:space="preserve">(reference: Delorme, A., &amp; Makeig, S. (2004). EEGLAB: an open-source toolbox for analysis of single-trial EEG dynamics. </w:t>
       </w:r>
       <w:r>
         <w:rPr>
@@ -542,29 +445,16 @@
         </w:rPr>
         <w:t xml:space="preserve"> DOI: </w:t>
       </w:r>
-      <w:r>
-        <w:fldChar w:fldCharType="begin"/>
-      </w:r>
-      <w:r>
-        <w:rPr>
-          <w:lang w:val="en-US"/>
-        </w:rPr>
-        <w:instrText>HYPERLINK "https://doi.org/10.1016/j.jneumeth.2003.10.009" \t "_blank"</w:instrText>
-      </w:r>
-      <w:r>
-        <w:fldChar w:fldCharType="separate"/>
-      </w:r>
-      <w:r>
-        <w:rPr>
-          <w:rStyle w:val="Hyperlink"/>
-          <w:rFonts w:ascii="Calibri" w:hAnsi="Calibri" w:cs="Calibri"/>
-          <w:lang w:val="en-US"/>
-        </w:rPr>
-        <w:t xml:space="preserve">10.1016/j.jneumeth.2003.10.009 </w:t>
-      </w:r>
-      <w:r>
-        <w:fldChar w:fldCharType="end"/>
-      </w:r>
+      <w:hyperlink r:id="rId12" w:tgtFrame="_blank" w:history="1">
+        <w:r>
+          <w:rPr>
+            <w:rStyle w:val="Hyperlink"/>
+            <w:rFonts w:ascii="Calibri" w:hAnsi="Calibri" w:cs="Calibri"/>
+            <w:lang w:val="en-US"/>
+          </w:rPr>
+          <w:t xml:space="preserve">10.1016/j.jneumeth.2003.10.009 </w:t>
+        </w:r>
+      </w:hyperlink>
       <w:r>
         <w:rPr>
           <w:rFonts w:ascii="Calibri" w:hAnsi="Calibri" w:cs="Calibri"/>
@@ -594,25 +484,8 @@
           <w:lang w:val="en-US"/>
         </w:rPr>
         <w:br/>
-        <w:t xml:space="preserve">In summary, the authors propose the </w:t>
-      </w:r>
-      <w:proofErr w:type="spellStart"/>
-      <w:r>
-        <w:rPr>
-          <w:rFonts w:ascii="Calibri" w:hAnsi="Calibri" w:cs="Calibri"/>
-          <w:lang w:val="en-US"/>
-        </w:rPr>
-        <w:t>EEGpal</w:t>
-      </w:r>
-      <w:proofErr w:type="spellEnd"/>
-      <w:r>
-        <w:rPr>
-          <w:rFonts w:ascii="Calibri" w:hAnsi="Calibri" w:cs="Calibri"/>
-          <w:lang w:val="en-US"/>
-        </w:rPr>
-        <w:t xml:space="preserve"> graphical interface (GUI) as a more practical solution than the </w:t>
-      </w:r>
-      <w:proofErr w:type="spellStart"/>
+        <w:t xml:space="preserve">In summary, the authors propose the EEGpal graphical interface (GUI) as a more practical solution than the </w:t>
+      </w:r>
       <w:r>
         <w:rPr>
           <w:rFonts w:ascii="Calibri" w:hAnsi="Calibri" w:cs="Calibri"/>
@@ -620,61 +493,12 @@
         </w:rPr>
         <w:t>eeglab</w:t>
       </w:r>
-      <w:proofErr w:type="spellEnd"/>
-      <w:r>
-        <w:rPr>
-          <w:rFonts w:ascii="Calibri" w:hAnsi="Calibri" w:cs="Calibri"/>
-          <w:lang w:val="en-US"/>
-        </w:rPr>
-        <w:t xml:space="preserve"> and </w:t>
-      </w:r>
-      <w:proofErr w:type="spellStart"/>
-      <w:r>
-        <w:rPr>
-          <w:rFonts w:ascii="Calibri" w:hAnsi="Calibri" w:cs="Calibri"/>
-          <w:lang w:val="en-US"/>
-        </w:rPr>
-        <w:t>Cartool</w:t>
-      </w:r>
-      <w:proofErr w:type="spellEnd"/>
-      <w:r>
-        <w:rPr>
-          <w:rFonts w:ascii="Calibri" w:hAnsi="Calibri" w:cs="Calibri"/>
-          <w:lang w:val="en-US"/>
-        </w:rPr>
-        <w:t xml:space="preserve"> GUIs for automating preprocessing. The authors recommend the use of </w:t>
-      </w:r>
-      <w:proofErr w:type="spellStart"/>
-      <w:r>
-        <w:rPr>
-          <w:rFonts w:ascii="Calibri" w:hAnsi="Calibri" w:cs="Calibri"/>
-          <w:lang w:val="en-US"/>
-        </w:rPr>
-        <w:t>Cartool</w:t>
-      </w:r>
-      <w:proofErr w:type="spellEnd"/>
-      <w:r>
-        <w:rPr>
-          <w:rFonts w:ascii="Calibri" w:hAnsi="Calibri" w:cs="Calibri"/>
-          <w:lang w:val="en-US"/>
-        </w:rPr>
-        <w:t xml:space="preserve"> software for the </w:t>
-      </w:r>
-      <w:proofErr w:type="spellStart"/>
-      <w:r>
-        <w:rPr>
-          <w:rFonts w:ascii="Calibri" w:hAnsi="Calibri" w:cs="Calibri"/>
-          <w:lang w:val="en-US"/>
-        </w:rPr>
-        <w:t>visualisation</w:t>
-      </w:r>
-      <w:proofErr w:type="spellEnd"/>
-      <w:r>
-        <w:rPr>
-          <w:rFonts w:ascii="Calibri" w:hAnsi="Calibri" w:cs="Calibri"/>
-          <w:lang w:val="en-US"/>
-        </w:rPr>
-        <w:t xml:space="preserve"> of EEG traces.</w:t>
+      <w:r>
+        <w:rPr>
+          <w:rFonts w:ascii="Calibri" w:hAnsi="Calibri" w:cs="Calibri"/>
+          <w:lang w:val="en-US"/>
+        </w:rPr>
+        <w:t xml:space="preserve"> and Cartool GUIs for automating preprocessing. The authors recommend the use of Cartool software for the visualisation of EEG traces.</w:t>
       </w:r>
     </w:p>
     <w:p>
@@ -709,21 +533,12 @@
           <w:lang w:val="en-US"/>
         </w:rPr>
       </w:pPr>
-      <w:proofErr w:type="spellStart"/>
-      <w:r>
-        <w:rPr>
-          <w:rFonts w:ascii="Calibri" w:hAnsi="Calibri" w:cs="Calibri"/>
-          <w:lang w:val="en-US"/>
-        </w:rPr>
-        <w:t>Matlab</w:t>
-      </w:r>
-      <w:proofErr w:type="spellEnd"/>
-      <w:r>
-        <w:rPr>
-          <w:rFonts w:ascii="Calibri" w:hAnsi="Calibri" w:cs="Calibri"/>
-          <w:lang w:val="en-US"/>
-        </w:rPr>
-        <w:t xml:space="preserve"> 2018b or later</w:t>
+      <w:r>
+        <w:rPr>
+          <w:rFonts w:ascii="Calibri" w:hAnsi="Calibri" w:cs="Calibri"/>
+          <w:lang w:val="en-US"/>
+        </w:rPr>
+        <w:t>Matlab 2018b or later</w:t>
       </w:r>
     </w:p>
     <w:p>
@@ -761,21 +576,7 @@
         <w:rPr>
           <w:lang w:val="en-US"/>
         </w:rPr>
-        <w:t xml:space="preserve">1. Download the </w:t>
-      </w:r>
-      <w:proofErr w:type="spellStart"/>
-      <w:r>
-        <w:rPr>
-          <w:lang w:val="en-US"/>
-        </w:rPr>
-        <w:t>EEGpal</w:t>
-      </w:r>
-      <w:proofErr w:type="spellEnd"/>
-      <w:r>
-        <w:rPr>
-          <w:lang w:val="en-US"/>
-        </w:rPr>
-        <w:t xml:space="preserve"> repository on your local drive.</w:t>
+        <w:t>1. Download the EEGpal repository on your local drive.</w:t>
       </w:r>
     </w:p>
     <w:p>
@@ -796,213 +597,339 @@
           <w:bCs/>
           <w:lang w:val="en-US"/>
         </w:rPr>
-        <w:t xml:space="preserve">If you have an </w:t>
-      </w:r>
-      <w:proofErr w:type="spellStart"/>
-      <w:r>
-        <w:rPr>
+        <w:t>If you have an eeglab version already mapped in your Matlab path, remove it (because it could generate conflict with the eeglab version include inside of EEGpal).</w:t>
+      </w:r>
+    </w:p>
+    <w:p>
+      <w:pPr>
+        <w:rPr>
+          <w:lang w:val="en-US"/>
+        </w:rPr>
+      </w:pPr>
+      <w:r>
+        <w:rPr>
+          <w:lang w:val="en-US"/>
+        </w:rPr>
+        <w:t>3. Add this folder to your local Matlab path (use of the command *setpath('path of the EEGpal folder')*.</w:t>
+      </w:r>
+    </w:p>
+    <w:p>
+      <w:pPr>
+        <w:rPr>
+          <w:lang w:val="en-US"/>
+        </w:rPr>
+      </w:pPr>
+      <w:r>
+        <w:rPr>
+          <w:lang w:val="en-US"/>
+        </w:rPr>
+        <w:t>4. Use the command *EEGpal* to start the software.</w:t>
+      </w:r>
+    </w:p>
+    <w:p>
+      <w:pPr>
+        <w:rPr>
+          <w:lang w:val="en-US"/>
+        </w:rPr>
+      </w:pPr>
+      <w:r>
+        <w:rPr>
+          <w:lang w:val="en-US"/>
+        </w:rPr>
+        <w:br w:type="page"/>
+      </w:r>
+    </w:p>
+    <w:p>
+      <w:pPr>
+        <w:pStyle w:val="Heading3"/>
+        <w:rPr>
+          <w:rFonts w:ascii="Calibri" w:hAnsi="Calibri" w:cs="Calibri"/>
+          <w:lang w:val="en-US"/>
+        </w:rPr>
+      </w:pPr>
+      <w:r>
+        <w:rPr>
+          <w:rFonts w:ascii="Calibri" w:hAnsi="Calibri" w:cs="Calibri"/>
+          <w:lang w:val="en-US"/>
+        </w:rPr>
+        <w:lastRenderedPageBreak/>
+        <w:t>License</w:t>
+      </w:r>
+    </w:p>
+    <w:p>
+      <w:pPr>
+        <w:spacing w:line="276" w:lineRule="auto"/>
+        <w:rPr>
+          <w:rFonts w:ascii="Calibri" w:hAnsi="Calibri" w:cs="Calibri"/>
           <w:b/>
           <w:bCs/>
           <w:lang w:val="en-US"/>
         </w:rPr>
-        <w:t>eeglab</w:t>
-      </w:r>
-      <w:proofErr w:type="spellEnd"/>
-      <w:r>
-        <w:rPr>
+      </w:pPr>
+      <w:r>
+        <w:rPr>
+          <w:rFonts w:ascii="Calibri" w:hAnsi="Calibri" w:cs="Calibri"/>
           <w:b/>
           <w:bCs/>
           <w:lang w:val="en-US"/>
         </w:rPr>
-        <w:t xml:space="preserve"> version already mapped in your </w:t>
-      </w:r>
-      <w:proofErr w:type="spellStart"/>
-      <w:r>
-        <w:rPr>
+        <w:t>EEGpal is distributed under the BSD 2-Clause License.</w:t>
+      </w:r>
+    </w:p>
+    <w:p>
+      <w:pPr>
+        <w:spacing w:line="276" w:lineRule="auto"/>
+        <w:rPr>
+          <w:rFonts w:ascii="Calibri" w:hAnsi="Calibri" w:cs="Calibri"/>
+          <w:lang w:val="en-US"/>
+        </w:rPr>
+      </w:pPr>
+      <w:r>
+        <w:rPr>
+          <w:rFonts w:ascii="Calibri" w:hAnsi="Calibri" w:cs="Calibri"/>
+          <w:lang w:val="en-US"/>
+        </w:rPr>
+        <w:t>Third-party software included in this repository is distributed under</w:t>
+      </w:r>
+      <w:r>
+        <w:rPr>
+          <w:rFonts w:ascii="Calibri" w:hAnsi="Calibri" w:cs="Calibri"/>
+          <w:lang w:val="en-US"/>
+        </w:rPr>
+        <w:t xml:space="preserve"> </w:t>
+      </w:r>
+      <w:r>
+        <w:rPr>
+          <w:rFonts w:ascii="Calibri" w:hAnsi="Calibri" w:cs="Calibri"/>
+          <w:lang w:val="en-US"/>
+        </w:rPr>
+        <w:t>its own respective licenses, which may differ from the EEGpal license.</w:t>
+      </w:r>
+      <w:r>
+        <w:rPr>
+          <w:rFonts w:ascii="Calibri" w:hAnsi="Calibri" w:cs="Calibri"/>
+          <w:lang w:val="en-US"/>
+        </w:rPr>
+        <w:t xml:space="preserve"> </w:t>
+      </w:r>
+      <w:r>
+        <w:rPr>
+          <w:rFonts w:ascii="Calibri" w:hAnsi="Calibri" w:cs="Calibri"/>
+          <w:lang w:val="en-US"/>
+        </w:rPr>
+        <w:t>Users are responsible for complying with the license terms applicable</w:t>
+      </w:r>
+      <w:r>
+        <w:rPr>
+          <w:rFonts w:ascii="Calibri" w:hAnsi="Calibri" w:cs="Calibri"/>
+          <w:lang w:val="en-US"/>
+        </w:rPr>
+        <w:t xml:space="preserve"> </w:t>
+      </w:r>
+      <w:r>
+        <w:rPr>
+          <w:rFonts w:ascii="Calibri" w:hAnsi="Calibri" w:cs="Calibri"/>
+          <w:lang w:val="en-US"/>
+        </w:rPr>
+        <w:t>to each third-party component</w:t>
+      </w:r>
+      <w:r>
+        <w:rPr>
+          <w:rFonts w:ascii="Calibri" w:hAnsi="Calibri" w:cs="Calibri"/>
+          <w:lang w:val="en-US"/>
+        </w:rPr>
+        <w:t xml:space="preserve"> (see LICENSE.txt file)</w:t>
+      </w:r>
+      <w:r>
+        <w:rPr>
+          <w:rFonts w:ascii="Calibri" w:hAnsi="Calibri" w:cs="Calibri"/>
+          <w:lang w:val="en-US"/>
+        </w:rPr>
+        <w:t>.</w:t>
+      </w:r>
+    </w:p>
+    <w:p>
+      <w:pPr>
+        <w:spacing w:line="276" w:lineRule="auto"/>
+        <w:rPr>
+          <w:rFonts w:ascii="Calibri" w:hAnsi="Calibri" w:cs="Calibri"/>
+          <w:lang w:val="en-US"/>
+        </w:rPr>
+      </w:pPr>
+    </w:p>
+    <w:p>
+      <w:pPr>
+        <w:pStyle w:val="Heading3"/>
+        <w:rPr>
+          <w:rFonts w:ascii="Calibri" w:hAnsi="Calibri" w:cs="Calibri"/>
+          <w:lang w:val="en-US"/>
+        </w:rPr>
+      </w:pPr>
+      <w:r>
+        <w:rPr>
+          <w:rFonts w:ascii="Calibri" w:hAnsi="Calibri" w:cs="Calibri"/>
+          <w:lang w:val="en-US"/>
+        </w:rPr>
+        <w:t xml:space="preserve">Disclamer </w:t>
+      </w:r>
+    </w:p>
+    <w:p>
+      <w:pPr>
+        <w:spacing w:line="276" w:lineRule="auto"/>
+        <w:rPr>
+          <w:rFonts w:ascii="Calibri" w:hAnsi="Calibri" w:cs="Calibri"/>
+          <w:lang w:val="en-US"/>
+        </w:rPr>
+      </w:pPr>
+      <w:r>
+        <w:rPr>
+          <w:rFonts w:ascii="Calibri" w:hAnsi="Calibri" w:cs="Calibri"/>
+          <w:lang w:val="en-US"/>
+        </w:rPr>
+        <w:t xml:space="preserve">EEGpal is provided as an open-source toolbox to support EEG data analysis and scientific research. While every effort has been made to ensure the quality and reliability of the software, it is provided </w:t>
+      </w:r>
+      <w:r>
+        <w:rPr>
+          <w:rFonts w:ascii="Calibri" w:hAnsi="Calibri" w:cs="Calibri"/>
           <w:b/>
           <w:bCs/>
           <w:lang w:val="en-US"/>
         </w:rPr>
-        <w:t>Matlab</w:t>
-      </w:r>
-      <w:proofErr w:type="spellEnd"/>
-      <w:r>
-        <w:rPr>
+        <w:t>"as is"</w:t>
+      </w:r>
+      <w:r>
+        <w:rPr>
+          <w:rFonts w:ascii="Calibri" w:hAnsi="Calibri" w:cs="Calibri"/>
+          <w:lang w:val="en-US"/>
+        </w:rPr>
+        <w:t>, without warranty of any kind, express or implied.</w:t>
+      </w:r>
+    </w:p>
+    <w:p>
+      <w:pPr>
+        <w:spacing w:line="276" w:lineRule="auto"/>
+        <w:rPr>
+          <w:rFonts w:ascii="Calibri" w:hAnsi="Calibri" w:cs="Calibri"/>
+          <w:lang w:val="en-US"/>
+        </w:rPr>
+      </w:pPr>
+    </w:p>
+    <w:p>
+      <w:pPr>
+        <w:pStyle w:val="Heading3"/>
+        <w:rPr>
+          <w:rFonts w:ascii="Calibri" w:hAnsi="Calibri" w:cs="Calibri"/>
+          <w:lang w:val="en-US"/>
+        </w:rPr>
+      </w:pPr>
+      <w:r>
+        <w:rPr>
+          <w:rFonts w:ascii="Calibri" w:hAnsi="Calibri" w:cs="Calibri"/>
+          <w:lang w:val="en-US"/>
+        </w:rPr>
+        <w:t>Before to start</w:t>
+      </w:r>
+    </w:p>
+    <w:p>
+      <w:pPr>
+        <w:spacing w:line="276" w:lineRule="auto"/>
+        <w:rPr>
+          <w:rFonts w:ascii="Calibri" w:hAnsi="Calibri" w:cs="Calibri"/>
+          <w:lang w:val="en-US"/>
+        </w:rPr>
+      </w:pPr>
+      <w:r>
+        <w:rPr>
+          <w:rFonts w:ascii="Calibri" w:hAnsi="Calibri" w:cs="Calibri"/>
+          <w:lang w:val="en-US"/>
+        </w:rPr>
+        <w:t xml:space="preserve">This section </w:t>
+      </w:r>
+      <w:r>
+        <w:rPr>
+          <w:rFonts w:ascii="Calibri" w:hAnsi="Calibri" w:cs="Calibri"/>
+          <w:lang w:val="en-US"/>
+        </w:rPr>
+        <w:t>reminds</w:t>
+      </w:r>
+      <w:r>
+        <w:rPr>
+          <w:rFonts w:ascii="Calibri" w:hAnsi="Calibri" w:cs="Calibri"/>
+          <w:lang w:val="en-US"/>
+        </w:rPr>
+        <w:t xml:space="preserve"> the import ter</w:t>
+      </w:r>
+      <w:r>
+        <w:rPr>
+          <w:rFonts w:ascii="Calibri" w:hAnsi="Calibri" w:cs="Calibri"/>
+          <w:lang w:val="en-US"/>
+        </w:rPr>
+        <w:t>minology and concept to know before to use this toolbox.</w:t>
+      </w:r>
+    </w:p>
+    <w:p>
+      <w:pPr>
+        <w:spacing w:line="276" w:lineRule="auto"/>
+        <w:rPr>
+          <w:rFonts w:ascii="Calibri" w:hAnsi="Calibri" w:cs="Calibri"/>
           <w:b/>
           <w:bCs/>
           <w:lang w:val="en-US"/>
         </w:rPr>
-        <w:t xml:space="preserve"> path, remove it (because it could generate conflict with the </w:t>
-      </w:r>
-      <w:proofErr w:type="spellStart"/>
-      <w:r>
-        <w:rPr>
+      </w:pPr>
+      <w:r>
+        <w:rPr>
+          <w:rFonts w:ascii="Calibri" w:hAnsi="Calibri" w:cs="Calibri"/>
           <w:b/>
           <w:bCs/>
           <w:lang w:val="en-US"/>
         </w:rPr>
-        <w:t>eeglab</w:t>
-      </w:r>
-      <w:proofErr w:type="spellEnd"/>
-      <w:r>
-        <w:rPr>
+        <w:t>What is a Time Frame (TF)?</w:t>
+      </w:r>
+    </w:p>
+    <w:p>
+      <w:pPr>
+        <w:spacing w:line="276" w:lineRule="auto"/>
+        <w:rPr>
+          <w:rFonts w:ascii="Calibri" w:hAnsi="Calibri" w:cs="Calibri"/>
+          <w:lang w:val="en-US"/>
+        </w:rPr>
+      </w:pPr>
+      <w:r>
+        <w:rPr>
+          <w:rFonts w:ascii="Calibri" w:hAnsi="Calibri" w:cs="Calibri"/>
+          <w:lang w:val="en-US"/>
+        </w:rPr>
+        <w:t>The abbreviation TF (or tf) used in the toolbox stands for Time Frame. It corresponds to one sampling point the EEG files. This is the smallest unit of time. Its duration depends on the sampling frequency. For example, if the sampling frequency is 2048 Hz, then 1 TF=1/2048= 0.000488s = 0.488 ms.</w:t>
+      </w:r>
+    </w:p>
+    <w:p>
+      <w:pPr>
+        <w:spacing w:line="276" w:lineRule="auto"/>
+        <w:rPr>
+          <w:rFonts w:ascii="Calibri" w:hAnsi="Calibri" w:cs="Calibri"/>
           <w:b/>
           <w:bCs/>
           <w:lang w:val="en-US"/>
         </w:rPr>
-        <w:t xml:space="preserve"> version include inside of </w:t>
-      </w:r>
-      <w:proofErr w:type="spellStart"/>
-      <w:r>
-        <w:rPr>
+      </w:pPr>
+      <w:r>
+        <w:rPr>
+          <w:rFonts w:ascii="Calibri" w:hAnsi="Calibri" w:cs="Calibri"/>
           <w:b/>
           <w:bCs/>
           <w:lang w:val="en-US"/>
         </w:rPr>
-        <w:t>EEGpal</w:t>
-      </w:r>
-      <w:proofErr w:type="spellEnd"/>
-      <w:r>
-        <w:rPr>
+        <w:t>File type</w:t>
+      </w:r>
+      <w:r>
+        <w:rPr>
+          <w:rFonts w:ascii="Calibri" w:hAnsi="Calibri" w:cs="Calibri"/>
           <w:b/>
           <w:bCs/>
           <w:lang w:val="en-US"/>
         </w:rPr>
-        <w:t>).</w:t>
-      </w:r>
-    </w:p>
-    <w:p>
-      <w:pPr>
-        <w:rPr>
-          <w:lang w:val="en-US"/>
-        </w:rPr>
-      </w:pPr>
-      <w:r>
-        <w:rPr>
-          <w:lang w:val="en-US"/>
-        </w:rPr>
-        <w:t xml:space="preserve">3. Add this folder to your local </w:t>
-      </w:r>
-      <w:proofErr w:type="spellStart"/>
-      <w:r>
-        <w:rPr>
-          <w:lang w:val="en-US"/>
-        </w:rPr>
-        <w:t>Matlab</w:t>
-      </w:r>
-      <w:proofErr w:type="spellEnd"/>
-      <w:r>
-        <w:rPr>
-          <w:lang w:val="en-US"/>
-        </w:rPr>
-        <w:t xml:space="preserve"> path (use of the command *</w:t>
-      </w:r>
-      <w:proofErr w:type="spellStart"/>
-      <w:proofErr w:type="gramStart"/>
-      <w:r>
-        <w:rPr>
-          <w:lang w:val="en-US"/>
-        </w:rPr>
-        <w:t>setpath</w:t>
-      </w:r>
-      <w:proofErr w:type="spellEnd"/>
-      <w:r>
-        <w:rPr>
-          <w:lang w:val="en-US"/>
-        </w:rPr>
-        <w:t>(</w:t>
-      </w:r>
-      <w:proofErr w:type="gramEnd"/>
-      <w:r>
-        <w:rPr>
-          <w:lang w:val="en-US"/>
-        </w:rPr>
-        <w:t xml:space="preserve">'path of the </w:t>
-      </w:r>
-      <w:proofErr w:type="spellStart"/>
-      <w:r>
-        <w:rPr>
-          <w:lang w:val="en-US"/>
-        </w:rPr>
-        <w:t>EEGpal</w:t>
-      </w:r>
-      <w:proofErr w:type="spellEnd"/>
-      <w:r>
-        <w:rPr>
-          <w:lang w:val="en-US"/>
-        </w:rPr>
-        <w:t xml:space="preserve"> folder</w:t>
-      </w:r>
-      <w:proofErr w:type="gramStart"/>
-      <w:r>
-        <w:rPr>
-          <w:lang w:val="en-US"/>
-        </w:rPr>
-        <w:t>')*</w:t>
-      </w:r>
-      <w:proofErr w:type="gramEnd"/>
-      <w:r>
-        <w:rPr>
-          <w:lang w:val="en-US"/>
-        </w:rPr>
-        <w:t>.</w:t>
-      </w:r>
-    </w:p>
-    <w:p>
-      <w:pPr>
-        <w:rPr>
-          <w:lang w:val="en-US"/>
-        </w:rPr>
-      </w:pPr>
-      <w:r>
-        <w:rPr>
-          <w:lang w:val="en-US"/>
-        </w:rPr>
-        <w:t>4. Use the command *</w:t>
-      </w:r>
-      <w:proofErr w:type="spellStart"/>
-      <w:r>
-        <w:rPr>
-          <w:lang w:val="en-US"/>
-        </w:rPr>
-        <w:t>EEGpal</w:t>
-      </w:r>
-      <w:proofErr w:type="spellEnd"/>
-      <w:r>
-        <w:rPr>
-          <w:lang w:val="en-US"/>
-        </w:rPr>
-        <w:t>* to start the software.</w:t>
-      </w:r>
-    </w:p>
-    <w:p>
-      <w:pPr>
-        <w:rPr>
-          <w:lang w:val="en-US"/>
-        </w:rPr>
-      </w:pPr>
-      <w:r>
-        <w:rPr>
-          <w:lang w:val="en-US"/>
-        </w:rPr>
-        <w:br w:type="page"/>
-      </w:r>
-    </w:p>
-    <w:p>
-      <w:pPr>
-        <w:pStyle w:val="Heading3"/>
-        <w:rPr>
-          <w:rFonts w:ascii="Calibri" w:hAnsi="Calibri" w:cs="Calibri"/>
-          <w:lang w:val="en-US"/>
-        </w:rPr>
-      </w:pPr>
-      <w:r>
-        <w:rPr>
-          <w:rFonts w:ascii="Calibri" w:hAnsi="Calibri" w:cs="Calibri"/>
-          <w:lang w:val="en-US"/>
-        </w:rPr>
-        <w:lastRenderedPageBreak/>
-        <w:t>License</w:t>
+        <w:t>s</w:t>
       </w:r>
     </w:p>
     <w:p>
@@ -1010,418 +937,15 @@
         <w:spacing w:line="276" w:lineRule="auto"/>
         <w:rPr>
           <w:rFonts w:ascii="Calibri" w:hAnsi="Calibri" w:cs="Calibri"/>
-          <w:b/>
-          <w:bCs/>
-          <w:lang w:val="en-US"/>
-        </w:rPr>
-      </w:pPr>
-      <w:proofErr w:type="spellStart"/>
-      <w:r>
-        <w:rPr>
-          <w:rFonts w:ascii="Calibri" w:hAnsi="Calibri" w:cs="Calibri"/>
-          <w:b/>
-          <w:bCs/>
-          <w:lang w:val="en-US"/>
-        </w:rPr>
-        <w:t>EEGpal</w:t>
-      </w:r>
-      <w:proofErr w:type="spellEnd"/>
-      <w:r>
-        <w:rPr>
-          <w:rFonts w:ascii="Calibri" w:hAnsi="Calibri" w:cs="Calibri"/>
-          <w:b/>
-          <w:bCs/>
-          <w:lang w:val="en-US"/>
-        </w:rPr>
-        <w:t xml:space="preserve"> is distributed under the BSD 2-Clause License.</w:t>
-      </w:r>
-    </w:p>
-    <w:p>
-      <w:pPr>
-        <w:spacing w:line="276" w:lineRule="auto"/>
-        <w:rPr>
-          <w:rFonts w:ascii="Calibri" w:hAnsi="Calibri" w:cs="Calibri"/>
-          <w:lang w:val="en-US"/>
-        </w:rPr>
-      </w:pPr>
-      <w:r>
-        <w:rPr>
-          <w:rFonts w:ascii="Calibri" w:hAnsi="Calibri" w:cs="Calibri"/>
-          <w:lang w:val="en-US"/>
-        </w:rPr>
-        <w:t>Third-party software included in this repository is distributed under</w:t>
-      </w:r>
-      <w:r>
-        <w:rPr>
-          <w:rFonts w:ascii="Calibri" w:hAnsi="Calibri" w:cs="Calibri"/>
-          <w:lang w:val="en-US"/>
-        </w:rPr>
-        <w:t xml:space="preserve"> </w:t>
-      </w:r>
-      <w:r>
-        <w:rPr>
-          <w:rFonts w:ascii="Calibri" w:hAnsi="Calibri" w:cs="Calibri"/>
-          <w:lang w:val="en-US"/>
-        </w:rPr>
-        <w:t xml:space="preserve">its own respective licenses, which may differ from the </w:t>
-      </w:r>
-      <w:proofErr w:type="spellStart"/>
-      <w:r>
-        <w:rPr>
-          <w:rFonts w:ascii="Calibri" w:hAnsi="Calibri" w:cs="Calibri"/>
-          <w:lang w:val="en-US"/>
-        </w:rPr>
-        <w:t>EEGpal</w:t>
-      </w:r>
-      <w:proofErr w:type="spellEnd"/>
-      <w:r>
-        <w:rPr>
-          <w:rFonts w:ascii="Calibri" w:hAnsi="Calibri" w:cs="Calibri"/>
-          <w:lang w:val="en-US"/>
-        </w:rPr>
-        <w:t xml:space="preserve"> license.</w:t>
-      </w:r>
-      <w:r>
-        <w:rPr>
-          <w:rFonts w:ascii="Calibri" w:hAnsi="Calibri" w:cs="Calibri"/>
-          <w:lang w:val="en-US"/>
-        </w:rPr>
-        <w:t xml:space="preserve"> </w:t>
-      </w:r>
-      <w:r>
-        <w:rPr>
-          <w:rFonts w:ascii="Calibri" w:hAnsi="Calibri" w:cs="Calibri"/>
-          <w:lang w:val="en-US"/>
-        </w:rPr>
-        <w:t>Users are responsible for complying with the license terms applicable</w:t>
-      </w:r>
-      <w:r>
-        <w:rPr>
-          <w:rFonts w:ascii="Calibri" w:hAnsi="Calibri" w:cs="Calibri"/>
-          <w:lang w:val="en-US"/>
-        </w:rPr>
-        <w:t xml:space="preserve"> </w:t>
-      </w:r>
-      <w:r>
-        <w:rPr>
-          <w:rFonts w:ascii="Calibri" w:hAnsi="Calibri" w:cs="Calibri"/>
-          <w:lang w:val="en-US"/>
-        </w:rPr>
-        <w:t>to each third-party component</w:t>
-      </w:r>
-      <w:r>
-        <w:rPr>
-          <w:rFonts w:ascii="Calibri" w:hAnsi="Calibri" w:cs="Calibri"/>
-          <w:lang w:val="en-US"/>
-        </w:rPr>
-        <w:t xml:space="preserve"> (see LICENSE.txt file)</w:t>
-      </w:r>
-      <w:r>
-        <w:rPr>
-          <w:rFonts w:ascii="Calibri" w:hAnsi="Calibri" w:cs="Calibri"/>
-          <w:lang w:val="en-US"/>
-        </w:rPr>
-        <w:t>.</w:t>
-      </w:r>
-    </w:p>
-    <w:p>
-      <w:pPr>
-        <w:spacing w:line="276" w:lineRule="auto"/>
-        <w:rPr>
-          <w:rFonts w:ascii="Calibri" w:hAnsi="Calibri" w:cs="Calibri"/>
-          <w:lang w:val="en-US"/>
-        </w:rPr>
-      </w:pPr>
-    </w:p>
-    <w:p>
-      <w:pPr>
-        <w:pStyle w:val="Heading3"/>
-        <w:rPr>
-          <w:rFonts w:ascii="Calibri" w:hAnsi="Calibri" w:cs="Calibri"/>
-          <w:lang w:val="en-US"/>
-        </w:rPr>
-      </w:pPr>
-      <w:proofErr w:type="spellStart"/>
-      <w:r>
-        <w:rPr>
-          <w:rFonts w:ascii="Calibri" w:hAnsi="Calibri" w:cs="Calibri"/>
-          <w:lang w:val="en-US"/>
-        </w:rPr>
-        <w:t>Disclamer</w:t>
-      </w:r>
-      <w:proofErr w:type="spellEnd"/>
-      <w:r>
-        <w:rPr>
-          <w:rFonts w:ascii="Calibri" w:hAnsi="Calibri" w:cs="Calibri"/>
-          <w:lang w:val="en-US"/>
-        </w:rPr>
-        <w:t xml:space="preserve"> </w:t>
-      </w:r>
-    </w:p>
-    <w:p>
-      <w:pPr>
-        <w:spacing w:line="276" w:lineRule="auto"/>
-        <w:rPr>
-          <w:rFonts w:ascii="Calibri" w:hAnsi="Calibri" w:cs="Calibri"/>
-          <w:lang w:val="en-US"/>
-        </w:rPr>
-      </w:pPr>
-      <w:proofErr w:type="spellStart"/>
-      <w:r>
-        <w:rPr>
-          <w:rFonts w:ascii="Calibri" w:hAnsi="Calibri" w:cs="Calibri"/>
-          <w:lang w:val="en-US"/>
-        </w:rPr>
-        <w:t>EEGpal</w:t>
-      </w:r>
-      <w:proofErr w:type="spellEnd"/>
-      <w:r>
-        <w:rPr>
-          <w:rFonts w:ascii="Calibri" w:hAnsi="Calibri" w:cs="Calibri"/>
-          <w:lang w:val="en-US"/>
-        </w:rPr>
-        <w:t xml:space="preserve"> is provided as an open-source toolbox to support EEG data analysis and scientific research. While every effort has been made to ensure the quality and reliability of the software, it is provided </w:t>
-      </w:r>
-      <w:r>
-        <w:rPr>
-          <w:rFonts w:ascii="Calibri" w:hAnsi="Calibri" w:cs="Calibri"/>
-          <w:b/>
-          <w:bCs/>
-          <w:lang w:val="en-US"/>
-        </w:rPr>
-        <w:t>"as is"</w:t>
-      </w:r>
-      <w:r>
-        <w:rPr>
-          <w:rFonts w:ascii="Calibri" w:hAnsi="Calibri" w:cs="Calibri"/>
-          <w:lang w:val="en-US"/>
-        </w:rPr>
-        <w:t>, without warranty of any kind, express or implied.</w:t>
-      </w:r>
-    </w:p>
-    <w:p>
-      <w:pPr>
-        <w:spacing w:line="276" w:lineRule="auto"/>
-        <w:rPr>
-          <w:rFonts w:ascii="Calibri" w:hAnsi="Calibri" w:cs="Calibri"/>
-          <w:lang w:val="en-US"/>
-        </w:rPr>
-      </w:pPr>
-    </w:p>
-    <w:p>
-      <w:pPr>
-        <w:pStyle w:val="Heading3"/>
-        <w:rPr>
-          <w:rFonts w:ascii="Calibri" w:hAnsi="Calibri" w:cs="Calibri"/>
-          <w:lang w:val="en-US"/>
-        </w:rPr>
-      </w:pPr>
-      <w:r>
-        <w:rPr>
-          <w:rFonts w:ascii="Calibri" w:hAnsi="Calibri" w:cs="Calibri"/>
-          <w:lang w:val="en-US"/>
-        </w:rPr>
-        <w:t xml:space="preserve">Before </w:t>
-      </w:r>
-      <w:proofErr w:type="gramStart"/>
-      <w:r>
-        <w:rPr>
-          <w:rFonts w:ascii="Calibri" w:hAnsi="Calibri" w:cs="Calibri"/>
-          <w:lang w:val="en-US"/>
-        </w:rPr>
-        <w:t>to start</w:t>
-      </w:r>
-      <w:proofErr w:type="gramEnd"/>
-    </w:p>
-    <w:p>
-      <w:pPr>
-        <w:spacing w:line="276" w:lineRule="auto"/>
-        <w:rPr>
-          <w:rFonts w:ascii="Calibri" w:hAnsi="Calibri" w:cs="Calibri"/>
-          <w:lang w:val="en-US"/>
-        </w:rPr>
-      </w:pPr>
-      <w:r>
-        <w:rPr>
-          <w:rFonts w:ascii="Calibri" w:hAnsi="Calibri" w:cs="Calibri"/>
-          <w:lang w:val="en-US"/>
-        </w:rPr>
-        <w:t xml:space="preserve">This section </w:t>
-      </w:r>
-      <w:r>
-        <w:rPr>
-          <w:rFonts w:ascii="Calibri" w:hAnsi="Calibri" w:cs="Calibri"/>
-          <w:lang w:val="en-US"/>
-        </w:rPr>
-        <w:t>reminds</w:t>
-      </w:r>
-      <w:r>
-        <w:rPr>
-          <w:rFonts w:ascii="Calibri" w:hAnsi="Calibri" w:cs="Calibri"/>
-          <w:lang w:val="en-US"/>
-        </w:rPr>
-        <w:t xml:space="preserve"> the import ter</w:t>
-      </w:r>
-      <w:r>
-        <w:rPr>
-          <w:rFonts w:ascii="Calibri" w:hAnsi="Calibri" w:cs="Calibri"/>
-          <w:lang w:val="en-US"/>
-        </w:rPr>
-        <w:t xml:space="preserve">minology and </w:t>
-      </w:r>
-      <w:proofErr w:type="gramStart"/>
-      <w:r>
-        <w:rPr>
-          <w:rFonts w:ascii="Calibri" w:hAnsi="Calibri" w:cs="Calibri"/>
-          <w:lang w:val="en-US"/>
-        </w:rPr>
-        <w:t>concept to know</w:t>
-      </w:r>
-      <w:proofErr w:type="gramEnd"/>
-      <w:r>
-        <w:rPr>
-          <w:rFonts w:ascii="Calibri" w:hAnsi="Calibri" w:cs="Calibri"/>
-          <w:lang w:val="en-US"/>
-        </w:rPr>
-        <w:t xml:space="preserve"> before </w:t>
-      </w:r>
-      <w:proofErr w:type="gramStart"/>
-      <w:r>
-        <w:rPr>
-          <w:rFonts w:ascii="Calibri" w:hAnsi="Calibri" w:cs="Calibri"/>
-          <w:lang w:val="en-US"/>
-        </w:rPr>
-        <w:t>to use</w:t>
-      </w:r>
-      <w:proofErr w:type="gramEnd"/>
-      <w:r>
-        <w:rPr>
-          <w:rFonts w:ascii="Calibri" w:hAnsi="Calibri" w:cs="Calibri"/>
-          <w:lang w:val="en-US"/>
-        </w:rPr>
-        <w:t xml:space="preserve"> this toolbox.</w:t>
-      </w:r>
-    </w:p>
-    <w:p>
-      <w:pPr>
-        <w:spacing w:line="276" w:lineRule="auto"/>
-        <w:rPr>
-          <w:rFonts w:ascii="Calibri" w:hAnsi="Calibri" w:cs="Calibri"/>
-          <w:b/>
-          <w:bCs/>
-          <w:lang w:val="en-US"/>
-        </w:rPr>
-      </w:pPr>
-      <w:r>
-        <w:rPr>
-          <w:rFonts w:ascii="Calibri" w:hAnsi="Calibri" w:cs="Calibri"/>
-          <w:b/>
-          <w:bCs/>
-          <w:lang w:val="en-US"/>
-        </w:rPr>
-        <w:t>What is a Time Frame (TF)?</w:t>
-      </w:r>
-    </w:p>
-    <w:p>
-      <w:pPr>
-        <w:spacing w:line="276" w:lineRule="auto"/>
-        <w:rPr>
-          <w:rFonts w:ascii="Calibri" w:hAnsi="Calibri" w:cs="Calibri"/>
-          <w:lang w:val="en-US"/>
-        </w:rPr>
-      </w:pPr>
-      <w:r>
-        <w:rPr>
-          <w:rFonts w:ascii="Calibri" w:hAnsi="Calibri" w:cs="Calibri"/>
-          <w:lang w:val="en-US"/>
-        </w:rPr>
-        <w:t xml:space="preserve">The abbreviation TF (or </w:t>
-      </w:r>
-      <w:proofErr w:type="spellStart"/>
-      <w:r>
-        <w:rPr>
-          <w:rFonts w:ascii="Calibri" w:hAnsi="Calibri" w:cs="Calibri"/>
-          <w:lang w:val="en-US"/>
-        </w:rPr>
-        <w:t>tf</w:t>
-      </w:r>
-      <w:proofErr w:type="spellEnd"/>
-      <w:r>
-        <w:rPr>
-          <w:rFonts w:ascii="Calibri" w:hAnsi="Calibri" w:cs="Calibri"/>
-          <w:lang w:val="en-US"/>
-        </w:rPr>
-        <w:t xml:space="preserve">) used in the toolbox stands for Time Frame. It corresponds to one sampling point the EEG files. This is the smallest unit of time. Its duration depends on the sampling frequency. For example, if the sampling frequency is 2048 Hz, then 1 TF=1/2048= 0.000488s = 0.488 </w:t>
-      </w:r>
-      <w:proofErr w:type="spellStart"/>
-      <w:r>
-        <w:rPr>
-          <w:rFonts w:ascii="Calibri" w:hAnsi="Calibri" w:cs="Calibri"/>
-          <w:lang w:val="en-US"/>
-        </w:rPr>
-        <w:t>ms.</w:t>
-      </w:r>
-      <w:proofErr w:type="spellEnd"/>
-    </w:p>
-    <w:p>
-      <w:pPr>
-        <w:spacing w:line="276" w:lineRule="auto"/>
-        <w:rPr>
-          <w:rFonts w:ascii="Calibri" w:hAnsi="Calibri" w:cs="Calibri"/>
-          <w:b/>
-          <w:bCs/>
-          <w:lang w:val="en-US"/>
-        </w:rPr>
-      </w:pPr>
-      <w:r>
-        <w:rPr>
-          <w:rFonts w:ascii="Calibri" w:hAnsi="Calibri" w:cs="Calibri"/>
-          <w:b/>
-          <w:bCs/>
-          <w:lang w:val="en-US"/>
-        </w:rPr>
-        <w:t>File type</w:t>
-      </w:r>
-      <w:r>
-        <w:rPr>
-          <w:rFonts w:ascii="Calibri" w:hAnsi="Calibri" w:cs="Calibri"/>
-          <w:b/>
-          <w:bCs/>
-          <w:lang w:val="en-US"/>
-        </w:rPr>
-        <w:t>s</w:t>
-      </w:r>
-    </w:p>
-    <w:p>
-      <w:pPr>
-        <w:spacing w:line="276" w:lineRule="auto"/>
-        <w:rPr>
-          <w:rFonts w:ascii="Calibri" w:hAnsi="Calibri" w:cs="Calibri"/>
-          <w:lang w:val="en-US"/>
-        </w:rPr>
-      </w:pPr>
-      <w:r>
-        <w:rPr>
-          <w:rFonts w:ascii="Calibri" w:hAnsi="Calibri" w:cs="Calibri"/>
-          <w:lang w:val="en-US"/>
-        </w:rPr>
-        <w:t xml:space="preserve">One of the advantages of the </w:t>
-      </w:r>
-      <w:proofErr w:type="spellStart"/>
-      <w:r>
-        <w:rPr>
-          <w:rFonts w:ascii="Calibri" w:hAnsi="Calibri" w:cs="Calibri"/>
-          <w:lang w:val="en-US"/>
-        </w:rPr>
-        <w:t>EEGpal</w:t>
-      </w:r>
-      <w:proofErr w:type="spellEnd"/>
-      <w:r>
-        <w:rPr>
-          <w:rFonts w:ascii="Calibri" w:hAnsi="Calibri" w:cs="Calibri"/>
-          <w:lang w:val="en-US"/>
-        </w:rPr>
-        <w:t xml:space="preserve"> toolbox is that it works with a serval EEG file format. For example: </w:t>
+          <w:lang w:val="en-US"/>
+        </w:rPr>
+      </w:pPr>
+      <w:r>
+        <w:rPr>
+          <w:rFonts w:ascii="Calibri" w:hAnsi="Calibri" w:cs="Calibri"/>
+          <w:lang w:val="en-US"/>
+        </w:rPr>
+        <w:t xml:space="preserve">One of the advantages of the EEGpal toolbox is that it works with a serval EEG file format. For example: </w:t>
       </w:r>
     </w:p>
     <w:p>
@@ -1437,46 +961,12 @@
           <w:lang w:val="en-US"/>
         </w:rPr>
       </w:pPr>
-      <w:proofErr w:type="gramStart"/>
-      <w:r>
-        <w:rPr>
-          <w:rFonts w:ascii="Calibri" w:hAnsi="Calibri" w:cs="Calibri"/>
-          <w:lang w:val="en-US"/>
-        </w:rPr>
-        <w:t>.</w:t>
-      </w:r>
-      <w:proofErr w:type="spellStart"/>
-      <w:r>
-        <w:rPr>
-          <w:rFonts w:ascii="Calibri" w:hAnsi="Calibri" w:cs="Calibri"/>
-          <w:lang w:val="en-US"/>
-        </w:rPr>
-        <w:t>bdf</w:t>
-      </w:r>
-      <w:proofErr w:type="spellEnd"/>
-      <w:proofErr w:type="gramEnd"/>
-      <w:r>
-        <w:rPr>
-          <w:rFonts w:ascii="Calibri" w:hAnsi="Calibri" w:cs="Calibri"/>
-          <w:lang w:val="en-US"/>
-        </w:rPr>
-        <w:t xml:space="preserve"> : Raw </w:t>
-      </w:r>
-      <w:proofErr w:type="spellStart"/>
-      <w:r>
-        <w:rPr>
-          <w:rFonts w:ascii="Calibri" w:hAnsi="Calibri" w:cs="Calibri"/>
-          <w:lang w:val="en-US"/>
-        </w:rPr>
-        <w:t>Biosemi</w:t>
-      </w:r>
-      <w:proofErr w:type="spellEnd"/>
-      <w:r>
-        <w:rPr>
-          <w:rFonts w:ascii="Calibri" w:hAnsi="Calibri" w:cs="Calibri"/>
-          <w:lang w:val="en-US"/>
-        </w:rPr>
-        <w:t xml:space="preserve"> files</w:t>
+      <w:r>
+        <w:rPr>
+          <w:rFonts w:ascii="Calibri" w:hAnsi="Calibri" w:cs="Calibri"/>
+          <w:lang w:val="en-US"/>
+        </w:rPr>
+        <w:t>.bdf : Raw Biosemi files</w:t>
       </w:r>
     </w:p>
     <w:p>
@@ -1492,30 +982,12 @@
           <w:lang w:val="en-US"/>
         </w:rPr>
       </w:pPr>
-      <w:proofErr w:type="gramStart"/>
-      <w:r>
-        <w:rPr>
-          <w:rFonts w:ascii="Calibri" w:hAnsi="Calibri" w:cs="Calibri"/>
-          <w:lang w:val="en-US"/>
-        </w:rPr>
-        <w:t>.</w:t>
-      </w:r>
-      <w:proofErr w:type="spellStart"/>
-      <w:r>
-        <w:rPr>
-          <w:rFonts w:ascii="Calibri" w:hAnsi="Calibri" w:cs="Calibri"/>
-          <w:lang w:val="en-US"/>
-        </w:rPr>
-        <w:t>eph</w:t>
-      </w:r>
-      <w:proofErr w:type="spellEnd"/>
-      <w:proofErr w:type="gramEnd"/>
-      <w:r>
-        <w:rPr>
-          <w:rFonts w:ascii="Calibri" w:hAnsi="Calibri" w:cs="Calibri"/>
-          <w:lang w:val="en-US"/>
-        </w:rPr>
-        <w:t xml:space="preserve"> : Text file format </w:t>
+      <w:r>
+        <w:rPr>
+          <w:rFonts w:ascii="Calibri" w:hAnsi="Calibri" w:cs="Calibri"/>
+          <w:lang w:val="en-US"/>
+        </w:rPr>
+        <w:t xml:space="preserve">.eph : Text file format </w:t>
       </w:r>
       <w:r>
         <w:rPr>
@@ -1529,71 +1001,7 @@
           <w:rFonts w:ascii="Calibri" w:hAnsi="Calibri" w:cs="Calibri"/>
           <w:lang w:val="en-US"/>
         </w:rPr>
-        <w:t xml:space="preserve">used in </w:t>
-      </w:r>
-      <w:proofErr w:type="spellStart"/>
-      <w:r>
-        <w:rPr>
-          <w:rFonts w:ascii="Calibri" w:hAnsi="Calibri" w:cs="Calibri"/>
-          <w:lang w:val="en-US"/>
-        </w:rPr>
-        <w:t>Cartool</w:t>
-      </w:r>
-      <w:proofErr w:type="spellEnd"/>
-      <w:r>
-        <w:rPr>
-          <w:rFonts w:ascii="Calibri" w:hAnsi="Calibri" w:cs="Calibri"/>
-          <w:lang w:val="en-US"/>
-        </w:rPr>
-        <w:t xml:space="preserve">. The first line is </w:t>
-      </w:r>
-      <w:proofErr w:type="gramStart"/>
-      <w:r>
-        <w:rPr>
-          <w:rFonts w:ascii="Calibri" w:hAnsi="Calibri" w:cs="Calibri"/>
-          <w:lang w:val="en-US"/>
-        </w:rPr>
-        <w:t>an</w:t>
-      </w:r>
-      <w:proofErr w:type="gramEnd"/>
-      <w:r>
-        <w:rPr>
-          <w:rFonts w:ascii="Calibri" w:hAnsi="Calibri" w:cs="Calibri"/>
-          <w:lang w:val="en-US"/>
-        </w:rPr>
-        <w:t xml:space="preserve"> header which contains info about the number of </w:t>
-      </w:r>
-      <w:proofErr w:type="gramStart"/>
-      <w:r>
-        <w:rPr>
-          <w:rFonts w:ascii="Calibri" w:hAnsi="Calibri" w:cs="Calibri"/>
-          <w:lang w:val="en-US"/>
-        </w:rPr>
-        <w:t>channel</w:t>
-      </w:r>
-      <w:proofErr w:type="gramEnd"/>
-      <w:r>
-        <w:rPr>
-          <w:rFonts w:ascii="Calibri" w:hAnsi="Calibri" w:cs="Calibri"/>
-          <w:lang w:val="en-US"/>
-        </w:rPr>
-        <w:t xml:space="preserve">, number of time </w:t>
-      </w:r>
-      <w:proofErr w:type="gramStart"/>
-      <w:r>
-        <w:rPr>
-          <w:rFonts w:ascii="Calibri" w:hAnsi="Calibri" w:cs="Calibri"/>
-          <w:lang w:val="en-US"/>
-        </w:rPr>
-        <w:t>point</w:t>
-      </w:r>
-      <w:proofErr w:type="gramEnd"/>
-      <w:r>
-        <w:rPr>
-          <w:rFonts w:ascii="Calibri" w:hAnsi="Calibri" w:cs="Calibri"/>
-          <w:lang w:val="en-US"/>
-        </w:rPr>
-        <w:t xml:space="preserve"> and sampling rate</w:t>
+        <w:t>used in Cartool. The first line is an header which contains info about the number of channel, number of time point and sampling rate</w:t>
       </w:r>
     </w:p>
     <w:p>
@@ -1609,21 +1017,12 @@
           <w:lang w:val="en-US"/>
         </w:rPr>
       </w:pPr>
-      <w:proofErr w:type="gramStart"/>
-      <w:r>
-        <w:rPr>
-          <w:rFonts w:ascii="Calibri" w:hAnsi="Calibri" w:cs="Calibri"/>
-          <w:lang w:val="en-US"/>
-        </w:rPr>
-        <w:t>.ep</w:t>
-      </w:r>
-      <w:proofErr w:type="gramEnd"/>
-      <w:r>
-        <w:rPr>
-          <w:rFonts w:ascii="Calibri" w:hAnsi="Calibri" w:cs="Calibri"/>
-          <w:lang w:val="en-US"/>
-        </w:rPr>
-        <w:t xml:space="preserve">:  Text file format </w:t>
+      <w:r>
+        <w:rPr>
+          <w:rFonts w:ascii="Calibri" w:hAnsi="Calibri" w:cs="Calibri"/>
+          <w:lang w:val="en-US"/>
+        </w:rPr>
+        <w:t xml:space="preserve">.ep:  Text file format </w:t>
       </w:r>
       <w:r>
         <w:rPr>
@@ -1644,17 +1043,8 @@
           <w:rFonts w:ascii="Calibri" w:hAnsi="Calibri" w:cs="Calibri"/>
           <w:lang w:val="en-US"/>
         </w:rPr>
-        <w:t xml:space="preserve">used in </w:t>
-      </w:r>
-      <w:proofErr w:type="spellStart"/>
-      <w:r>
-        <w:rPr>
-          <w:rFonts w:ascii="Calibri" w:hAnsi="Calibri" w:cs="Calibri"/>
-          <w:lang w:val="en-US"/>
-        </w:rPr>
-        <w:t>Cartool</w:t>
-      </w:r>
-      <w:proofErr w:type="spellEnd"/>
+        <w:t>used in Cartool</w:t>
+      </w:r>
       <w:r>
         <w:rPr>
           <w:rFonts w:ascii="Calibri" w:hAnsi="Calibri" w:cs="Calibri"/>
@@ -1667,23 +1057,7 @@
           <w:rFonts w:ascii="Calibri" w:hAnsi="Calibri" w:cs="Calibri"/>
           <w:lang w:val="en-US"/>
         </w:rPr>
-        <w:t xml:space="preserve">Koenig, T., </w:t>
-      </w:r>
-      <w:proofErr w:type="spellStart"/>
-      <w:r>
-        <w:rPr>
-          <w:rFonts w:ascii="Calibri" w:hAnsi="Calibri" w:cs="Calibri"/>
-          <w:lang w:val="en-US"/>
-        </w:rPr>
-        <w:t>Kottlow</w:t>
-      </w:r>
-      <w:proofErr w:type="spellEnd"/>
-      <w:r>
-        <w:rPr>
-          <w:rFonts w:ascii="Calibri" w:hAnsi="Calibri" w:cs="Calibri"/>
-          <w:lang w:val="en-US"/>
-        </w:rPr>
-        <w:t>, M., Stein, M., &amp; Melie-García, L. (2011). Ragu: A Free Tool for the Analysis of EEG and MEG Event-Related Scalp Field Data Using Global Randomization Statistics. Computational Intelligence and Neuroscience, 2011, 1-14. DOI: 10.1155/2011/938925.</w:t>
+        <w:t>Koenig, T., Kottlow, M., Stein, M., &amp; Melie-García, L. (2011). Ragu: A Free Tool for the Analysis of EEG and MEG Event-Related Scalp Field Data Using Global Randomization Statistics. Computational Intelligence and Neuroscience, 2011, 1-14. DOI: 10.1155/2011/938925.</w:t>
       </w:r>
       <w:r>
         <w:rPr>
@@ -1713,69 +1087,19 @@
           <w:lang w:val="en-US"/>
         </w:rPr>
       </w:pPr>
-      <w:proofErr w:type="gramStart"/>
-      <w:r>
-        <w:rPr>
-          <w:rFonts w:ascii="Calibri" w:hAnsi="Calibri" w:cs="Calibri"/>
-          <w:lang w:val="en-US"/>
-        </w:rPr>
-        <w:t>.</w:t>
-      </w:r>
-      <w:proofErr w:type="spellStart"/>
-      <w:r>
-        <w:rPr>
-          <w:rFonts w:ascii="Calibri" w:hAnsi="Calibri" w:cs="Calibri"/>
-          <w:lang w:val="en-US"/>
-        </w:rPr>
-        <w:t>sef</w:t>
-      </w:r>
-      <w:proofErr w:type="spellEnd"/>
-      <w:proofErr w:type="gramEnd"/>
-      <w:r>
-        <w:rPr>
-          <w:rFonts w:ascii="Calibri" w:hAnsi="Calibri" w:cs="Calibri"/>
-          <w:lang w:val="en-US"/>
-        </w:rPr>
-        <w:t xml:space="preserve">: </w:t>
-      </w:r>
-      <w:r>
-        <w:rPr>
-          <w:rFonts w:ascii="Calibri" w:hAnsi="Calibri" w:cs="Calibri"/>
-          <w:lang w:val="en-US"/>
-        </w:rPr>
-        <w:t xml:space="preserve">Binary EEG file used in </w:t>
-      </w:r>
-      <w:proofErr w:type="spellStart"/>
-      <w:r>
-        <w:rPr>
-          <w:rFonts w:ascii="Calibri" w:hAnsi="Calibri" w:cs="Calibri"/>
-          <w:lang w:val="en-US"/>
-        </w:rPr>
-        <w:t>Cartool</w:t>
-      </w:r>
-      <w:proofErr w:type="spellEnd"/>
-      <w:r>
-        <w:rPr>
-          <w:rFonts w:ascii="Calibri" w:hAnsi="Calibri" w:cs="Calibri"/>
-          <w:lang w:val="en-US"/>
-        </w:rPr>
-        <w:t xml:space="preserve"> that contains the data and temporal information. It is the default option proposed in </w:t>
-      </w:r>
-      <w:proofErr w:type="spellStart"/>
-      <w:r>
-        <w:rPr>
-          <w:rFonts w:ascii="Calibri" w:hAnsi="Calibri" w:cs="Calibri"/>
-          <w:lang w:val="en-US"/>
-        </w:rPr>
-        <w:t>EEGpal</w:t>
-      </w:r>
-      <w:proofErr w:type="spellEnd"/>
-      <w:r>
-        <w:rPr>
-          <w:rFonts w:ascii="Calibri" w:hAnsi="Calibri" w:cs="Calibri"/>
-          <w:lang w:val="en-US"/>
-        </w:rPr>
-        <w:t xml:space="preserve"> because this solution uses the least disk space.</w:t>
+      <w:r>
+        <w:rPr>
+          <w:rFonts w:ascii="Calibri" w:hAnsi="Calibri" w:cs="Calibri"/>
+          <w:lang w:val="en-US"/>
+        </w:rPr>
+        <w:t xml:space="preserve">.sef: </w:t>
+      </w:r>
+      <w:r>
+        <w:rPr>
+          <w:rFonts w:ascii="Calibri" w:hAnsi="Calibri" w:cs="Calibri"/>
+          <w:lang w:val="en-US"/>
+        </w:rPr>
+        <w:t>Binary EEG file used in Cartool that contains the data and temporal information. It is the default option proposed in EEGpal because this solution uses the least disk space.</w:t>
       </w:r>
     </w:p>
     <w:p>
@@ -1791,32 +1115,13 @@
           <w:lang w:val="en-US"/>
         </w:rPr>
       </w:pPr>
-      <w:proofErr w:type="gramStart"/>
-      <w:r>
-        <w:rPr>
-          <w:rFonts w:ascii="Calibri" w:hAnsi="Calibri" w:cs="Calibri"/>
-          <w:lang w:val="en-US"/>
-        </w:rPr>
-        <w:t>.set/.</w:t>
-      </w:r>
-      <w:proofErr w:type="spellStart"/>
-      <w:r>
-        <w:rPr>
-          <w:rFonts w:ascii="Calibri" w:hAnsi="Calibri" w:cs="Calibri"/>
-          <w:lang w:val="en-US"/>
-        </w:rPr>
-        <w:t>fdt</w:t>
-      </w:r>
-      <w:proofErr w:type="spellEnd"/>
-      <w:proofErr w:type="gramEnd"/>
-      <w:r>
-        <w:rPr>
-          <w:rFonts w:ascii="Calibri" w:hAnsi="Calibri" w:cs="Calibri"/>
-          <w:lang w:val="en-US"/>
-        </w:rPr>
-        <w:t xml:space="preserve">: File format used by </w:t>
-      </w:r>
-      <w:proofErr w:type="spellStart"/>
+      <w:r>
+        <w:rPr>
+          <w:rFonts w:ascii="Calibri" w:hAnsi="Calibri" w:cs="Calibri"/>
+          <w:lang w:val="en-US"/>
+        </w:rPr>
+        <w:t xml:space="preserve">.set/.fdt: File format used by </w:t>
+      </w:r>
       <w:r>
         <w:rPr>
           <w:rFonts w:ascii="Calibri" w:hAnsi="Calibri" w:cs="Calibri"/>
@@ -1824,7 +1129,6 @@
         </w:rPr>
         <w:t>eeglab</w:t>
       </w:r>
-      <w:proofErr w:type="spellEnd"/>
     </w:p>
     <w:p>
       <w:pPr>
@@ -1839,40 +1143,13 @@
           <w:lang w:val="en-US"/>
         </w:rPr>
       </w:pPr>
-      <w:proofErr w:type="gramStart"/>
-      <w:r>
-        <w:rPr>
-          <w:rFonts w:ascii="Calibri" w:hAnsi="Calibri" w:cs="Calibri"/>
-          <w:lang w:val="en-US"/>
-        </w:rPr>
-        <w:t>.</w:t>
-      </w:r>
-      <w:proofErr w:type="spellStart"/>
-      <w:r>
-        <w:rPr>
-          <w:rFonts w:ascii="Calibri" w:hAnsi="Calibri" w:cs="Calibri"/>
-          <w:lang w:val="en-US"/>
-        </w:rPr>
-        <w:t>ris</w:t>
-      </w:r>
-      <w:proofErr w:type="spellEnd"/>
-      <w:proofErr w:type="gramEnd"/>
-      <w:r>
-        <w:rPr>
-          <w:rFonts w:ascii="Calibri" w:hAnsi="Calibri" w:cs="Calibri"/>
-          <w:lang w:val="en-US"/>
-        </w:rPr>
-        <w:t xml:space="preserve">: Inverse solution file used in </w:t>
-      </w:r>
-      <w:proofErr w:type="spellStart"/>
-      <w:r>
-        <w:rPr>
-          <w:rFonts w:ascii="Calibri" w:hAnsi="Calibri" w:cs="Calibri"/>
-          <w:lang w:val="en-US"/>
-        </w:rPr>
-        <w:t>Cartool</w:t>
-      </w:r>
-      <w:proofErr w:type="spellEnd"/>
+      <w:r>
+        <w:rPr>
+          <w:rFonts w:ascii="Calibri" w:hAnsi="Calibri" w:cs="Calibri"/>
+          <w:lang w:val="en-US"/>
+        </w:rPr>
+        <w:t>.ris: Inverse solution file used in Cartool</w:t>
+      </w:r>
     </w:p>
     <w:p>
       <w:pPr>
@@ -1887,40 +1164,13 @@
           <w:lang w:val="en-US"/>
         </w:rPr>
       </w:pPr>
-      <w:proofErr w:type="gramStart"/>
-      <w:r>
-        <w:rPr>
-          <w:rFonts w:ascii="Calibri" w:hAnsi="Calibri" w:cs="Calibri"/>
-          <w:lang w:val="en-US"/>
-        </w:rPr>
-        <w:t>.</w:t>
-      </w:r>
-      <w:proofErr w:type="spellStart"/>
-      <w:r>
-        <w:rPr>
-          <w:rFonts w:ascii="Calibri" w:hAnsi="Calibri" w:cs="Calibri"/>
-          <w:lang w:val="en-US"/>
-        </w:rPr>
-        <w:t>freq</w:t>
-      </w:r>
-      <w:proofErr w:type="spellEnd"/>
-      <w:proofErr w:type="gramEnd"/>
-      <w:r>
-        <w:rPr>
-          <w:rFonts w:ascii="Calibri" w:hAnsi="Calibri" w:cs="Calibri"/>
-          <w:lang w:val="en-US"/>
-        </w:rPr>
-        <w:t xml:space="preserve">: Frequency analysis file used in </w:t>
-      </w:r>
-      <w:proofErr w:type="spellStart"/>
-      <w:r>
-        <w:rPr>
-          <w:rFonts w:ascii="Calibri" w:hAnsi="Calibri" w:cs="Calibri"/>
-          <w:lang w:val="en-US"/>
-        </w:rPr>
-        <w:t>Cartool</w:t>
-      </w:r>
-      <w:proofErr w:type="spellEnd"/>
+      <w:r>
+        <w:rPr>
+          <w:rFonts w:ascii="Calibri" w:hAnsi="Calibri" w:cs="Calibri"/>
+          <w:lang w:val="en-US"/>
+        </w:rPr>
+        <w:t>.freq: Frequency analysis file used in Cartool</w:t>
+      </w:r>
     </w:p>
     <w:p>
       <w:pPr>
@@ -1935,46 +1185,12 @@
           <w:lang w:val="en-US"/>
         </w:rPr>
       </w:pPr>
-      <w:proofErr w:type="gramStart"/>
-      <w:r>
-        <w:rPr>
-          <w:rFonts w:ascii="Calibri" w:hAnsi="Calibri" w:cs="Calibri"/>
-          <w:lang w:val="en-US"/>
-        </w:rPr>
-        <w:t>.</w:t>
-      </w:r>
-      <w:proofErr w:type="spellStart"/>
-      <w:r>
-        <w:rPr>
-          <w:rFonts w:ascii="Calibri" w:hAnsi="Calibri" w:cs="Calibri"/>
-          <w:lang w:val="en-US"/>
-        </w:rPr>
-        <w:t>mrk</w:t>
-      </w:r>
-      <w:proofErr w:type="spellEnd"/>
-      <w:proofErr w:type="gramEnd"/>
-      <w:r>
-        <w:rPr>
-          <w:rFonts w:ascii="Calibri" w:hAnsi="Calibri" w:cs="Calibri"/>
-          <w:lang w:val="en-US"/>
-        </w:rPr>
-        <w:t xml:space="preserve">: marker file. It is a text file which </w:t>
-      </w:r>
-      <w:proofErr w:type="gramStart"/>
-      <w:r>
-        <w:rPr>
-          <w:rFonts w:ascii="Calibri" w:hAnsi="Calibri" w:cs="Calibri"/>
-          <w:lang w:val="en-US"/>
-        </w:rPr>
-        <w:t>include</w:t>
-      </w:r>
-      <w:proofErr w:type="gramEnd"/>
-      <w:r>
-        <w:rPr>
-          <w:rFonts w:ascii="Calibri" w:hAnsi="Calibri" w:cs="Calibri"/>
-          <w:lang w:val="en-US"/>
-        </w:rPr>
-        <w:t xml:space="preserve"> </w:t>
+      <w:r>
+        <w:rPr>
+          <w:rFonts w:ascii="Calibri" w:hAnsi="Calibri" w:cs="Calibri"/>
+          <w:lang w:val="en-US"/>
+        </w:rPr>
+        <w:t xml:space="preserve">.mrk: marker file. It is a text file which include </w:t>
       </w:r>
       <w:r>
         <w:rPr>
@@ -1997,87 +1213,12 @@
           <w:lang w:val="en-US"/>
         </w:rPr>
       </w:pPr>
-      <w:proofErr w:type="gramStart"/>
-      <w:r>
-        <w:rPr>
-          <w:rFonts w:ascii="Calibri" w:hAnsi="Calibri" w:cs="Calibri"/>
-          <w:lang w:val="en-US"/>
-        </w:rPr>
-        <w:t>.</w:t>
-      </w:r>
-      <w:proofErr w:type="spellStart"/>
-      <w:r>
-        <w:rPr>
-          <w:rFonts w:ascii="Calibri" w:hAnsi="Calibri" w:cs="Calibri"/>
-          <w:lang w:val="en-US"/>
-        </w:rPr>
-        <w:t>eeg</w:t>
-      </w:r>
-      <w:proofErr w:type="spellEnd"/>
-      <w:r>
-        <w:rPr>
-          <w:rFonts w:ascii="Calibri" w:hAnsi="Calibri" w:cs="Calibri"/>
-          <w:lang w:val="en-US"/>
-        </w:rPr>
-        <w:t>/.</w:t>
-      </w:r>
-      <w:proofErr w:type="spellStart"/>
-      <w:r>
-        <w:rPr>
-          <w:rFonts w:ascii="Calibri" w:hAnsi="Calibri" w:cs="Calibri"/>
-          <w:lang w:val="en-US"/>
-        </w:rPr>
-        <w:t>vhdr</w:t>
-      </w:r>
-      <w:proofErr w:type="spellEnd"/>
-      <w:proofErr w:type="gramEnd"/>
-      <w:r>
-        <w:rPr>
-          <w:rFonts w:ascii="Calibri" w:hAnsi="Calibri" w:cs="Calibri"/>
-          <w:lang w:val="en-US"/>
-        </w:rPr>
-        <w:t xml:space="preserve">: file format from </w:t>
-      </w:r>
-      <w:proofErr w:type="spellStart"/>
-      <w:r>
-        <w:rPr>
-          <w:rFonts w:ascii="Calibri" w:hAnsi="Calibri" w:cs="Calibri"/>
-          <w:lang w:val="en-US"/>
-        </w:rPr>
-        <w:t>BrainVision</w:t>
-      </w:r>
-      <w:proofErr w:type="spellEnd"/>
-      <w:r>
-        <w:rPr>
-          <w:rFonts w:ascii="Calibri" w:hAnsi="Calibri" w:cs="Calibri"/>
-          <w:lang w:val="en-US"/>
-        </w:rPr>
-        <w:t xml:space="preserve"> recorder. This file format is automatically converted </w:t>
-      </w:r>
-      <w:proofErr w:type="gramStart"/>
-      <w:r>
-        <w:rPr>
-          <w:rFonts w:ascii="Calibri" w:hAnsi="Calibri" w:cs="Calibri"/>
-          <w:lang w:val="en-US"/>
-        </w:rPr>
-        <w:t>to .set/.</w:t>
-      </w:r>
-      <w:proofErr w:type="spellStart"/>
-      <w:r>
-        <w:rPr>
-          <w:rFonts w:ascii="Calibri" w:hAnsi="Calibri" w:cs="Calibri"/>
-          <w:lang w:val="en-US"/>
-        </w:rPr>
-        <w:t>fdt</w:t>
-      </w:r>
-      <w:proofErr w:type="spellEnd"/>
-      <w:proofErr w:type="gramEnd"/>
-      <w:r>
-        <w:rPr>
-          <w:rFonts w:ascii="Calibri" w:hAnsi="Calibri" w:cs="Calibri"/>
-          <w:lang w:val="en-US"/>
-        </w:rPr>
-        <w:t xml:space="preserve"> during import. It will also create a *.Events.txt file with the new trigger/event </w:t>
+      <w:r>
+        <w:rPr>
+          <w:rFonts w:ascii="Calibri" w:hAnsi="Calibri" w:cs="Calibri"/>
+          <w:lang w:val="en-US"/>
+        </w:rPr>
+        <w:t xml:space="preserve">.eeg/.vhdr: file format from BrainVision recorder. This file format is automatically converted to .set/.fdt during import. It will also create a *.Events.txt file with the new trigger/event </w:t>
       </w:r>
       <w:r>
         <w:rPr>
@@ -2085,23 +1226,7 @@
           <w:lang w:val="en-US"/>
         </w:rPr>
         <w:lastRenderedPageBreak/>
-        <w:t xml:space="preserve">name (text to number conversion required). However, you can only import this specific file format. You must work with one of the above formats in </w:t>
-      </w:r>
-      <w:proofErr w:type="spellStart"/>
-      <w:r>
-        <w:rPr>
-          <w:rFonts w:ascii="Calibri" w:hAnsi="Calibri" w:cs="Calibri"/>
-          <w:lang w:val="en-US"/>
-        </w:rPr>
-        <w:t>EEGpal</w:t>
-      </w:r>
-      <w:proofErr w:type="spellEnd"/>
-      <w:r>
-        <w:rPr>
-          <w:rFonts w:ascii="Calibri" w:hAnsi="Calibri" w:cs="Calibri"/>
-          <w:lang w:val="en-US"/>
-        </w:rPr>
-        <w:t xml:space="preserve">. </w:t>
+        <w:t xml:space="preserve">name (text to number conversion required). However, you can only import this specific file format. You must work with one of the above formats in EEGpal. </w:t>
       </w:r>
     </w:p>
     <w:p>
@@ -2117,23 +1242,7 @@
           <w:rFonts w:ascii="Calibri" w:hAnsi="Calibri" w:cs="Calibri"/>
           <w:lang w:val="en-US"/>
         </w:rPr>
-        <w:t xml:space="preserve">The </w:t>
-      </w:r>
-      <w:proofErr w:type="spellStart"/>
-      <w:r>
-        <w:rPr>
-          <w:rFonts w:ascii="Calibri" w:hAnsi="Calibri" w:cs="Calibri"/>
-          <w:lang w:val="en-US"/>
-        </w:rPr>
-        <w:t>EEGpal</w:t>
-      </w:r>
-      <w:proofErr w:type="spellEnd"/>
-      <w:r>
-        <w:rPr>
-          <w:rFonts w:ascii="Calibri" w:hAnsi="Calibri" w:cs="Calibri"/>
-          <w:lang w:val="en-US"/>
-        </w:rPr>
-        <w:t xml:space="preserve"> toolbox offers the possibility to easily switch from one file format to the other, thanks to the export tool or the choice of output file format within each module.</w:t>
+        <w:t>The EEGpal toolbox offers the possibility to easily switch from one file format to the other, thanks to the export tool or the choice of output file format within each module.</w:t>
       </w:r>
     </w:p>
     <w:p>
@@ -2196,7 +1305,6 @@
         </w:rPr>
         <w:t xml:space="preserve">This tag could be a </w:t>
       </w:r>
-      <w:proofErr w:type="gramStart"/>
       <w:r>
         <w:rPr>
           <w:rFonts w:ascii="Calibri" w:hAnsi="Calibri" w:cs="Calibri"/>
@@ -2204,7 +1312,6 @@
         </w:rPr>
         <w:t>triggers</w:t>
       </w:r>
-      <w:proofErr w:type="gramEnd"/>
       <w:r>
         <w:rPr>
           <w:rFonts w:ascii="Calibri" w:hAnsi="Calibri" w:cs="Calibri"/>
@@ -2212,126 +1319,12 @@
         </w:rPr>
         <w:t xml:space="preserve"> or a </w:t>
       </w:r>
-      <w:proofErr w:type="gramStart"/>
-      <w:r>
-        <w:rPr>
-          <w:rFonts w:ascii="Calibri" w:hAnsi="Calibri" w:cs="Calibri"/>
-          <w:lang w:val="en-US"/>
-        </w:rPr>
-        <w:t>markers</w:t>
-      </w:r>
-      <w:proofErr w:type="gramEnd"/>
-      <w:r>
-        <w:rPr>
-          <w:rFonts w:ascii="Calibri" w:hAnsi="Calibri" w:cs="Calibri"/>
-          <w:lang w:val="en-US"/>
-        </w:rPr>
-        <w:t xml:space="preserve">. The difference is that the triggers are included in the EEG file (this is the case </w:t>
-      </w:r>
-      <w:proofErr w:type="gramStart"/>
-      <w:r>
-        <w:rPr>
-          <w:rFonts w:ascii="Calibri" w:hAnsi="Calibri" w:cs="Calibri"/>
-          <w:lang w:val="en-US"/>
-        </w:rPr>
-        <w:t>for .</w:t>
-      </w:r>
-      <w:proofErr w:type="spellStart"/>
-      <w:r>
-        <w:rPr>
-          <w:rFonts w:ascii="Calibri" w:hAnsi="Calibri" w:cs="Calibri"/>
-          <w:lang w:val="en-US"/>
-        </w:rPr>
-        <w:t>bdf</w:t>
-      </w:r>
-      <w:proofErr w:type="spellEnd"/>
-      <w:proofErr w:type="gramEnd"/>
-      <w:r>
-        <w:rPr>
-          <w:rFonts w:ascii="Calibri" w:hAnsi="Calibri" w:cs="Calibri"/>
-          <w:lang w:val="en-US"/>
-        </w:rPr>
-        <w:t xml:space="preserve"> and .set file formats), while the markers are recorded in a separate text file named </w:t>
-      </w:r>
-      <w:proofErr w:type="spellStart"/>
-      <w:r>
-        <w:rPr>
-          <w:rFonts w:ascii="Calibri" w:hAnsi="Calibri" w:cs="Calibri"/>
-          <w:lang w:val="en-US"/>
-        </w:rPr>
-        <w:t>eeg_file.mrk</w:t>
-      </w:r>
-      <w:proofErr w:type="spellEnd"/>
-      <w:r>
-        <w:rPr>
-          <w:rFonts w:ascii="Calibri" w:hAnsi="Calibri" w:cs="Calibri"/>
-          <w:lang w:val="en-US"/>
-        </w:rPr>
-        <w:t xml:space="preserve"> (this is the case </w:t>
-      </w:r>
-      <w:proofErr w:type="gramStart"/>
-      <w:r>
-        <w:rPr>
-          <w:rFonts w:ascii="Calibri" w:hAnsi="Calibri" w:cs="Calibri"/>
-          <w:lang w:val="en-US"/>
-        </w:rPr>
-        <w:t>for .</w:t>
-      </w:r>
-      <w:proofErr w:type="spellStart"/>
-      <w:r>
-        <w:rPr>
-          <w:rFonts w:ascii="Calibri" w:hAnsi="Calibri" w:cs="Calibri"/>
-          <w:lang w:val="en-US"/>
-        </w:rPr>
-        <w:t>eph</w:t>
-      </w:r>
-      <w:proofErr w:type="spellEnd"/>
-      <w:r>
-        <w:rPr>
-          <w:rFonts w:ascii="Calibri" w:hAnsi="Calibri" w:cs="Calibri"/>
-          <w:lang w:val="en-US"/>
-        </w:rPr>
-        <w:t>, .ep</w:t>
-      </w:r>
-      <w:proofErr w:type="gramEnd"/>
-      <w:r>
-        <w:rPr>
-          <w:rFonts w:ascii="Calibri" w:hAnsi="Calibri" w:cs="Calibri"/>
-          <w:lang w:val="en-US"/>
-        </w:rPr>
-        <w:t>, .</w:t>
-      </w:r>
-      <w:proofErr w:type="spellStart"/>
-      <w:r>
-        <w:rPr>
-          <w:rFonts w:ascii="Calibri" w:hAnsi="Calibri" w:cs="Calibri"/>
-          <w:lang w:val="en-US"/>
-        </w:rPr>
-        <w:t>sef</w:t>
-      </w:r>
-      <w:proofErr w:type="spellEnd"/>
-      <w:r>
-        <w:rPr>
-          <w:rFonts w:ascii="Calibri" w:hAnsi="Calibri" w:cs="Calibri"/>
-          <w:lang w:val="en-US"/>
-        </w:rPr>
-        <w:t xml:space="preserve"> file formats). </w:t>
-      </w:r>
-      <w:proofErr w:type="spellStart"/>
-      <w:r>
-        <w:rPr>
-          <w:rFonts w:ascii="Calibri" w:hAnsi="Calibri" w:cs="Calibri"/>
-          <w:lang w:val="en-US"/>
-        </w:rPr>
-        <w:t>EEGpal</w:t>
-      </w:r>
-      <w:proofErr w:type="spellEnd"/>
-      <w:r>
-        <w:rPr>
-          <w:rFonts w:ascii="Calibri" w:hAnsi="Calibri" w:cs="Calibri"/>
-          <w:lang w:val="en-US"/>
-        </w:rPr>
-        <w:t xml:space="preserve"> automatically detects these two cases and can handle them. </w:t>
+      <w:r>
+        <w:rPr>
+          <w:rFonts w:ascii="Calibri" w:hAnsi="Calibri" w:cs="Calibri"/>
+          <w:lang w:val="en-US"/>
+        </w:rPr>
+        <w:t xml:space="preserve">markers. The difference is that the triggers are included in the EEG file (this is the case for .bdf and .set file formats), while the markers are recorded in a separate text file named eeg_file.mrk (this is the case for .eph, .ep, .sef file formats). EEGpal automatically detects these two cases and can handle them. </w:t>
       </w:r>
     </w:p>
     <w:p>
@@ -2385,23 +1378,7 @@
           <w:rFonts w:ascii="Calibri" w:hAnsi="Calibri" w:cs="Calibri"/>
           <w:lang w:val="en-US"/>
         </w:rPr>
-        <w:t xml:space="preserve">ach time you perform a processing step with an </w:t>
-      </w:r>
-      <w:proofErr w:type="spellStart"/>
-      <w:r>
-        <w:rPr>
-          <w:rFonts w:ascii="Calibri" w:hAnsi="Calibri" w:cs="Calibri"/>
-          <w:lang w:val="en-US"/>
-        </w:rPr>
-        <w:t>EEGpal</w:t>
-      </w:r>
-      <w:proofErr w:type="spellEnd"/>
-      <w:r>
-        <w:rPr>
-          <w:rFonts w:ascii="Calibri" w:hAnsi="Calibri" w:cs="Calibri"/>
-          <w:lang w:val="en-US"/>
-        </w:rPr>
-        <w:t xml:space="preserve"> tool or module, a Processing Information File (PIF) is created. This is a text file containing a summary of all input and output files and processing parameters. It allows you to keep track of the steps you have performed. </w:t>
+        <w:t xml:space="preserve">ach time you perform a processing step with an EEGpal tool or module, a Processing Information File (PIF) is created. This is a text file containing a summary of all input and output files and processing parameters. It allows you to keep track of the steps you have performed. </w:t>
       </w:r>
     </w:p>
     <w:p>
@@ -2449,7 +1426,7 @@
                     <pic:cNvPicPr/>
                   </pic:nvPicPr>
                   <pic:blipFill>
-                    <a:blip r:embed="rId12"/>
+                    <a:blip r:embed="rId13"/>
                     <a:stretch>
                       <a:fillRect/>
                     </a:stretch>
@@ -2497,27 +1474,7 @@
           <w:lang w:val="en-US"/>
         </w:rPr>
         <w:lastRenderedPageBreak/>
-        <w:t xml:space="preserve">What is a typical EEG processing pipeline in </w:t>
-      </w:r>
-      <w:proofErr w:type="spellStart"/>
-      <w:r>
-        <w:rPr>
-          <w:rFonts w:ascii="Calibri" w:hAnsi="Calibri" w:cs="Calibri"/>
-          <w:b/>
-          <w:bCs/>
-          <w:lang w:val="en-US"/>
-        </w:rPr>
-        <w:t>EEGpal</w:t>
-      </w:r>
-      <w:proofErr w:type="spellEnd"/>
-      <w:r>
-        <w:rPr>
-          <w:rFonts w:ascii="Calibri" w:hAnsi="Calibri" w:cs="Calibri"/>
-          <w:b/>
-          <w:bCs/>
-          <w:lang w:val="en-US"/>
-        </w:rPr>
-        <w:t>?</w:t>
+        <w:t>What is a typical EEG processing pipeline in EEGpal?</w:t>
       </w:r>
     </w:p>
     <w:p>
@@ -2533,23 +1490,7 @@
           <w:rFonts w:ascii="Calibri" w:hAnsi="Calibri" w:cs="Calibri"/>
           <w:lang w:val="en-US"/>
         </w:rPr>
-        <w:t xml:space="preserve">Everyone has </w:t>
-      </w:r>
-      <w:proofErr w:type="gramStart"/>
-      <w:r>
-        <w:rPr>
-          <w:rFonts w:ascii="Calibri" w:hAnsi="Calibri" w:cs="Calibri"/>
-          <w:lang w:val="en-US"/>
-        </w:rPr>
-        <w:t>its</w:t>
-      </w:r>
-      <w:proofErr w:type="gramEnd"/>
-      <w:r>
-        <w:rPr>
-          <w:rFonts w:ascii="Calibri" w:hAnsi="Calibri" w:cs="Calibri"/>
-          <w:lang w:val="en-US"/>
-        </w:rPr>
-        <w:t xml:space="preserve"> own </w:t>
+        <w:t xml:space="preserve">Everyone has its own </w:t>
       </w:r>
       <w:r>
         <w:rPr>
@@ -2563,23 +1504,7 @@
           <w:rFonts w:ascii="Calibri" w:hAnsi="Calibri" w:cs="Calibri"/>
           <w:lang w:val="en-US"/>
         </w:rPr>
-        <w:t xml:space="preserve"> but the pipeline used by the Toolbox creator </w:t>
-      </w:r>
-      <w:proofErr w:type="gramStart"/>
-      <w:r>
-        <w:rPr>
-          <w:rFonts w:ascii="Calibri" w:hAnsi="Calibri" w:cs="Calibri"/>
-          <w:lang w:val="en-US"/>
-        </w:rPr>
-        <w:t>are</w:t>
-      </w:r>
-      <w:proofErr w:type="gramEnd"/>
-      <w:r>
-        <w:rPr>
-          <w:rFonts w:ascii="Calibri" w:hAnsi="Calibri" w:cs="Calibri"/>
-          <w:lang w:val="en-US"/>
-        </w:rPr>
-        <w:t xml:space="preserve"> detailed at the bottom of this document</w:t>
+        <w:t xml:space="preserve"> but the pipeline used by the Toolbox creator are detailed at the bottom of this document</w:t>
       </w:r>
       <w:r>
         <w:rPr>
@@ -2651,7 +1576,7 @@
                     <pic:cNvPicPr/>
                   </pic:nvPicPr>
                   <pic:blipFill>
-                    <a:blip r:embed="rId13"/>
+                    <a:blip r:embed="rId14"/>
                     <a:stretch>
                       <a:fillRect/>
                     </a:stretch>
@@ -2685,55 +1610,7 @@
           <w:rFonts w:ascii="Calibri" w:hAnsi="Calibri" w:cs="Calibri"/>
           <w:lang w:val="en-US"/>
         </w:rPr>
-        <w:t xml:space="preserve">There </w:t>
-      </w:r>
-      <w:proofErr w:type="gramStart"/>
-      <w:r>
-        <w:rPr>
-          <w:rFonts w:ascii="Calibri" w:hAnsi="Calibri" w:cs="Calibri"/>
-          <w:lang w:val="en-US"/>
-        </w:rPr>
-        <w:t>is</w:t>
-      </w:r>
-      <w:proofErr w:type="gramEnd"/>
-      <w:r>
-        <w:rPr>
-          <w:rFonts w:ascii="Calibri" w:hAnsi="Calibri" w:cs="Calibri"/>
-          <w:lang w:val="en-US"/>
-        </w:rPr>
-        <w:t xml:space="preserve"> five important </w:t>
-      </w:r>
-      <w:proofErr w:type="gramStart"/>
-      <w:r>
-        <w:rPr>
-          <w:rFonts w:ascii="Calibri" w:hAnsi="Calibri" w:cs="Calibri"/>
-          <w:lang w:val="en-US"/>
-        </w:rPr>
-        <w:t>section</w:t>
-      </w:r>
-      <w:proofErr w:type="gramEnd"/>
-      <w:r>
-        <w:rPr>
-          <w:rFonts w:ascii="Calibri" w:hAnsi="Calibri" w:cs="Calibri"/>
-          <w:lang w:val="en-US"/>
-        </w:rPr>
-        <w:t xml:space="preserve"> in the </w:t>
-      </w:r>
-      <w:proofErr w:type="spellStart"/>
-      <w:r>
-        <w:rPr>
-          <w:rFonts w:ascii="Calibri" w:hAnsi="Calibri" w:cs="Calibri"/>
-          <w:lang w:val="en-US"/>
-        </w:rPr>
-        <w:t>EEGpal</w:t>
-      </w:r>
-      <w:proofErr w:type="spellEnd"/>
-      <w:r>
-        <w:rPr>
-          <w:rFonts w:ascii="Calibri" w:hAnsi="Calibri" w:cs="Calibri"/>
-          <w:lang w:val="en-US"/>
-        </w:rPr>
-        <w:t xml:space="preserve"> main window: </w:t>
+        <w:t xml:space="preserve">There is five important section in the EEGpal main window: </w:t>
       </w:r>
     </w:p>
     <w:p>
@@ -2988,23 +1865,7 @@
           <w:rFonts w:ascii="Calibri" w:hAnsi="Calibri" w:cs="Calibri"/>
           <w:lang w:val="en-US"/>
         </w:rPr>
-        <w:t xml:space="preserve">: Modules which permit various </w:t>
-      </w:r>
-      <w:proofErr w:type="gramStart"/>
-      <w:r>
-        <w:rPr>
-          <w:rFonts w:ascii="Calibri" w:hAnsi="Calibri" w:cs="Calibri"/>
-          <w:lang w:val="en-US"/>
-        </w:rPr>
-        <w:t>type</w:t>
-      </w:r>
-      <w:proofErr w:type="gramEnd"/>
-      <w:r>
-        <w:rPr>
-          <w:rFonts w:ascii="Calibri" w:hAnsi="Calibri" w:cs="Calibri"/>
-          <w:lang w:val="en-US"/>
-        </w:rPr>
-        <w:t xml:space="preserve"> of analysis on your preprocessed data</w:t>
+        <w:t>: Modules which permit various type of analysis on your preprocessed data</w:t>
       </w:r>
       <w:r>
         <w:rPr>
@@ -3041,23 +1902,7 @@
           <w:rFonts w:ascii="Calibri" w:hAnsi="Calibri" w:cs="Calibri"/>
           <w:lang w:val="en-US"/>
         </w:rPr>
-        <w:t xml:space="preserve">: Save or load all the parameters that you have set in the various </w:t>
-      </w:r>
-      <w:proofErr w:type="spellStart"/>
-      <w:r>
-        <w:rPr>
-          <w:rFonts w:ascii="Calibri" w:hAnsi="Calibri" w:cs="Calibri"/>
-          <w:lang w:val="en-US"/>
-        </w:rPr>
-        <w:t>EEGpal</w:t>
-      </w:r>
-      <w:proofErr w:type="spellEnd"/>
-      <w:r>
-        <w:rPr>
-          <w:rFonts w:ascii="Calibri" w:hAnsi="Calibri" w:cs="Calibri"/>
-          <w:lang w:val="en-US"/>
-        </w:rPr>
-        <w:t xml:space="preserve"> modules. You can then program a batch to automatically run all the preprocessing steps </w:t>
+        <w:t xml:space="preserve">: Save or load all the parameters that you have set in the various EEGpal modules. You can then program a batch to automatically run all the preprocessing steps </w:t>
       </w:r>
     </w:p>
     <w:p>
@@ -3106,7 +1951,7 @@
                     <pic:cNvPicPr/>
                   </pic:nvPicPr>
                   <pic:blipFill>
-                    <a:blip r:embed="rId14"/>
+                    <a:blip r:embed="rId15"/>
                     <a:stretch>
                       <a:fillRect/>
                     </a:stretch>
@@ -3147,19 +1992,8 @@
           <w:bCs/>
           <w:lang w:val="en-US"/>
         </w:rPr>
-        <w:t xml:space="preserve">File </w:t>
-      </w:r>
-      <w:proofErr w:type="gramStart"/>
-      <w:r>
-        <w:rPr>
-          <w:rFonts w:ascii="Calibri" w:hAnsi="Calibri" w:cs="Calibri"/>
-          <w:b/>
-          <w:bCs/>
-          <w:lang w:val="en-US"/>
-        </w:rPr>
-        <w:t>types</w:t>
-      </w:r>
-      <w:proofErr w:type="gramEnd"/>
+        <w:t>File types</w:t>
+      </w:r>
       <w:r>
         <w:rPr>
           <w:rFonts w:ascii="Calibri" w:hAnsi="Calibri" w:cs="Calibri"/>
@@ -3305,23 +2139,7 @@
           <w:rFonts w:ascii="Calibri" w:hAnsi="Calibri" w:cs="Calibri"/>
           <w:lang w:val="en-US"/>
         </w:rPr>
-        <w:t xml:space="preserve">Press the Input Folder button and select the directory containing all the EEG files you wish to import. These files can be placed in sub-directories. The toolbox will select all files corresponding to the search criteria defined in 1 and 2, whether they are in the main folder or in sub-folders. It takes some time to fill the list in the central panel. Give </w:t>
-      </w:r>
-      <w:proofErr w:type="spellStart"/>
-      <w:r>
-        <w:rPr>
-          <w:rFonts w:ascii="Calibri" w:hAnsi="Calibri" w:cs="Calibri"/>
-          <w:lang w:val="en-US"/>
-        </w:rPr>
-        <w:t>Matlab</w:t>
-      </w:r>
-      <w:proofErr w:type="spellEnd"/>
-      <w:r>
-        <w:rPr>
-          <w:rFonts w:ascii="Calibri" w:hAnsi="Calibri" w:cs="Calibri"/>
-          <w:lang w:val="en-US"/>
-        </w:rPr>
-        <w:t xml:space="preserve"> time to complete this list before doing anything. </w:t>
+        <w:t xml:space="preserve">Press the Input Folder button and select the directory containing all the EEG files you wish to import. These files can be placed in sub-directories. The toolbox will select all files corresponding to the search criteria defined in 1 and 2, whether they are in the main folder or in sub-folders. It takes some time to fill the list in the central panel. Give Matlab time to complete this list before doing anything. </w:t>
       </w:r>
     </w:p>
     <w:p>
@@ -3429,7 +2247,7 @@
                     <pic:cNvPicPr/>
                   </pic:nvPicPr>
                   <pic:blipFill>
-                    <a:blip r:embed="rId15"/>
+                    <a:blip r:embed="rId16"/>
                     <a:stretch>
                       <a:fillRect/>
                     </a:stretch>
@@ -3468,23 +2286,7 @@
           <w:rFonts w:ascii="Calibri" w:hAnsi="Calibri" w:cs="Calibri"/>
           <w:lang w:val="en-US"/>
         </w:rPr>
-        <w:t xml:space="preserve">To specify different subjects in the </w:t>
-      </w:r>
-      <w:proofErr w:type="spellStart"/>
-      <w:r>
-        <w:rPr>
-          <w:rFonts w:ascii="Calibri" w:hAnsi="Calibri" w:cs="Calibri"/>
-          <w:lang w:val="en-US"/>
-        </w:rPr>
-        <w:t>EEGPal</w:t>
-      </w:r>
-      <w:proofErr w:type="spellEnd"/>
-      <w:r>
-        <w:rPr>
-          <w:rFonts w:ascii="Calibri" w:hAnsi="Calibri" w:cs="Calibri"/>
-          <w:lang w:val="en-US"/>
-        </w:rPr>
-        <w:t xml:space="preserve"> toolbox, identify the participant code in the EEG name of the first entry in the data table.</w:t>
+        <w:t>To specify different subjects in the EEGPal toolbox, identify the participant code in the EEG name of the first entry in the data table.</w:t>
       </w:r>
       <w:r>
         <w:rPr>
@@ -3656,39 +2458,7 @@
           <w:rFonts w:ascii="Calibri" w:hAnsi="Calibri" w:cs="Calibri"/>
           <w:lang w:val="en-US"/>
         </w:rPr>
-        <w:t xml:space="preserve">Note: defining the participants is especially important for the ICA, </w:t>
-      </w:r>
-      <w:proofErr w:type="spellStart"/>
-      <w:r>
-        <w:rPr>
-          <w:rFonts w:ascii="Calibri" w:hAnsi="Calibri" w:cs="Calibri"/>
-          <w:lang w:val="en-US"/>
-        </w:rPr>
-        <w:t>Epoching</w:t>
-      </w:r>
-      <w:proofErr w:type="spellEnd"/>
-      <w:r>
-        <w:rPr>
-          <w:rFonts w:ascii="Calibri" w:hAnsi="Calibri" w:cs="Calibri"/>
-          <w:lang w:val="en-US"/>
-        </w:rPr>
-        <w:t xml:space="preserve"> and Full Design +Statistics modules. These steps are indeed required to </w:t>
-      </w:r>
-      <w:proofErr w:type="gramStart"/>
-      <w:r>
-        <w:rPr>
-          <w:rFonts w:ascii="Calibri" w:hAnsi="Calibri" w:cs="Calibri"/>
-          <w:lang w:val="en-US"/>
-        </w:rPr>
-        <w:t>group</w:t>
-      </w:r>
-      <w:proofErr w:type="gramEnd"/>
-      <w:r>
-        <w:rPr>
-          <w:rFonts w:ascii="Calibri" w:hAnsi="Calibri" w:cs="Calibri"/>
-          <w:lang w:val="en-US"/>
-        </w:rPr>
-        <w:t xml:space="preserve"> all data from one subject. Otherwise, each file will be treated independently.</w:t>
+        <w:t>Note: defining the participants is especially important for the ICA, Epoching and Full Design +Statistics modules. These steps are indeed required to group all data from one subject. Otherwise, each file will be treated independently.</w:t>
       </w:r>
     </w:p>
     <w:p>
@@ -3748,7 +2518,7 @@
                     <pic:cNvPicPr/>
                   </pic:nvPicPr>
                   <pic:blipFill>
-                    <a:blip r:embed="rId16"/>
+                    <a:blip r:embed="rId17"/>
                     <a:stretch>
                       <a:fillRect/>
                     </a:stretch>
@@ -3787,39 +2557,7 @@
           <w:rFonts w:ascii="Calibri" w:hAnsi="Calibri" w:cs="Calibri"/>
           <w:lang w:val="en-US"/>
         </w:rPr>
-        <w:t xml:space="preserve">Load </w:t>
-      </w:r>
-      <w:proofErr w:type="gramStart"/>
-      <w:r>
-        <w:rPr>
-          <w:rFonts w:ascii="Calibri" w:hAnsi="Calibri" w:cs="Calibri"/>
-          <w:lang w:val="en-US"/>
-        </w:rPr>
-        <w:t>the .</w:t>
-      </w:r>
-      <w:proofErr w:type="spellStart"/>
-      <w:r>
-        <w:rPr>
-          <w:rFonts w:ascii="Calibri" w:hAnsi="Calibri" w:cs="Calibri"/>
-          <w:lang w:val="en-US"/>
-        </w:rPr>
-        <w:t>xyz</w:t>
-      </w:r>
-      <w:proofErr w:type="spellEnd"/>
-      <w:r>
-        <w:rPr>
-          <w:rFonts w:ascii="Calibri" w:hAnsi="Calibri" w:cs="Calibri"/>
-          <w:lang w:val="en-US"/>
-        </w:rPr>
-        <w:t>, .els</w:t>
-      </w:r>
-      <w:proofErr w:type="gramEnd"/>
-      <w:r>
-        <w:rPr>
-          <w:rFonts w:ascii="Calibri" w:hAnsi="Calibri" w:cs="Calibri"/>
-          <w:lang w:val="en-US"/>
-        </w:rPr>
-        <w:t xml:space="preserve"> or .locs file containing the spatial coordinates for locating the electrode </w:t>
+        <w:t xml:space="preserve">Load the .xyz, .els or .locs file containing the spatial coordinates for locating the electrode </w:t>
       </w:r>
       <w:r>
         <w:rPr>
@@ -3864,23 +2602,7 @@
           <w:rFonts w:ascii="Calibri" w:hAnsi="Calibri" w:cs="Calibri"/>
           <w:lang w:val="en-US"/>
         </w:rPr>
-        <w:t xml:space="preserve">In the current situation there are already two coordinate files for a 64 channel </w:t>
-      </w:r>
-      <w:proofErr w:type="spellStart"/>
-      <w:r>
-        <w:rPr>
-          <w:rFonts w:ascii="Calibri" w:hAnsi="Calibri" w:cs="Calibri"/>
-          <w:lang w:val="en-US"/>
-        </w:rPr>
-        <w:t>Biosemi</w:t>
-      </w:r>
-      <w:proofErr w:type="spellEnd"/>
-      <w:r>
-        <w:rPr>
-          <w:rFonts w:ascii="Calibri" w:hAnsi="Calibri" w:cs="Calibri"/>
-          <w:lang w:val="en-US"/>
-        </w:rPr>
-        <w:t xml:space="preserve"> configuration in the </w:t>
+        <w:t xml:space="preserve">In the current situation there are already two coordinate files for a 64 channel Biosemi configuration in the </w:t>
       </w:r>
       <w:r>
         <w:rPr>
@@ -3896,23 +2618,7 @@
           <w:rFonts w:ascii="Calibri" w:hAnsi="Calibri" w:cs="Calibri"/>
           <w:lang w:val="en-US"/>
         </w:rPr>
-        <w:t xml:space="preserve"> sub-folder of the </w:t>
-      </w:r>
-      <w:proofErr w:type="spellStart"/>
-      <w:r>
-        <w:rPr>
-          <w:rFonts w:ascii="Calibri" w:hAnsi="Calibri" w:cs="Calibri"/>
-          <w:lang w:val="en-US"/>
-        </w:rPr>
-        <w:t>EEGpal</w:t>
-      </w:r>
-      <w:proofErr w:type="spellEnd"/>
-      <w:r>
-        <w:rPr>
-          <w:rFonts w:ascii="Calibri" w:hAnsi="Calibri" w:cs="Calibri"/>
-          <w:lang w:val="en-US"/>
-        </w:rPr>
-        <w:t xml:space="preserve">. The </w:t>
+        <w:t xml:space="preserve"> sub-folder of the EEGpal. The </w:t>
       </w:r>
       <w:r>
         <w:rPr>
@@ -3921,30 +2627,7 @@
           <w:iCs/>
           <w:lang w:val="en-US"/>
         </w:rPr>
-        <w:t>biosemi64_officialAB_update.locs</w:t>
-      </w:r>
-      <w:r>
-        <w:rPr>
-          <w:rFonts w:ascii="Calibri" w:hAnsi="Calibri" w:cs="Calibri"/>
-          <w:lang w:val="en-US"/>
-        </w:rPr>
-        <w:t xml:space="preserve"> file contains the coordinates found on the official </w:t>
-      </w:r>
-      <w:proofErr w:type="spellStart"/>
-      <w:r>
-        <w:rPr>
-          <w:rFonts w:ascii="Calibri" w:hAnsi="Calibri" w:cs="Calibri"/>
-          <w:lang w:val="en-US"/>
-        </w:rPr>
-        <w:t>Biosemi</w:t>
-      </w:r>
-      <w:proofErr w:type="spellEnd"/>
-      <w:r>
-        <w:rPr>
-          <w:rFonts w:ascii="Calibri" w:hAnsi="Calibri" w:cs="Calibri"/>
-          <w:lang w:val="en-US"/>
-        </w:rPr>
-        <w:t xml:space="preserve"> website with a spherical distribution of electrodes. The file </w:t>
+        <w:t>Biosemi64_Spherical_Name_Cz_.xyz</w:t>
       </w:r>
       <w:r>
         <w:rPr>
@@ -3953,46 +2636,56 @@
           <w:iCs/>
           <w:lang w:val="en-US"/>
         </w:rPr>
-        <w:t>64-Biosemi_OVAL_AB.xyz</w:t>
-      </w:r>
-      <w:r>
-        <w:rPr>
-          <w:rFonts w:ascii="Calibri" w:hAnsi="Calibri" w:cs="Calibri"/>
-          <w:lang w:val="en-US"/>
-        </w:rPr>
-        <w:t xml:space="preserve"> is an oval distribution of the electrodes after </w:t>
-      </w:r>
-      <w:proofErr w:type="spellStart"/>
-      <w:r>
-        <w:rPr>
-          <w:rFonts w:ascii="Calibri" w:hAnsi="Calibri" w:cs="Calibri"/>
-          <w:lang w:val="en-US"/>
-        </w:rPr>
-        <w:t>coregistration</w:t>
-      </w:r>
-      <w:proofErr w:type="spellEnd"/>
-      <w:r>
-        <w:rPr>
-          <w:rFonts w:ascii="Calibri" w:hAnsi="Calibri" w:cs="Calibri"/>
-          <w:lang w:val="en-US"/>
-        </w:rPr>
-        <w:t xml:space="preserve"> with the MNI template in </w:t>
-      </w:r>
-      <w:proofErr w:type="spellStart"/>
-      <w:r>
-        <w:rPr>
-          <w:rFonts w:ascii="Calibri" w:hAnsi="Calibri" w:cs="Calibri"/>
-          <w:lang w:val="en-US"/>
-        </w:rPr>
-        <w:t>Cartool</w:t>
-      </w:r>
-      <w:proofErr w:type="spellEnd"/>
-      <w:r>
-        <w:rPr>
-          <w:rFonts w:ascii="Calibri" w:hAnsi="Calibri" w:cs="Calibri"/>
-          <w:lang w:val="en-US"/>
-        </w:rPr>
-        <w:t xml:space="preserve"> (more physiologically accurate). </w:t>
+        <w:t xml:space="preserve"> </w:t>
+      </w:r>
+      <w:r>
+        <w:rPr>
+          <w:rFonts w:ascii="Calibri" w:hAnsi="Calibri" w:cs="Calibri"/>
+          <w:lang w:val="en-US"/>
+        </w:rPr>
+        <w:t xml:space="preserve"> file contains the coordinates found on the official Biosemi website with a spherical distribution of electrodes</w:t>
+      </w:r>
+      <w:r>
+        <w:rPr>
+          <w:rFonts w:ascii="Calibri" w:hAnsi="Calibri" w:cs="Calibri"/>
+          <w:lang w:val="en-US"/>
+        </w:rPr>
+        <w:t xml:space="preserve"> with international electrode name</w:t>
+      </w:r>
+      <w:r>
+        <w:rPr>
+          <w:rFonts w:ascii="Calibri" w:hAnsi="Calibri" w:cs="Calibri"/>
+          <w:lang w:val="en-US"/>
+        </w:rPr>
+        <w:t>.</w:t>
+      </w:r>
+      <w:r>
+        <w:rPr>
+          <w:rFonts w:ascii="Calibri" w:hAnsi="Calibri" w:cs="Calibri"/>
+          <w:lang w:val="en-US"/>
+        </w:rPr>
+        <w:t xml:space="preserve"> The file </w:t>
+      </w:r>
+      <w:r>
+        <w:rPr>
+          <w:rFonts w:ascii="Calibri" w:hAnsi="Calibri" w:cs="Calibri"/>
+          <w:lang w:val="en-US"/>
+        </w:rPr>
+        <w:t>Biosemi64_Spherical_Name_AB.locs</w:t>
+      </w:r>
+      <w:r>
+        <w:rPr>
+          <w:rFonts w:ascii="Calibri" w:hAnsi="Calibri" w:cs="Calibri"/>
+          <w:lang w:val="en-US"/>
+        </w:rPr>
+        <w:t xml:space="preserve"> is the same as the before but in EEGLAB format and with Biosemi electrode name (AB)</w:t>
+      </w:r>
+      <w:r>
+        <w:rPr>
+          <w:rFonts w:ascii="Calibri" w:hAnsi="Calibri" w:cs="Calibri"/>
+          <w:lang w:val="en-US"/>
+        </w:rPr>
+        <w:t xml:space="preserve"> The file </w:t>
       </w:r>
       <w:r>
         <w:rPr>
@@ -4001,6 +2694,36 @@
           <w:iCs/>
           <w:lang w:val="en-US"/>
         </w:rPr>
+        <w:t>Biosemi64_Spherical_Name_AB.locs</w:t>
+      </w:r>
+      <w:r>
+        <w:rPr>
+          <w:rFonts w:ascii="Calibri" w:hAnsi="Calibri" w:cs="Calibri"/>
+          <w:lang w:val="en-US"/>
+        </w:rPr>
+        <w:t xml:space="preserve"> is an oval distribution of the electrodes after coregistration with the MNI template in Cartool (more physiologically accurate)</w:t>
+      </w:r>
+      <w:r>
+        <w:rPr>
+          <w:rFonts w:ascii="Calibri" w:hAnsi="Calibri" w:cs="Calibri"/>
+          <w:lang w:val="en-US"/>
+        </w:rPr>
+        <w:t xml:space="preserve"> with Biosemi electrode name (AB)</w:t>
+      </w:r>
+      <w:r>
+        <w:rPr>
+          <w:rFonts w:ascii="Calibri" w:hAnsi="Calibri" w:cs="Calibri"/>
+          <w:lang w:val="en-US"/>
+        </w:rPr>
+        <w:t xml:space="preserve">. </w:t>
+      </w:r>
+      <w:r>
+        <w:rPr>
+          <w:rFonts w:ascii="Calibri" w:hAnsi="Calibri" w:cs="Calibri"/>
+          <w:i/>
+          <w:iCs/>
+          <w:lang w:val="en-US"/>
+        </w:rPr>
         <w:t>BrainVision64elec.locs</w:t>
       </w:r>
       <w:r>
@@ -4008,23 +2731,7 @@
           <w:rFonts w:ascii="Calibri" w:hAnsi="Calibri" w:cs="Calibri"/>
           <w:lang w:val="en-US"/>
         </w:rPr>
-        <w:t xml:space="preserve"> contain a 64 configuration with a </w:t>
-      </w:r>
-      <w:proofErr w:type="spellStart"/>
-      <w:r>
-        <w:rPr>
-          <w:rFonts w:ascii="Calibri" w:hAnsi="Calibri" w:cs="Calibri"/>
-          <w:lang w:val="en-US"/>
-        </w:rPr>
-        <w:t>BrainVision</w:t>
-      </w:r>
-      <w:proofErr w:type="spellEnd"/>
-      <w:r>
-        <w:rPr>
-          <w:rFonts w:ascii="Calibri" w:hAnsi="Calibri" w:cs="Calibri"/>
-          <w:lang w:val="en-US"/>
-        </w:rPr>
-        <w:t xml:space="preserve"> system.</w:t>
+        <w:t xml:space="preserve"> contain a 64 configuration with a BrainVision system.</w:t>
       </w:r>
       <w:r>
         <w:rPr>
@@ -4039,23 +2746,7 @@
           <w:lang w:val="en-US"/>
         </w:rPr>
         <w:br/>
-        <w:t xml:space="preserve">You can add your own coordinate file directly in the Resource sub-folder of </w:t>
-      </w:r>
-      <w:proofErr w:type="spellStart"/>
-      <w:r>
-        <w:rPr>
-          <w:rFonts w:ascii="Calibri" w:hAnsi="Calibri" w:cs="Calibri"/>
-          <w:lang w:val="en-US"/>
-        </w:rPr>
-        <w:t>EEGpal</w:t>
-      </w:r>
-      <w:proofErr w:type="spellEnd"/>
-      <w:r>
-        <w:rPr>
-          <w:rFonts w:ascii="Calibri" w:hAnsi="Calibri" w:cs="Calibri"/>
-          <w:lang w:val="en-US"/>
-        </w:rPr>
-        <w:t xml:space="preserve"> to gain time.</w:t>
+        <w:t>You can add your own coordinate file directly in the Resource sub-folder of EEGpal to gain time.</w:t>
       </w:r>
     </w:p>
     <w:p>
@@ -4177,7 +2868,15 @@
           <w:rFonts w:ascii="Calibri" w:hAnsi="Calibri" w:cs="Calibri"/>
           <w:lang w:val="en-US"/>
         </w:rPr>
-        <w:t xml:space="preserve"> channels to the table on the right. Make sure that these new electrodes are deselected (the default setting) so that they are ignored/deleted (and not interpolated) in the analysis. </w:t>
+        <w:t xml:space="preserve"> channels to the table on the right. </w:t>
+      </w:r>
+      <w:r>
+        <w:rPr>
+          <w:rFonts w:ascii="Calibri" w:hAnsi="Calibri" w:cs="Calibri"/>
+          <w:lang w:val="en-US"/>
+        </w:rPr>
+        <w:lastRenderedPageBreak/>
+        <w:t xml:space="preserve">Make sure that these new electrodes are deselected (the default setting) so that they are ignored/deleted (and not interpolated) in the analysis. </w:t>
       </w:r>
     </w:p>
     <w:p>
@@ -4214,7 +2913,6 @@
           <w:rFonts w:ascii="Calibri" w:hAnsi="Calibri" w:cs="Calibri"/>
           <w:lang w:val="en-US"/>
         </w:rPr>
-        <w:lastRenderedPageBreak/>
         <w:t xml:space="preserve">Export </w:t>
       </w:r>
       <w:r>
@@ -4264,7 +2962,7 @@
                     <pic:cNvPicPr/>
                   </pic:nvPicPr>
                   <pic:blipFill>
-                    <a:blip r:embed="rId17"/>
+                    <a:blip r:embed="rId18"/>
                     <a:stretch>
                       <a:fillRect/>
                     </a:stretch>
@@ -4303,103 +3001,7 @@
           <w:rFonts w:ascii="Calibri" w:hAnsi="Calibri" w:cs="Calibri"/>
           <w:lang w:val="en-US"/>
         </w:rPr>
-        <w:t xml:space="preserve">Select the output format </w:t>
-      </w:r>
-      <w:proofErr w:type="gramStart"/>
-      <w:r>
-        <w:rPr>
-          <w:rFonts w:ascii="Calibri" w:hAnsi="Calibri" w:cs="Calibri"/>
-          <w:lang w:val="en-US"/>
-        </w:rPr>
-        <w:t>(.</w:t>
-      </w:r>
-      <w:proofErr w:type="spellStart"/>
-      <w:r>
-        <w:rPr>
-          <w:rFonts w:ascii="Calibri" w:hAnsi="Calibri" w:cs="Calibri"/>
-          <w:lang w:val="en-US"/>
-        </w:rPr>
-        <w:t>sef</w:t>
-      </w:r>
-      <w:proofErr w:type="spellEnd"/>
-      <w:r>
-        <w:rPr>
-          <w:rFonts w:ascii="Calibri" w:hAnsi="Calibri" w:cs="Calibri"/>
-          <w:lang w:val="en-US"/>
-        </w:rPr>
-        <w:t>, .</w:t>
-      </w:r>
-      <w:proofErr w:type="spellStart"/>
-      <w:r>
-        <w:rPr>
-          <w:rFonts w:ascii="Calibri" w:hAnsi="Calibri" w:cs="Calibri"/>
-          <w:lang w:val="en-US"/>
-        </w:rPr>
-        <w:t>eph</w:t>
-      </w:r>
-      <w:proofErr w:type="spellEnd"/>
-      <w:r>
-        <w:rPr>
-          <w:rFonts w:ascii="Calibri" w:hAnsi="Calibri" w:cs="Calibri"/>
-          <w:lang w:val="en-US"/>
-        </w:rPr>
-        <w:t>, .ep</w:t>
-      </w:r>
-      <w:proofErr w:type="gramEnd"/>
-      <w:r>
-        <w:rPr>
-          <w:rFonts w:ascii="Calibri" w:hAnsi="Calibri" w:cs="Calibri"/>
-          <w:lang w:val="en-US"/>
-        </w:rPr>
-        <w:t xml:space="preserve"> for </w:t>
-      </w:r>
-      <w:proofErr w:type="spellStart"/>
-      <w:r>
-        <w:rPr>
-          <w:rFonts w:ascii="Calibri" w:hAnsi="Calibri" w:cs="Calibri"/>
-          <w:lang w:val="en-US"/>
-        </w:rPr>
-        <w:t>Cartool</w:t>
-      </w:r>
-      <w:proofErr w:type="spellEnd"/>
-      <w:r>
-        <w:rPr>
-          <w:rFonts w:ascii="Calibri" w:hAnsi="Calibri" w:cs="Calibri"/>
-          <w:lang w:val="en-US"/>
-        </w:rPr>
-        <w:t xml:space="preserve"> </w:t>
-      </w:r>
-      <w:proofErr w:type="gramStart"/>
-      <w:r>
-        <w:rPr>
-          <w:rFonts w:ascii="Calibri" w:hAnsi="Calibri" w:cs="Calibri"/>
-          <w:lang w:val="en-US"/>
-        </w:rPr>
-        <w:t>or .set</w:t>
-      </w:r>
-      <w:proofErr w:type="gramEnd"/>
-      <w:r>
-        <w:rPr>
-          <w:rFonts w:ascii="Calibri" w:hAnsi="Calibri" w:cs="Calibri"/>
-          <w:lang w:val="en-US"/>
-        </w:rPr>
-        <w:t xml:space="preserve"> for </w:t>
-      </w:r>
-      <w:proofErr w:type="spellStart"/>
-      <w:r>
-        <w:rPr>
-          <w:rFonts w:ascii="Calibri" w:hAnsi="Calibri" w:cs="Calibri"/>
-          <w:lang w:val="en-US"/>
-        </w:rPr>
-        <w:t>eeglab</w:t>
-      </w:r>
-      <w:proofErr w:type="spellEnd"/>
-      <w:r>
-        <w:rPr>
-          <w:rFonts w:ascii="Calibri" w:hAnsi="Calibri" w:cs="Calibri"/>
-          <w:lang w:val="en-US"/>
-        </w:rPr>
-        <w:t>)</w:t>
+        <w:t>Select the output format (.sef, .eph, .ep for Cartool or .set for eeglab)</w:t>
       </w:r>
     </w:p>
     <w:p>
@@ -4507,7 +3109,7 @@
                     <pic:cNvPicPr/>
                   </pic:nvPicPr>
                   <pic:blipFill>
-                    <a:blip r:embed="rId18"/>
+                    <a:blip r:embed="rId19"/>
                     <a:stretch>
                       <a:fillRect/>
                     </a:stretch>
@@ -4542,41 +3144,7 @@
           <w:rFonts w:ascii="Calibri" w:hAnsi="Calibri" w:cs="Calibri"/>
           <w:lang w:val="en-US"/>
         </w:rPr>
-        <w:t xml:space="preserve">The first preprocessing step is to detect any bridges (where two or more electrodes are connected due to gel leakage, resulting in them recording the same signal). It is </w:t>
-      </w:r>
-      <w:proofErr w:type="spellStart"/>
-      <w:proofErr w:type="gramStart"/>
-      <w:r>
-        <w:rPr>
-          <w:rFonts w:ascii="Calibri" w:hAnsi="Calibri" w:cs="Calibri"/>
-          <w:lang w:val="en-US"/>
-        </w:rPr>
-        <w:t>specially</w:t>
-      </w:r>
-      <w:proofErr w:type="spellEnd"/>
-      <w:proofErr w:type="gramEnd"/>
-      <w:r>
-        <w:rPr>
-          <w:rFonts w:ascii="Calibri" w:hAnsi="Calibri" w:cs="Calibri"/>
-          <w:lang w:val="en-US"/>
-        </w:rPr>
-        <w:t xml:space="preserve"> important to detect and remove </w:t>
-      </w:r>
-      <w:proofErr w:type="gramStart"/>
-      <w:r>
-        <w:rPr>
-          <w:rFonts w:ascii="Calibri" w:hAnsi="Calibri" w:cs="Calibri"/>
-          <w:lang w:val="en-US"/>
-        </w:rPr>
-        <w:t>these bridge</w:t>
-      </w:r>
-      <w:proofErr w:type="gramEnd"/>
-      <w:r>
-        <w:rPr>
-          <w:rFonts w:ascii="Calibri" w:hAnsi="Calibri" w:cs="Calibri"/>
-          <w:lang w:val="en-US"/>
-        </w:rPr>
-        <w:t xml:space="preserve"> if you perform ICA decomposition or Inverse solution analysis. </w:t>
+        <w:t xml:space="preserve">The first preprocessing step is to detect any bridges (where two or more electrodes are connected due to gel leakage, resulting in them recording the same signal). It is specially important to detect and remove these bridge if you perform ICA decomposition or Inverse solution analysis. </w:t>
       </w:r>
     </w:p>
     <w:p>
@@ -4616,33 +3184,29 @@
           <w:rFonts w:ascii="Calibri" w:hAnsi="Calibri" w:cs="Calibri"/>
           <w:lang w:val="en-US"/>
         </w:rPr>
-        <w:t xml:space="preserve">module calls the </w:t>
-      </w:r>
-      <w:proofErr w:type="spellStart"/>
-      <w:r>
-        <w:rPr>
-          <w:rFonts w:ascii="Calibri" w:hAnsi="Calibri" w:cs="Calibri"/>
-          <w:lang w:val="en-US"/>
-        </w:rPr>
-        <w:t>eeglab</w:t>
-      </w:r>
-      <w:proofErr w:type="spellEnd"/>
-      <w:r>
-        <w:rPr>
-          <w:rFonts w:ascii="Calibri" w:hAnsi="Calibri" w:cs="Calibri"/>
-          <w:lang w:val="en-US"/>
-        </w:rPr>
-        <w:t xml:space="preserve"> script </w:t>
-      </w:r>
-      <w:proofErr w:type="spellStart"/>
-      <w:r>
-        <w:rPr>
-          <w:rFonts w:ascii="Calibri" w:hAnsi="Calibri" w:cs="Calibri"/>
-          <w:lang w:val="en-US"/>
-        </w:rPr>
-        <w:t>eBridge</w:t>
-      </w:r>
-      <w:proofErr w:type="spellEnd"/>
+        <w:t xml:space="preserve">module calls the eeglab script eBridge </w:t>
+      </w:r>
+      <w:r>
+        <w:rPr>
+          <w:rFonts w:ascii="Calibri" w:hAnsi="Calibri" w:cs="Calibri"/>
+          <w:lang w:val="en-US"/>
+        </w:rPr>
+        <w:t xml:space="preserve">(Alschuler et al (2014). Clin Neurophysiol, 125(3), 484-490.) </w:t>
+      </w:r>
+      <w:r>
+        <w:rPr>
+          <w:rFonts w:ascii="Calibri" w:hAnsi="Calibri" w:cs="Calibri"/>
+          <w:lang w:val="en-US"/>
+        </w:rPr>
+        <w:t xml:space="preserve">which automatically </w:t>
+      </w:r>
+      <w:r>
+        <w:rPr>
+          <w:rFonts w:ascii="Calibri" w:hAnsi="Calibri" w:cs="Calibri"/>
+          <w:lang w:val="en-US"/>
+        </w:rPr>
+        <w:t>detects</w:t>
+      </w:r>
       <w:r>
         <w:rPr>
           <w:rFonts w:ascii="Calibri" w:hAnsi="Calibri" w:cs="Calibri"/>
@@ -4655,50 +3219,6 @@
           <w:rFonts w:ascii="Calibri" w:hAnsi="Calibri" w:cs="Calibri"/>
           <w:lang w:val="en-US"/>
         </w:rPr>
-        <w:t xml:space="preserve">(Alschuler et al (2014). Clin </w:t>
-      </w:r>
-      <w:proofErr w:type="spellStart"/>
-      <w:r>
-        <w:rPr>
-          <w:rFonts w:ascii="Calibri" w:hAnsi="Calibri" w:cs="Calibri"/>
-          <w:lang w:val="en-US"/>
-        </w:rPr>
-        <w:t>Neurophysiol</w:t>
-      </w:r>
-      <w:proofErr w:type="spellEnd"/>
-      <w:r>
-        <w:rPr>
-          <w:rFonts w:ascii="Calibri" w:hAnsi="Calibri" w:cs="Calibri"/>
-          <w:lang w:val="en-US"/>
-        </w:rPr>
-        <w:t xml:space="preserve">, 125(3), 484-490.) </w:t>
-      </w:r>
-      <w:r>
-        <w:rPr>
-          <w:rFonts w:ascii="Calibri" w:hAnsi="Calibri" w:cs="Calibri"/>
-          <w:lang w:val="en-US"/>
-        </w:rPr>
-        <w:t xml:space="preserve">which automatically </w:t>
-      </w:r>
-      <w:r>
-        <w:rPr>
-          <w:rFonts w:ascii="Calibri" w:hAnsi="Calibri" w:cs="Calibri"/>
-          <w:lang w:val="en-US"/>
-        </w:rPr>
-        <w:t>detects</w:t>
-      </w:r>
-      <w:r>
-        <w:rPr>
-          <w:rFonts w:ascii="Calibri" w:hAnsi="Calibri" w:cs="Calibri"/>
-          <w:lang w:val="en-US"/>
-        </w:rPr>
-        <w:t xml:space="preserve"> </w:t>
-      </w:r>
-      <w:r>
-        <w:rPr>
-          <w:rFonts w:ascii="Calibri" w:hAnsi="Calibri" w:cs="Calibri"/>
-          <w:lang w:val="en-US"/>
-        </w:rPr>
         <w:t>them</w:t>
       </w:r>
       <w:r>
@@ -4713,46 +3233,14 @@
           <w:rFonts w:ascii="Calibri" w:hAnsi="Calibri" w:cs="Calibri"/>
           <w:lang w:val="en-US"/>
         </w:rPr>
-        <w:t xml:space="preserve">The module will save </w:t>
-      </w:r>
-      <w:proofErr w:type="gramStart"/>
-      <w:r>
-        <w:rPr>
-          <w:rFonts w:ascii="Calibri" w:hAnsi="Calibri" w:cs="Calibri"/>
-          <w:lang w:val="en-US"/>
-        </w:rPr>
-        <w:t>a</w:t>
-      </w:r>
-      <w:proofErr w:type="gramEnd"/>
-      <w:r>
-        <w:rPr>
-          <w:rFonts w:ascii="Calibri" w:hAnsi="Calibri" w:cs="Calibri"/>
-          <w:lang w:val="en-US"/>
-        </w:rPr>
-        <w:t xml:space="preserve"> Excel </w:t>
-      </w:r>
-      <w:proofErr w:type="gramStart"/>
-      <w:r>
-        <w:rPr>
-          <w:rFonts w:ascii="Calibri" w:hAnsi="Calibri" w:cs="Calibri"/>
-          <w:lang w:val="en-US"/>
-        </w:rPr>
-        <w:t xml:space="preserve">sheet </w:t>
-      </w:r>
-      <w:r>
-        <w:rPr>
-          <w:rFonts w:ascii="Calibri" w:hAnsi="Calibri" w:cs="Calibri"/>
-          <w:lang w:val="en-US"/>
-        </w:rPr>
-        <w:t>(.</w:t>
-      </w:r>
-      <w:proofErr w:type="gramEnd"/>
-      <w:r>
-        <w:rPr>
-          <w:rFonts w:ascii="Calibri" w:hAnsi="Calibri" w:cs="Calibri"/>
-          <w:lang w:val="en-US"/>
-        </w:rPr>
-        <w:t xml:space="preserve">xlsx) </w:t>
+        <w:t xml:space="preserve">The module will save a Excel sheet </w:t>
+      </w:r>
+      <w:r>
+        <w:rPr>
+          <w:rFonts w:ascii="Calibri" w:hAnsi="Calibri" w:cs="Calibri"/>
+          <w:lang w:val="en-US"/>
+        </w:rPr>
+        <w:t xml:space="preserve">(.xlsx) </w:t>
       </w:r>
       <w:r>
         <w:rPr>
@@ -4847,7 +3335,7 @@
                     <pic:cNvPicPr/>
                   </pic:nvPicPr>
                   <pic:blipFill>
-                    <a:blip r:embed="rId19"/>
+                    <a:blip r:embed="rId20"/>
                     <a:stretch>
                       <a:fillRect/>
                     </a:stretch>
@@ -4882,21 +3370,12 @@
           <w:lang w:val="en-US"/>
         </w:rPr>
       </w:pPr>
-      <w:proofErr w:type="spellStart"/>
-      <w:r>
-        <w:rPr>
-          <w:rFonts w:ascii="Calibri" w:hAnsi="Calibri" w:cs="Calibri"/>
-          <w:lang w:val="en-US"/>
-        </w:rPr>
-        <w:t>EEGpal</w:t>
-      </w:r>
-      <w:proofErr w:type="spellEnd"/>
-      <w:r>
-        <w:rPr>
-          <w:rFonts w:ascii="Calibri" w:hAnsi="Calibri" w:cs="Calibri"/>
-          <w:lang w:val="en-US"/>
-        </w:rPr>
-        <w:t xml:space="preserve"> is a program that is easy to use, and these manuals will help new users to learn how to use it. They also provide information about the background knowledge required for using the program.</w:t>
+      <w:r>
+        <w:rPr>
+          <w:rFonts w:ascii="Calibri" w:hAnsi="Calibri" w:cs="Calibri"/>
+          <w:lang w:val="en-US"/>
+        </w:rPr>
+        <w:t>EEGpal is a program that is easy to use, and these manuals will help new users to learn how to use it. They also provide information about the background knowledge required for using the program.</w:t>
       </w:r>
     </w:p>
     <w:p>
@@ -4965,7 +3444,7 @@
                     <pic:cNvPicPr/>
                   </pic:nvPicPr>
                   <pic:blipFill>
-                    <a:blip r:embed="rId20"/>
+                    <a:blip r:embed="rId21"/>
                     <a:stretch>
                       <a:fillRect/>
                     </a:stretch>
@@ -4998,39 +3477,7 @@
           <w:rFonts w:ascii="Calibri" w:hAnsi="Calibri" w:cs="Calibri"/>
           <w:lang w:val="en-US"/>
         </w:rPr>
-        <w:t xml:space="preserve">The Processing/Analysis parameter plays an important role in how </w:t>
-      </w:r>
-      <w:proofErr w:type="spellStart"/>
-      <w:r>
-        <w:rPr>
-          <w:rFonts w:ascii="Calibri" w:hAnsi="Calibri" w:cs="Calibri"/>
-          <w:lang w:val="en-US"/>
-        </w:rPr>
-        <w:t>EEGpal</w:t>
-      </w:r>
-      <w:proofErr w:type="spellEnd"/>
-      <w:r>
-        <w:rPr>
-          <w:rFonts w:ascii="Calibri" w:hAnsi="Calibri" w:cs="Calibri"/>
-          <w:lang w:val="en-US"/>
-        </w:rPr>
-        <w:t xml:space="preserve"> functions. It stores all the parameters that you </w:t>
-      </w:r>
-      <w:proofErr w:type="gramStart"/>
-      <w:r>
-        <w:rPr>
-          <w:rFonts w:ascii="Calibri" w:hAnsi="Calibri" w:cs="Calibri"/>
-          <w:lang w:val="en-US"/>
-        </w:rPr>
-        <w:t>enter into</w:t>
-      </w:r>
-      <w:proofErr w:type="gramEnd"/>
-      <w:r>
-        <w:rPr>
-          <w:rFonts w:ascii="Calibri" w:hAnsi="Calibri" w:cs="Calibri"/>
-          <w:lang w:val="en-US"/>
-        </w:rPr>
-        <w:t xml:space="preserve"> the various processing and analysis modules. When you open a module and set the processing parameters (for example, adding a notch filter at 50 Hz in the Filtering+ module), clicking the </w:t>
+        <w:t xml:space="preserve">The Processing/Analysis parameter plays an important role in how EEGpal functions. It stores all the parameters that you enter into the various processing and analysis modules. When you open a module and set the processing parameters (for example, adding a notch filter at 50 Hz in the Filtering+ module), clicking the </w:t>
       </w:r>
       <w:r>
         <w:rPr>
@@ -5060,23 +3507,7 @@
           <w:rFonts w:ascii="Calibri" w:hAnsi="Calibri" w:cs="Calibri"/>
           <w:lang w:val="en-US"/>
         </w:rPr>
-        <w:t xml:space="preserve">1) will save the changes to the parameter file in the main window. This means that when you open the Filtering+ module again, it will be restored to the exact state it was in when you left it. This is useful for restoring all your processing choices when you open </w:t>
-      </w:r>
-      <w:proofErr w:type="spellStart"/>
-      <w:r>
-        <w:rPr>
-          <w:rFonts w:ascii="Calibri" w:hAnsi="Calibri" w:cs="Calibri"/>
-          <w:lang w:val="en-US"/>
-        </w:rPr>
-        <w:t>EEGpal</w:t>
-      </w:r>
-      <w:proofErr w:type="spellEnd"/>
-      <w:r>
-        <w:rPr>
-          <w:rFonts w:ascii="Calibri" w:hAnsi="Calibri" w:cs="Calibri"/>
-          <w:lang w:val="en-US"/>
-        </w:rPr>
-        <w:t xml:space="preserve"> again later.</w:t>
+        <w:t>1) will save the changes to the parameter file in the main window. This means that when you open the Filtering+ module again, it will be restored to the exact state it was in when you left it. This is useful for restoring all your processing choices when you open EEGpal again later.</w:t>
       </w:r>
       <w:r>
         <w:rPr>
@@ -5163,7 +3594,6 @@
         </w:rPr>
         <w:t xml:space="preserve"> button. Click this to transfer your chosen parameters to the </w:t>
       </w:r>
-      <w:proofErr w:type="spellStart"/>
       <w:r>
         <w:rPr>
           <w:rFonts w:ascii="Calibri" w:hAnsi="Calibri" w:cs="Calibri"/>
@@ -5173,29 +3603,12 @@
         </w:rPr>
         <w:t>SessionParameters</w:t>
       </w:r>
-      <w:proofErr w:type="spellEnd"/>
-      <w:r>
-        <w:rPr>
-          <w:rFonts w:ascii="Calibri" w:hAnsi="Calibri" w:cs="Calibri"/>
-          <w:lang w:val="en-US"/>
-        </w:rPr>
-        <w:t xml:space="preserve"> variable in the </w:t>
-      </w:r>
-      <w:proofErr w:type="spellStart"/>
-      <w:r>
-        <w:rPr>
-          <w:rFonts w:ascii="Calibri" w:hAnsi="Calibri" w:cs="Calibri"/>
-          <w:lang w:val="en-US"/>
-        </w:rPr>
-        <w:t>EEGpal</w:t>
-      </w:r>
-      <w:proofErr w:type="spellEnd"/>
-      <w:r>
-        <w:rPr>
-          <w:rFonts w:ascii="Calibri" w:hAnsi="Calibri" w:cs="Calibri"/>
-          <w:lang w:val="en-US"/>
-        </w:rPr>
-        <w:t xml:space="preserve"> main window. Please note that selecting the </w:t>
+      <w:r>
+        <w:rPr>
+          <w:rFonts w:ascii="Calibri" w:hAnsi="Calibri" w:cs="Calibri"/>
+          <w:lang w:val="en-US"/>
+        </w:rPr>
+        <w:t xml:space="preserve"> variable in the EEGpal main window. Please note that selecting the </w:t>
       </w:r>
       <w:r>
         <w:rPr>
@@ -5463,23 +3876,7 @@
           <w:rFonts w:ascii="Calibri" w:hAnsi="Calibri" w:cs="Calibri"/>
           <w:lang w:val="en-US"/>
         </w:rPr>
-        <w:t xml:space="preserve">The small tick mark displayed behind the button indicates whether </w:t>
-      </w:r>
-      <w:proofErr w:type="spellStart"/>
-      <w:r>
-        <w:rPr>
-          <w:rFonts w:ascii="Calibri" w:hAnsi="Calibri" w:cs="Calibri"/>
-          <w:lang w:val="en-US"/>
-        </w:rPr>
-        <w:t>EEGpal</w:t>
-      </w:r>
-      <w:proofErr w:type="spellEnd"/>
-      <w:r>
-        <w:rPr>
-          <w:rFonts w:ascii="Calibri" w:hAnsi="Calibri" w:cs="Calibri"/>
-          <w:lang w:val="en-US"/>
-        </w:rPr>
-        <w:t xml:space="preserve"> is currently processing a batch.</w:t>
+        <w:t>The small tick mark displayed behind the button indicates whether EEGpal is currently processing a batch.</w:t>
       </w:r>
       <w:r>
         <w:rPr>
@@ -5575,23 +3972,7 @@
           <w:rFonts w:ascii="Calibri" w:hAnsi="Calibri" w:cs="Calibri"/>
           <w:lang w:val="en-US"/>
         </w:rPr>
-        <w:t xml:space="preserve">In this document, we distinguish the preprocessing, which permits to clean the data for the data analysis (the processing). The preprocessing is similar between the </w:t>
-      </w:r>
-      <w:proofErr w:type="gramStart"/>
-      <w:r>
-        <w:rPr>
-          <w:rFonts w:ascii="Calibri" w:hAnsi="Calibri" w:cs="Calibri"/>
-          <w:lang w:val="en-US"/>
-        </w:rPr>
-        <w:t>type</w:t>
-      </w:r>
-      <w:proofErr w:type="gramEnd"/>
-      <w:r>
-        <w:rPr>
-          <w:rFonts w:ascii="Calibri" w:hAnsi="Calibri" w:cs="Calibri"/>
-          <w:lang w:val="en-US"/>
-        </w:rPr>
-        <w:t xml:space="preserve"> of analysis but with some variation. Here I will first describe the case of Event Related Analysis (ERP). </w:t>
+        <w:t xml:space="preserve">In this document, we distinguish the preprocessing, which permits to clean the data for the data analysis (the processing). The preprocessing is similar between the type of analysis but with some variation. Here I will first describe the case of Event Related Analysis (ERP). </w:t>
       </w:r>
       <w:r>
         <w:rPr>
@@ -5638,23 +4019,7 @@
           <w:rFonts w:ascii="Calibri" w:hAnsi="Calibri" w:cs="Calibri"/>
           <w:lang w:val="en-US"/>
         </w:rPr>
-        <w:t xml:space="preserve">Import raw data into the main </w:t>
-      </w:r>
-      <w:proofErr w:type="spellStart"/>
-      <w:r>
-        <w:rPr>
-          <w:rFonts w:ascii="Calibri" w:hAnsi="Calibri" w:cs="Calibri"/>
-          <w:lang w:val="en-US"/>
-        </w:rPr>
-        <w:t>EEGpal</w:t>
-      </w:r>
-      <w:proofErr w:type="spellEnd"/>
-      <w:r>
-        <w:rPr>
-          <w:rFonts w:ascii="Calibri" w:hAnsi="Calibri" w:cs="Calibri"/>
-          <w:lang w:val="en-US"/>
-        </w:rPr>
-        <w:t xml:space="preserve"> windows and identify the subject as explained in the chapter </w:t>
+        <w:t xml:space="preserve">Import raw data into the main EEGpal windows and identify the subject as explained in the chapter </w:t>
       </w:r>
       <w:r>
         <w:rPr>
@@ -5761,16 +4126,7 @@
           <w:rFonts w:ascii="Calibri" w:hAnsi="Calibri" w:cs="Calibri"/>
           <w:lang w:val="en-US"/>
         </w:rPr>
-        <w:t xml:space="preserve">Perform a </w:t>
-      </w:r>
-      <w:r>
-        <w:rPr>
-          <w:rFonts w:ascii="Calibri" w:hAnsi="Calibri" w:cs="Calibri"/>
-          <w:i/>
-          <w:iCs/>
-          <w:lang w:val="en-US"/>
-        </w:rPr>
-        <w:t>Bridge Detection</w:t>
+        <w:t>If you are working with the Biosemi system, EEGLAB and FieldTrip community tend to start by referencing the signal to the Cz electrode. This is because the common mode correction is not perfect (see https://www.fieldtriptoolbox.org/faq/preproc/dataformat/biosemi_reference/ and https://www.biosemi.com/faq/cms&amp;drl.htm). However, this has the consequence of removing one electrode, which must be ignored in ICA decomposition (decreasing the rank). If you use ICA to remove large artefacts, such as those caused by the eyes or muscles, the final results are the same whether or not this initial re-referencing is performed. Biosemi specifies that rereferencing is required, which is always done on the average reference before epoching. Whether or not to add this supplementary reference to Cz is up to you.</w:t>
       </w:r>
       <w:r>
         <w:rPr>
@@ -5779,21 +4135,12 @@
         </w:rPr>
         <w:t xml:space="preserve"> </w:t>
       </w:r>
-      <w:proofErr w:type="gramStart"/>
-      <w:r>
-        <w:rPr>
-          <w:rFonts w:ascii="Calibri" w:hAnsi="Calibri" w:cs="Calibri"/>
-          <w:lang w:val="en-US"/>
-        </w:rPr>
-        <w:t>in order to</w:t>
-      </w:r>
-      <w:proofErr w:type="gramEnd"/>
-      <w:r>
-        <w:rPr>
-          <w:rFonts w:ascii="Calibri" w:hAnsi="Calibri" w:cs="Calibri"/>
-          <w:lang w:val="en-US"/>
-        </w:rPr>
-        <w:t xml:space="preserve"> check if there is any unwanted connection between channels</w:t>
+      <w:r>
+        <w:rPr>
+          <w:rFonts w:ascii="Calibri" w:hAnsi="Calibri" w:cs="Calibri"/>
+          <w:lang w:val="en-US"/>
+        </w:rPr>
+        <w:t xml:space="preserve"> </w:t>
       </w:r>
     </w:p>
     <w:p>
@@ -5813,7 +4160,7 @@
           <w:rFonts w:ascii="Calibri" w:hAnsi="Calibri" w:cs="Calibri"/>
           <w:lang w:val="en-US"/>
         </w:rPr>
-        <w:t xml:space="preserve">Use the module </w:t>
+        <w:t xml:space="preserve">Perform a </w:t>
       </w:r>
       <w:r>
         <w:rPr>
@@ -5822,70 +4169,15 @@
           <w:iCs/>
           <w:lang w:val="en-US"/>
         </w:rPr>
-        <w:t>Filtering</w:t>
-      </w:r>
-      <w:r>
-        <w:rPr>
-          <w:rFonts w:ascii="Calibri" w:hAnsi="Calibri" w:cs="Calibri"/>
-          <w:lang w:val="en-US"/>
-        </w:rPr>
-        <w:t xml:space="preserve"> for the first </w:t>
-      </w:r>
-      <w:proofErr w:type="gramStart"/>
-      <w:r>
-        <w:rPr>
-          <w:rFonts w:ascii="Calibri" w:hAnsi="Calibri" w:cs="Calibri"/>
-          <w:lang w:val="en-US"/>
-        </w:rPr>
-        <w:t>clean</w:t>
-      </w:r>
-      <w:proofErr w:type="gramEnd"/>
-      <w:r>
-        <w:rPr>
-          <w:rFonts w:ascii="Calibri" w:hAnsi="Calibri" w:cs="Calibri"/>
-          <w:lang w:val="en-US"/>
-        </w:rPr>
-        <w:t xml:space="preserve"> of the data. Filter to keep the signal between 0.</w:t>
-      </w:r>
-      <w:r>
-        <w:rPr>
-          <w:rFonts w:ascii="Calibri" w:hAnsi="Calibri" w:cs="Calibri"/>
-          <w:lang w:val="en-US"/>
-        </w:rPr>
-        <w:t>5</w:t>
-      </w:r>
-      <w:r>
-        <w:rPr>
-          <w:rFonts w:ascii="Calibri" w:hAnsi="Calibri" w:cs="Calibri"/>
-          <w:lang w:val="en-US"/>
-        </w:rPr>
-        <w:t xml:space="preserve"> and 40 Hz. Add </w:t>
-      </w:r>
-      <w:proofErr w:type="gramStart"/>
-      <w:r>
-        <w:rPr>
-          <w:rFonts w:ascii="Calibri" w:hAnsi="Calibri" w:cs="Calibri"/>
-          <w:lang w:val="en-US"/>
-        </w:rPr>
-        <w:t>a Line</w:t>
-      </w:r>
-      <w:proofErr w:type="gramEnd"/>
-      <w:r>
-        <w:rPr>
-          <w:rFonts w:ascii="Calibri" w:hAnsi="Calibri" w:cs="Calibri"/>
-          <w:lang w:val="en-US"/>
-        </w:rPr>
-        <w:t xml:space="preserve"> noise removal either by a Notch filter at 50 Hz or by using </w:t>
-      </w:r>
-      <w:proofErr w:type="spellStart"/>
-      <w:r>
-        <w:rPr>
-          <w:rFonts w:ascii="Calibri" w:hAnsi="Calibri" w:cs="Calibri"/>
-          <w:lang w:val="en-US"/>
-        </w:rPr>
-        <w:t>cleanline</w:t>
-      </w:r>
-      <w:proofErr w:type="spellEnd"/>
+        <w:t>Bridge Detection</w:t>
+      </w:r>
+      <w:r>
+        <w:rPr>
+          <w:rFonts w:ascii="Calibri" w:hAnsi="Calibri" w:cs="Calibri"/>
+          <w:lang w:val="en-US"/>
+        </w:rPr>
+        <w:t xml:space="preserve"> in order to check if there is any unwanted connection between channels</w:t>
+      </w:r>
     </w:p>
     <w:p>
       <w:pPr>
@@ -5904,65 +4196,37 @@
           <w:rFonts w:ascii="Calibri" w:hAnsi="Calibri" w:cs="Calibri"/>
           <w:lang w:val="en-US"/>
         </w:rPr>
-        <w:t xml:space="preserve">Inspect visually the result file in </w:t>
-      </w:r>
-      <w:proofErr w:type="spellStart"/>
-      <w:r>
-        <w:rPr>
-          <w:rFonts w:ascii="Calibri" w:hAnsi="Calibri" w:cs="Calibri"/>
-          <w:lang w:val="en-US"/>
-        </w:rPr>
-        <w:t>Cartool</w:t>
-      </w:r>
-      <w:proofErr w:type="spellEnd"/>
-      <w:r>
-        <w:rPr>
-          <w:rFonts w:ascii="Calibri" w:hAnsi="Calibri" w:cs="Calibri"/>
-          <w:lang w:val="en-US"/>
-        </w:rPr>
-        <w:t xml:space="preserve"> to check if there </w:t>
-      </w:r>
-      <w:r>
-        <w:rPr>
-          <w:rFonts w:ascii="Calibri" w:hAnsi="Calibri" w:cs="Calibri"/>
-          <w:lang w:val="en-US"/>
-        </w:rPr>
-        <w:t>are</w:t>
-      </w:r>
-      <w:r>
-        <w:rPr>
-          <w:rFonts w:ascii="Calibri" w:hAnsi="Calibri" w:cs="Calibri"/>
-          <w:lang w:val="en-US"/>
-        </w:rPr>
-        <w:t xml:space="preserve"> wrong channels (behave totally </w:t>
-      </w:r>
-      <w:r>
-        <w:rPr>
-          <w:rFonts w:ascii="Calibri" w:hAnsi="Calibri" w:cs="Calibri"/>
-          <w:lang w:val="en-US"/>
-        </w:rPr>
-        <w:t>differently</w:t>
-      </w:r>
-      <w:r>
-        <w:rPr>
-          <w:rFonts w:ascii="Calibri" w:hAnsi="Calibri" w:cs="Calibri"/>
-          <w:lang w:val="en-US"/>
-        </w:rPr>
-        <w:t xml:space="preserve"> as the </w:t>
-      </w:r>
-      <w:r>
-        <w:rPr>
-          <w:rFonts w:ascii="Calibri" w:hAnsi="Calibri" w:cs="Calibri"/>
-          <w:lang w:val="en-US"/>
-        </w:rPr>
-        <w:t>neighbors</w:t>
-      </w:r>
-      <w:r>
-        <w:rPr>
-          <w:rFonts w:ascii="Calibri" w:hAnsi="Calibri" w:cs="Calibri"/>
-          <w:lang w:val="en-US"/>
-        </w:rPr>
-        <w:t xml:space="preserve"> for some time)</w:t>
+        <w:t xml:space="preserve">Use the module </w:t>
+      </w:r>
+      <w:r>
+        <w:rPr>
+          <w:rFonts w:ascii="Calibri" w:hAnsi="Calibri" w:cs="Calibri"/>
+          <w:i/>
+          <w:iCs/>
+          <w:lang w:val="en-US"/>
+        </w:rPr>
+        <w:t>Filtering</w:t>
+      </w:r>
+      <w:r>
+        <w:rPr>
+          <w:rFonts w:ascii="Calibri" w:hAnsi="Calibri" w:cs="Calibri"/>
+          <w:lang w:val="en-US"/>
+        </w:rPr>
+        <w:t xml:space="preserve"> for the first clean of the data. Filter to keep the signal between 0.</w:t>
+      </w:r>
+      <w:r>
+        <w:rPr>
+          <w:rFonts w:ascii="Calibri" w:hAnsi="Calibri" w:cs="Calibri"/>
+          <w:lang w:val="en-US"/>
+        </w:rPr>
+        <w:t>5</w:t>
+      </w:r>
+      <w:r>
+        <w:rPr>
+          <w:rFonts w:ascii="Calibri" w:hAnsi="Calibri" w:cs="Calibri"/>
+          <w:lang w:val="en-US"/>
+        </w:rPr>
+        <w:t xml:space="preserve"> and 40 Hz. Add a Line noise removal either by a Notch filter at 50 Hz or by using cleanline</w:t>
       </w:r>
     </w:p>
     <w:p>
@@ -5982,53 +4246,49 @@
           <w:rFonts w:ascii="Calibri" w:hAnsi="Calibri" w:cs="Calibri"/>
           <w:lang w:val="en-US"/>
         </w:rPr>
-        <w:t xml:space="preserve">Use the </w:t>
-      </w:r>
-      <w:r>
-        <w:rPr>
-          <w:rFonts w:ascii="Calibri" w:hAnsi="Calibri" w:cs="Calibri"/>
-          <w:i/>
-          <w:iCs/>
-          <w:lang w:val="en-US"/>
-        </w:rPr>
-        <w:t>ICA</w:t>
-      </w:r>
-      <w:r>
-        <w:rPr>
-          <w:rFonts w:ascii="Calibri" w:hAnsi="Calibri" w:cs="Calibri"/>
-          <w:lang w:val="en-US"/>
-        </w:rPr>
-        <w:t xml:space="preserve"> module to p</w:t>
-      </w:r>
-      <w:r>
-        <w:rPr>
-          <w:rFonts w:ascii="Calibri" w:hAnsi="Calibri" w:cs="Calibri"/>
-          <w:lang w:val="en-US"/>
-        </w:rPr>
-        <w:t xml:space="preserve">erform an ICA decomposition by ignoring bad channels determine in point 3 and 5. </w:t>
-      </w:r>
-      <w:r>
-        <w:rPr>
-          <w:rFonts w:ascii="Calibri" w:hAnsi="Calibri" w:cs="Calibri"/>
-          <w:lang w:val="en-US"/>
-        </w:rPr>
-        <w:br/>
-        <w:t xml:space="preserve">Inspect manually the 24 first compounds of each file to removed </w:t>
-      </w:r>
-      <w:r>
-        <w:rPr>
-          <w:rFonts w:ascii="Calibri" w:hAnsi="Calibri" w:cs="Calibri"/>
-          <w:lang w:val="en-US"/>
-        </w:rPr>
-        <w:t>compounds link to Eye artefacts</w:t>
-      </w:r>
-      <w:r>
-        <w:rPr>
-          <w:rFonts w:ascii="Calibri" w:hAnsi="Calibri" w:cs="Calibri"/>
-          <w:lang w:val="en-US"/>
-        </w:rPr>
-        <w:br/>
-        <w:t>Recomposed the signal without the previously selected compounds</w:t>
+        <w:t xml:space="preserve">Inspect visually the result file in Cartool to check if there </w:t>
+      </w:r>
+      <w:r>
+        <w:rPr>
+          <w:rFonts w:ascii="Calibri" w:hAnsi="Calibri" w:cs="Calibri"/>
+          <w:lang w:val="en-US"/>
+        </w:rPr>
+        <w:t>are</w:t>
+      </w:r>
+      <w:r>
+        <w:rPr>
+          <w:rFonts w:ascii="Calibri" w:hAnsi="Calibri" w:cs="Calibri"/>
+          <w:lang w:val="en-US"/>
+        </w:rPr>
+        <w:t xml:space="preserve"> wrong channels (behave totally </w:t>
+      </w:r>
+      <w:r>
+        <w:rPr>
+          <w:rFonts w:ascii="Calibri" w:hAnsi="Calibri" w:cs="Calibri"/>
+          <w:lang w:val="en-US"/>
+        </w:rPr>
+        <w:t>differently</w:t>
+      </w:r>
+      <w:r>
+        <w:rPr>
+          <w:rFonts w:ascii="Calibri" w:hAnsi="Calibri" w:cs="Calibri"/>
+          <w:lang w:val="en-US"/>
+        </w:rPr>
+        <w:t xml:space="preserve"> as the </w:t>
+      </w:r>
+      <w:r>
+        <w:rPr>
+          <w:rFonts w:ascii="Calibri" w:hAnsi="Calibri" w:cs="Calibri"/>
+          <w:lang w:val="en-US"/>
+        </w:rPr>
+        <w:t>neighbors</w:t>
+      </w:r>
+      <w:r>
+        <w:rPr>
+          <w:rFonts w:ascii="Calibri" w:hAnsi="Calibri" w:cs="Calibri"/>
+          <w:lang w:val="en-US"/>
+        </w:rPr>
+        <w:t xml:space="preserve"> for some time)</w:t>
       </w:r>
     </w:p>
     <w:p>
@@ -6048,16 +4308,8 @@
           <w:rFonts w:ascii="Calibri" w:hAnsi="Calibri" w:cs="Calibri"/>
           <w:lang w:val="en-US"/>
         </w:rPr>
-        <w:t xml:space="preserve"> </w:t>
-      </w:r>
-      <w:r>
-        <w:rPr>
-          <w:rFonts w:ascii="Calibri" w:hAnsi="Calibri" w:cs="Calibri"/>
-          <w:lang w:val="en-US"/>
-        </w:rPr>
         <w:t xml:space="preserve">Use the </w:t>
       </w:r>
-      <w:proofErr w:type="spellStart"/>
       <w:r>
         <w:rPr>
           <w:rFonts w:ascii="Calibri" w:hAnsi="Calibri" w:cs="Calibri"/>
@@ -6065,47 +4317,44 @@
           <w:iCs/>
           <w:lang w:val="en-US"/>
         </w:rPr>
-        <w:t>Epoching</w:t>
-      </w:r>
-      <w:proofErr w:type="spellEnd"/>
-      <w:r>
-        <w:rPr>
-          <w:rFonts w:ascii="Calibri" w:hAnsi="Calibri" w:cs="Calibri"/>
-          <w:lang w:val="en-US"/>
-        </w:rPr>
-        <w:t xml:space="preserve"> module to perform a temporary </w:t>
-      </w:r>
-      <w:proofErr w:type="spellStart"/>
-      <w:r>
-        <w:rPr>
-          <w:rFonts w:ascii="Calibri" w:hAnsi="Calibri" w:cs="Calibri"/>
-          <w:lang w:val="en-US"/>
-        </w:rPr>
-        <w:t>Epoching</w:t>
-      </w:r>
-      <w:proofErr w:type="spellEnd"/>
-      <w:r>
-        <w:rPr>
-          <w:rFonts w:ascii="Calibri" w:hAnsi="Calibri" w:cs="Calibri"/>
-          <w:lang w:val="en-US"/>
-        </w:rPr>
-        <w:t xml:space="preserve"> and inspects visually in </w:t>
-      </w:r>
-      <w:proofErr w:type="spellStart"/>
-      <w:r>
-        <w:rPr>
-          <w:rFonts w:ascii="Calibri" w:hAnsi="Calibri" w:cs="Calibri"/>
-          <w:lang w:val="en-US"/>
-        </w:rPr>
-        <w:t>Cartool</w:t>
-      </w:r>
-      <w:proofErr w:type="spellEnd"/>
-      <w:r>
-        <w:rPr>
-          <w:rFonts w:ascii="Calibri" w:hAnsi="Calibri" w:cs="Calibri"/>
-          <w:lang w:val="en-US"/>
-        </w:rPr>
-        <w:t xml:space="preserve"> the ERP files. Selected the bad electrodes which negatively impact the ERP to be interpolated</w:t>
+        <w:t>ICA</w:t>
+      </w:r>
+      <w:r>
+        <w:rPr>
+          <w:rFonts w:ascii="Calibri" w:hAnsi="Calibri" w:cs="Calibri"/>
+          <w:lang w:val="en-US"/>
+        </w:rPr>
+        <w:t xml:space="preserve"> module to p</w:t>
+      </w:r>
+      <w:r>
+        <w:rPr>
+          <w:rFonts w:ascii="Calibri" w:hAnsi="Calibri" w:cs="Calibri"/>
+          <w:lang w:val="en-US"/>
+        </w:rPr>
+        <w:t xml:space="preserve">erform an ICA decomposition by ignoring bad channels determine in point 3 and 5. </w:t>
+      </w:r>
+      <w:r>
+        <w:rPr>
+          <w:rFonts w:ascii="Calibri" w:hAnsi="Calibri" w:cs="Calibri"/>
+          <w:lang w:val="en-US"/>
+        </w:rPr>
+        <w:br/>
+        <w:t xml:space="preserve">Inspect manually the 24 first compounds of each file to removed </w:t>
+      </w:r>
+      <w:r>
+        <w:rPr>
+          <w:rFonts w:ascii="Calibri" w:hAnsi="Calibri" w:cs="Calibri"/>
+          <w:lang w:val="en-US"/>
+        </w:rPr>
+        <w:t>compounds link to Eye artefacts</w:t>
+      </w:r>
+      <w:r>
+        <w:rPr>
+          <w:rFonts w:ascii="Calibri" w:hAnsi="Calibri" w:cs="Calibri"/>
+          <w:lang w:val="en-US"/>
+        </w:rPr>
+        <w:br/>
+        <w:t>Recomposed the signal without the previously selected compounds</w:t>
       </w:r>
     </w:p>
     <w:p>
@@ -6125,6 +4374,13 @@
           <w:rFonts w:ascii="Calibri" w:hAnsi="Calibri" w:cs="Calibri"/>
           <w:lang w:val="en-US"/>
         </w:rPr>
+        <w:t xml:space="preserve"> </w:t>
+      </w:r>
+      <w:r>
+        <w:rPr>
+          <w:rFonts w:ascii="Calibri" w:hAnsi="Calibri" w:cs="Calibri"/>
+          <w:lang w:val="en-US"/>
+        </w:rPr>
         <w:t xml:space="preserve">Use the </w:t>
       </w:r>
       <w:r>
@@ -6134,30 +4390,14 @@
           <w:iCs/>
           <w:lang w:val="en-US"/>
         </w:rPr>
-        <w:t>Interpolation</w:t>
-      </w:r>
-      <w:r>
-        <w:rPr>
-          <w:rFonts w:ascii="Calibri" w:hAnsi="Calibri" w:cs="Calibri"/>
-          <w:lang w:val="en-US"/>
-        </w:rPr>
-        <w:t xml:space="preserve"> module to </w:t>
-      </w:r>
-      <w:proofErr w:type="gramStart"/>
-      <w:r>
-        <w:rPr>
-          <w:rFonts w:ascii="Calibri" w:hAnsi="Calibri" w:cs="Calibri"/>
-          <w:lang w:val="en-US"/>
-        </w:rPr>
-        <w:t>interpolated</w:t>
-      </w:r>
-      <w:proofErr w:type="gramEnd"/>
-      <w:r>
-        <w:rPr>
-          <w:rFonts w:ascii="Calibri" w:hAnsi="Calibri" w:cs="Calibri"/>
-          <w:lang w:val="en-US"/>
-        </w:rPr>
-        <w:t xml:space="preserve"> bad electrodes determined in 3,5 and 7.  </w:t>
+        <w:t>Epoching</w:t>
+      </w:r>
+      <w:r>
+        <w:rPr>
+          <w:rFonts w:ascii="Calibri" w:hAnsi="Calibri" w:cs="Calibri"/>
+          <w:lang w:val="en-US"/>
+        </w:rPr>
+        <w:t xml:space="preserve"> module to perform a temporary Epoching and inspects visually in Cartool the ERP files. Selected the bad electrodes which negatively impact the ERP to be interpolated</w:t>
       </w:r>
     </w:p>
     <w:p>
@@ -6186,14 +4426,14 @@
           <w:iCs/>
           <w:lang w:val="en-US"/>
         </w:rPr>
-        <w:t>Refef</w:t>
-      </w:r>
-      <w:r>
-        <w:rPr>
-          <w:rFonts w:ascii="Calibri" w:hAnsi="Calibri" w:cs="Calibri"/>
-          <w:lang w:val="en-US"/>
-        </w:rPr>
-        <w:t xml:space="preserve"> module, to change the reference electrode to the average reference</w:t>
+        <w:t>Interpolation</w:t>
+      </w:r>
+      <w:r>
+        <w:rPr>
+          <w:rFonts w:ascii="Calibri" w:hAnsi="Calibri" w:cs="Calibri"/>
+          <w:lang w:val="en-US"/>
+        </w:rPr>
+        <w:t xml:space="preserve"> module to interpolated bad electrodes determined in 3,5 and 7.  </w:t>
       </w:r>
     </w:p>
     <w:p>
@@ -6215,25 +4455,45 @@
         </w:rPr>
         <w:t xml:space="preserve">Use the </w:t>
       </w:r>
-      <w:proofErr w:type="spellStart"/>
-      <w:r>
-        <w:rPr>
-          <w:rFonts w:ascii="Calibri" w:hAnsi="Calibri" w:cs="Calibri"/>
-          <w:lang w:val="en-US"/>
-        </w:rPr>
-        <w:t>Epoching</w:t>
-      </w:r>
-      <w:proofErr w:type="spellEnd"/>
-      <w:r>
-        <w:rPr>
-          <w:rFonts w:ascii="Calibri" w:hAnsi="Calibri" w:cs="Calibri"/>
-          <w:lang w:val="en-US"/>
-        </w:rPr>
-        <w:t xml:space="preserve"> module to compute the final ERPs</w:t>
+      <w:r>
+        <w:rPr>
+          <w:rFonts w:ascii="Calibri" w:hAnsi="Calibri" w:cs="Calibri"/>
+          <w:i/>
+          <w:iCs/>
+          <w:lang w:val="en-US"/>
+        </w:rPr>
+        <w:t>Refef</w:t>
+      </w:r>
+      <w:r>
+        <w:rPr>
+          <w:rFonts w:ascii="Calibri" w:hAnsi="Calibri" w:cs="Calibri"/>
+          <w:lang w:val="en-US"/>
+        </w:rPr>
+        <w:t xml:space="preserve"> module, to change the reference electrode to the average reference</w:t>
+      </w:r>
+    </w:p>
+    <w:p>
+      <w:pPr>
+        <w:pStyle w:val="ListParagraph"/>
+        <w:numPr>
+          <w:ilvl w:val="0"/>
+          <w:numId w:val="12"/>
+        </w:numPr>
+        <w:rPr>
+          <w:rFonts w:ascii="Calibri" w:hAnsi="Calibri" w:cs="Calibri"/>
+          <w:lang w:val="en-US"/>
+        </w:rPr>
+      </w:pPr>
+      <w:r>
+        <w:rPr>
+          <w:rFonts w:ascii="Calibri" w:hAnsi="Calibri" w:cs="Calibri"/>
+          <w:lang w:val="en-US"/>
+        </w:rPr>
+        <w:t>Use the Epoching module to compute the final ERPs</w:t>
       </w:r>
     </w:p>
     <w:sectPr>
-      <w:footerReference w:type="default" r:id="rId21"/>
+      <w:footerReference w:type="default" r:id="rId22"/>
       <w:pgSz w:w="11906" w:h="16838"/>
       <w:pgMar w:top="1417" w:right="1417" w:bottom="1417" w:left="1417" w:header="708" w:footer="708" w:gutter="0"/>
       <w:cols w:space="708"/>

</xml_diff>

<commit_message>
lillte modification to the main manual
</commit_message>
<xml_diff>
--- a/Manuels/Manuel_EEGpal_Main.docx
+++ b/Manuels/Manuel_EEGpal_Main.docx
@@ -74,6 +74,7 @@
           </wp:anchor>
         </w:drawing>
       </w:r>
+      <w:proofErr w:type="spellStart"/>
       <w:r>
         <w:rPr>
           <w:rFonts w:ascii="Calibri" w:hAnsi="Calibri" w:cs="Calibri"/>
@@ -83,6 +84,7 @@
         </w:rPr>
         <w:t>EEGpal</w:t>
       </w:r>
+      <w:proofErr w:type="spellEnd"/>
       <w:r>
         <w:rPr>
           <w:rFonts w:ascii="Calibri" w:hAnsi="Calibri" w:cs="Calibri"/>
@@ -253,7 +255,23 @@
           <w:rFonts w:ascii="Calibri" w:hAnsi="Calibri" w:cs="Calibri"/>
           <w:lang w:val="en-US"/>
         </w:rPr>
-        <w:t>The EEGpal toolbox is developed by Michael DePretto (</w:t>
+        <w:t xml:space="preserve">The </w:t>
+      </w:r>
+      <w:proofErr w:type="spellStart"/>
+      <w:r>
+        <w:rPr>
+          <w:rFonts w:ascii="Calibri" w:hAnsi="Calibri" w:cs="Calibri"/>
+          <w:lang w:val="en-US"/>
+        </w:rPr>
+        <w:t>EEGpal</w:t>
+      </w:r>
+      <w:proofErr w:type="spellEnd"/>
+      <w:r>
+        <w:rPr>
+          <w:rFonts w:ascii="Calibri" w:hAnsi="Calibri" w:cs="Calibri"/>
+          <w:lang w:val="en-US"/>
+        </w:rPr>
+        <w:t xml:space="preserve"> toolbox is developed by Michael DePretto (</w:t>
       </w:r>
       <w:r>
         <w:rPr>
@@ -319,12 +337,21 @@
           <w:lang w:val="en-US"/>
         </w:rPr>
       </w:pPr>
-      <w:r>
-        <w:rPr>
-          <w:rFonts w:ascii="Calibri" w:hAnsi="Calibri" w:cs="Calibri"/>
-          <w:lang w:val="en-US"/>
-        </w:rPr>
-        <w:t xml:space="preserve">EEGpal is </w:t>
+      <w:proofErr w:type="spellStart"/>
+      <w:r>
+        <w:rPr>
+          <w:rFonts w:ascii="Calibri" w:hAnsi="Calibri" w:cs="Calibri"/>
+          <w:lang w:val="en-US"/>
+        </w:rPr>
+        <w:t>EEGpal</w:t>
+      </w:r>
+      <w:proofErr w:type="spellEnd"/>
+      <w:r>
+        <w:rPr>
+          <w:rFonts w:ascii="Calibri" w:hAnsi="Calibri" w:cs="Calibri"/>
+          <w:lang w:val="en-US"/>
+        </w:rPr>
+        <w:t xml:space="preserve"> is </w:t>
       </w:r>
       <w:proofErr w:type="gramStart"/>
       <w:r>
@@ -340,7 +367,23 @@
           <w:rFonts w:ascii="Calibri" w:hAnsi="Calibri" w:cs="Calibri"/>
           <w:lang w:val="en-US"/>
         </w:rPr>
-        <w:t>-source Matlab-based software for automated/semi-automated EEG data pre-processing and analyses. It proposes Graphical User Interfaces (GUIs) that allow EEG pre-processing to be batched across participants with a high degree of flexibility in processing parameters.</w:t>
+        <w:t xml:space="preserve">-source </w:t>
+      </w:r>
+      <w:proofErr w:type="spellStart"/>
+      <w:r>
+        <w:rPr>
+          <w:rFonts w:ascii="Calibri" w:hAnsi="Calibri" w:cs="Calibri"/>
+          <w:lang w:val="en-US"/>
+        </w:rPr>
+        <w:t>Matlab</w:t>
+      </w:r>
+      <w:proofErr w:type="spellEnd"/>
+      <w:r>
+        <w:rPr>
+          <w:rFonts w:ascii="Calibri" w:hAnsi="Calibri" w:cs="Calibri"/>
+          <w:lang w:val="en-US"/>
+        </w:rPr>
+        <w:t>-based software for automated/semi-automated EEG data pre-processing and analyses. It proposes Graphical User Interfaces (GUIs) that allow EEG pre-processing to be batched across participants with a high degree of flexibility in processing parameters.</w:t>
       </w:r>
     </w:p>
     <w:p>
@@ -372,12 +415,21 @@
         </w:rPr>
         <w:t xml:space="preserve">software </w:t>
       </w:r>
-      <w:r>
-        <w:rPr>
-          <w:rFonts w:ascii="Calibri" w:hAnsi="Calibri" w:cs="Calibri"/>
-          <w:lang w:val="en-US"/>
-        </w:rPr>
-        <w:t xml:space="preserve">Cartool </w:t>
+      <w:proofErr w:type="spellStart"/>
+      <w:r>
+        <w:rPr>
+          <w:rFonts w:ascii="Calibri" w:hAnsi="Calibri" w:cs="Calibri"/>
+          <w:lang w:val="en-US"/>
+        </w:rPr>
+        <w:t>Cartool</w:t>
+      </w:r>
+      <w:proofErr w:type="spellEnd"/>
+      <w:r>
+        <w:rPr>
+          <w:rFonts w:ascii="Calibri" w:hAnsi="Calibri" w:cs="Calibri"/>
+          <w:lang w:val="en-US"/>
+        </w:rPr>
+        <w:t xml:space="preserve"> </w:t>
       </w:r>
       <w:r>
         <w:rPr>
@@ -449,6 +501,7 @@
         </w:rPr>
         <w:t xml:space="preserve">It is also an alternative to the original </w:t>
       </w:r>
+      <w:proofErr w:type="spellStart"/>
       <w:r>
         <w:rPr>
           <w:rFonts w:ascii="Calibri" w:hAnsi="Calibri" w:cs="Calibri"/>
@@ -456,6 +509,7 @@
         </w:rPr>
         <w:t>eeglab</w:t>
       </w:r>
+      <w:proofErr w:type="spellEnd"/>
       <w:r>
         <w:rPr>
           <w:rFonts w:ascii="Calibri" w:hAnsi="Calibri" w:cs="Calibri"/>
@@ -468,7 +522,23 @@
           <w:rFonts w:ascii="Calibri" w:hAnsi="Calibri" w:cs="Calibri"/>
           <w:lang w:val="en-US"/>
         </w:rPr>
-        <w:t xml:space="preserve">(reference: Delorme, A., &amp; Makeig, S. (2004). EEGLAB: an open-source toolbox for analysis of single-trial EEG dynamics. </w:t>
+        <w:t xml:space="preserve">(reference: Delorme, A., &amp; </w:t>
+      </w:r>
+      <w:proofErr w:type="spellStart"/>
+      <w:r>
+        <w:rPr>
+          <w:rFonts w:ascii="Calibri" w:hAnsi="Calibri" w:cs="Calibri"/>
+          <w:lang w:val="en-US"/>
+        </w:rPr>
+        <w:t>Makeig</w:t>
+      </w:r>
+      <w:proofErr w:type="spellEnd"/>
+      <w:r>
+        <w:rPr>
+          <w:rFonts w:ascii="Calibri" w:hAnsi="Calibri" w:cs="Calibri"/>
+          <w:lang w:val="en-US"/>
+        </w:rPr>
+        <w:t xml:space="preserve">, S. (2004). EEGLAB: an open-source toolbox for analysis of single-trial EEG dynamics. </w:t>
       </w:r>
       <w:r>
         <w:rPr>
@@ -493,29 +563,16 @@
         </w:rPr>
         <w:t xml:space="preserve"> DOI: </w:t>
       </w:r>
-      <w:r>
-        <w:fldChar w:fldCharType="begin"/>
-      </w:r>
-      <w:r>
-        <w:rPr>
-          <w:lang w:val="en-US"/>
-        </w:rPr>
-        <w:instrText>HYPERLINK "https://doi.org/10.1016/j.jneumeth.2003.10.009" \t "_blank"</w:instrText>
-      </w:r>
-      <w:r>
-        <w:fldChar w:fldCharType="separate"/>
-      </w:r>
-      <w:r>
-        <w:rPr>
-          <w:rStyle w:val="Hyperlink"/>
-          <w:rFonts w:ascii="Calibri" w:hAnsi="Calibri" w:cs="Calibri"/>
-          <w:lang w:val="en-US"/>
-        </w:rPr>
-        <w:t xml:space="preserve">10.1016/j.jneumeth.2003.10.009 </w:t>
-      </w:r>
-      <w:r>
-        <w:fldChar w:fldCharType="end"/>
-      </w:r>
+      <w:hyperlink r:id="rId12" w:tgtFrame="_blank" w:history="1">
+        <w:r>
+          <w:rPr>
+            <w:rStyle w:val="Hyperlink"/>
+            <w:rFonts w:ascii="Calibri" w:hAnsi="Calibri" w:cs="Calibri"/>
+            <w:lang w:val="en-US"/>
+          </w:rPr>
+          <w:t xml:space="preserve">10.1016/j.jneumeth.2003.10.009 </w:t>
+        </w:r>
+      </w:hyperlink>
       <w:r>
         <w:rPr>
           <w:rFonts w:ascii="Calibri" w:hAnsi="Calibri" w:cs="Calibri"/>
@@ -545,8 +602,25 @@
           <w:lang w:val="en-US"/>
         </w:rPr>
         <w:br/>
-        <w:t xml:space="preserve">In summary, the authors propose the EEGpal graphical interface (GUI) as a more practical solution than the </w:t>
-      </w:r>
+        <w:t xml:space="preserve">In summary, the authors propose the </w:t>
+      </w:r>
+      <w:proofErr w:type="spellStart"/>
+      <w:r>
+        <w:rPr>
+          <w:rFonts w:ascii="Calibri" w:hAnsi="Calibri" w:cs="Calibri"/>
+          <w:lang w:val="en-US"/>
+        </w:rPr>
+        <w:t>EEGpal</w:t>
+      </w:r>
+      <w:proofErr w:type="spellEnd"/>
+      <w:r>
+        <w:rPr>
+          <w:rFonts w:ascii="Calibri" w:hAnsi="Calibri" w:cs="Calibri"/>
+          <w:lang w:val="en-US"/>
+        </w:rPr>
+        <w:t xml:space="preserve"> graphical interface (GUI) as a more practical solution than the </w:t>
+      </w:r>
+      <w:proofErr w:type="spellStart"/>
       <w:r>
         <w:rPr>
           <w:rFonts w:ascii="Calibri" w:hAnsi="Calibri" w:cs="Calibri"/>
@@ -554,12 +628,61 @@
         </w:rPr>
         <w:t>eeglab</w:t>
       </w:r>
-      <w:r>
-        <w:rPr>
-          <w:rFonts w:ascii="Calibri" w:hAnsi="Calibri" w:cs="Calibri"/>
-          <w:lang w:val="en-US"/>
-        </w:rPr>
-        <w:t xml:space="preserve"> and Cartool GUIs for automating preprocessing. The authors recommend the use of Cartool software for the visualisation of EEG traces.</w:t>
+      <w:proofErr w:type="spellEnd"/>
+      <w:r>
+        <w:rPr>
+          <w:rFonts w:ascii="Calibri" w:hAnsi="Calibri" w:cs="Calibri"/>
+          <w:lang w:val="en-US"/>
+        </w:rPr>
+        <w:t xml:space="preserve"> and </w:t>
+      </w:r>
+      <w:proofErr w:type="spellStart"/>
+      <w:r>
+        <w:rPr>
+          <w:rFonts w:ascii="Calibri" w:hAnsi="Calibri" w:cs="Calibri"/>
+          <w:lang w:val="en-US"/>
+        </w:rPr>
+        <w:t>Cartool</w:t>
+      </w:r>
+      <w:proofErr w:type="spellEnd"/>
+      <w:r>
+        <w:rPr>
+          <w:rFonts w:ascii="Calibri" w:hAnsi="Calibri" w:cs="Calibri"/>
+          <w:lang w:val="en-US"/>
+        </w:rPr>
+        <w:t xml:space="preserve"> GUIs for automating preprocessing. The authors recommend the use of </w:t>
+      </w:r>
+      <w:proofErr w:type="spellStart"/>
+      <w:r>
+        <w:rPr>
+          <w:rFonts w:ascii="Calibri" w:hAnsi="Calibri" w:cs="Calibri"/>
+          <w:lang w:val="en-US"/>
+        </w:rPr>
+        <w:t>Cartool</w:t>
+      </w:r>
+      <w:proofErr w:type="spellEnd"/>
+      <w:r>
+        <w:rPr>
+          <w:rFonts w:ascii="Calibri" w:hAnsi="Calibri" w:cs="Calibri"/>
+          <w:lang w:val="en-US"/>
+        </w:rPr>
+        <w:t xml:space="preserve"> software for the </w:t>
+      </w:r>
+      <w:proofErr w:type="spellStart"/>
+      <w:r>
+        <w:rPr>
+          <w:rFonts w:ascii="Calibri" w:hAnsi="Calibri" w:cs="Calibri"/>
+          <w:lang w:val="en-US"/>
+        </w:rPr>
+        <w:t>visualisation</w:t>
+      </w:r>
+      <w:proofErr w:type="spellEnd"/>
+      <w:r>
+        <w:rPr>
+          <w:rFonts w:ascii="Calibri" w:hAnsi="Calibri" w:cs="Calibri"/>
+          <w:lang w:val="en-US"/>
+        </w:rPr>
+        <w:t xml:space="preserve"> of EEG traces.</w:t>
       </w:r>
     </w:p>
     <w:p>
@@ -594,12 +717,21 @@
           <w:lang w:val="en-US"/>
         </w:rPr>
       </w:pPr>
-      <w:r>
-        <w:rPr>
-          <w:rFonts w:ascii="Calibri" w:hAnsi="Calibri" w:cs="Calibri"/>
-          <w:lang w:val="en-US"/>
-        </w:rPr>
-        <w:t>Matlab 2018b or later</w:t>
+      <w:proofErr w:type="spellStart"/>
+      <w:r>
+        <w:rPr>
+          <w:rFonts w:ascii="Calibri" w:hAnsi="Calibri" w:cs="Calibri"/>
+          <w:lang w:val="en-US"/>
+        </w:rPr>
+        <w:t>Matlab</w:t>
+      </w:r>
+      <w:proofErr w:type="spellEnd"/>
+      <w:r>
+        <w:rPr>
+          <w:rFonts w:ascii="Calibri" w:hAnsi="Calibri" w:cs="Calibri"/>
+          <w:lang w:val="en-US"/>
+        </w:rPr>
+        <w:t xml:space="preserve"> 2018b or later</w:t>
       </w:r>
     </w:p>
     <w:p>
@@ -637,7 +769,21 @@
         <w:rPr>
           <w:lang w:val="en-US"/>
         </w:rPr>
-        <w:t>1. Download the EEGpal repository on your local drive.</w:t>
+        <w:t xml:space="preserve">1. Download the </w:t>
+      </w:r>
+      <w:proofErr w:type="spellStart"/>
+      <w:r>
+        <w:rPr>
+          <w:lang w:val="en-US"/>
+        </w:rPr>
+        <w:t>EEGpal</w:t>
+      </w:r>
+      <w:proofErr w:type="spellEnd"/>
+      <w:r>
+        <w:rPr>
+          <w:lang w:val="en-US"/>
+        </w:rPr>
+        <w:t xml:space="preserve"> repository on your local drive.</w:t>
       </w:r>
     </w:p>
     <w:p>
@@ -658,34 +804,142 @@
           <w:bCs/>
           <w:lang w:val="en-US"/>
         </w:rPr>
-        <w:t>If you have an eeglab version already mapped in your Matlab path, remove it (because it could generate conflict with the eeglab version include inside of EEGpal).</w:t>
-      </w:r>
-    </w:p>
-    <w:p>
-      <w:pPr>
-        <w:rPr>
-          <w:lang w:val="en-US"/>
-        </w:rPr>
-      </w:pPr>
-      <w:r>
-        <w:rPr>
-          <w:lang w:val="en-US"/>
-        </w:rPr>
-        <w:t>3. Add this folder to your local Matlab path (use of the command *</w:t>
-      </w:r>
+        <w:t xml:space="preserve">If you have an </w:t>
+      </w:r>
+      <w:proofErr w:type="spellStart"/>
+      <w:r>
+        <w:rPr>
+          <w:b/>
+          <w:bCs/>
+          <w:lang w:val="en-US"/>
+        </w:rPr>
+        <w:t>eeglab</w:t>
+      </w:r>
+      <w:proofErr w:type="spellEnd"/>
+      <w:r>
+        <w:rPr>
+          <w:b/>
+          <w:bCs/>
+          <w:lang w:val="en-US"/>
+        </w:rPr>
+        <w:t xml:space="preserve"> version already mapped in your </w:t>
+      </w:r>
+      <w:proofErr w:type="spellStart"/>
+      <w:r>
+        <w:rPr>
+          <w:b/>
+          <w:bCs/>
+          <w:lang w:val="en-US"/>
+        </w:rPr>
+        <w:t>Matlab</w:t>
+      </w:r>
+      <w:proofErr w:type="spellEnd"/>
+      <w:r>
+        <w:rPr>
+          <w:b/>
+          <w:bCs/>
+          <w:lang w:val="en-US"/>
+        </w:rPr>
+        <w:t xml:space="preserve"> path, remove it (because it could generate conflict with the </w:t>
+      </w:r>
+      <w:proofErr w:type="spellStart"/>
+      <w:r>
+        <w:rPr>
+          <w:b/>
+          <w:bCs/>
+          <w:lang w:val="en-US"/>
+        </w:rPr>
+        <w:t>eeglab</w:t>
+      </w:r>
+      <w:proofErr w:type="spellEnd"/>
+      <w:r>
+        <w:rPr>
+          <w:b/>
+          <w:bCs/>
+          <w:lang w:val="en-US"/>
+        </w:rPr>
+        <w:t xml:space="preserve"> version include inside of </w:t>
+      </w:r>
+      <w:proofErr w:type="spellStart"/>
+      <w:r>
+        <w:rPr>
+          <w:b/>
+          <w:bCs/>
+          <w:lang w:val="en-US"/>
+        </w:rPr>
+        <w:t>EEGpal</w:t>
+      </w:r>
+      <w:proofErr w:type="spellEnd"/>
+      <w:r>
+        <w:rPr>
+          <w:b/>
+          <w:bCs/>
+          <w:lang w:val="en-US"/>
+        </w:rPr>
+        <w:t>).</w:t>
+      </w:r>
+    </w:p>
+    <w:p>
+      <w:pPr>
+        <w:rPr>
+          <w:lang w:val="en-US"/>
+        </w:rPr>
+      </w:pPr>
+      <w:r>
+        <w:rPr>
+          <w:lang w:val="en-US"/>
+        </w:rPr>
+        <w:t xml:space="preserve">3. Add this folder to your local </w:t>
+      </w:r>
+      <w:proofErr w:type="spellStart"/>
+      <w:r>
+        <w:rPr>
+          <w:lang w:val="en-US"/>
+        </w:rPr>
+        <w:t>Matlab</w:t>
+      </w:r>
+      <w:proofErr w:type="spellEnd"/>
+      <w:r>
+        <w:rPr>
+          <w:lang w:val="en-US"/>
+        </w:rPr>
+        <w:t xml:space="preserve"> path (use of the command *</w:t>
+      </w:r>
+      <w:proofErr w:type="spellStart"/>
       <w:proofErr w:type="gramStart"/>
       <w:r>
         <w:rPr>
           <w:lang w:val="en-US"/>
         </w:rPr>
-        <w:t>setpath(</w:t>
+        <w:t>setpath</w:t>
+      </w:r>
+      <w:proofErr w:type="spellEnd"/>
+      <w:r>
+        <w:rPr>
+          <w:lang w:val="en-US"/>
+        </w:rPr>
+        <w:t>(</w:t>
       </w:r>
       <w:proofErr w:type="gramEnd"/>
       <w:r>
         <w:rPr>
           <w:lang w:val="en-US"/>
         </w:rPr>
-        <w:t>'path of the EEGpal folder</w:t>
+        <w:t xml:space="preserve">'path of the </w:t>
+      </w:r>
+      <w:proofErr w:type="spellStart"/>
+      <w:r>
+        <w:rPr>
+          <w:lang w:val="en-US"/>
+        </w:rPr>
+        <w:t>EEGpal</w:t>
+      </w:r>
+      <w:proofErr w:type="spellEnd"/>
+      <w:r>
+        <w:rPr>
+          <w:lang w:val="en-US"/>
+        </w:rPr>
+        <w:t xml:space="preserve"> folder</w:t>
       </w:r>
       <w:proofErr w:type="gramStart"/>
       <w:r>
@@ -712,7 +966,21 @@
         <w:rPr>
           <w:lang w:val="en-US"/>
         </w:rPr>
-        <w:t>4. Use the command *EEGpal* to start the software.</w:t>
+        <w:t>4. Use the command *</w:t>
+      </w:r>
+      <w:proofErr w:type="spellStart"/>
+      <w:r>
+        <w:rPr>
+          <w:lang w:val="en-US"/>
+        </w:rPr>
+        <w:t>EEGpal</w:t>
+      </w:r>
+      <w:proofErr w:type="spellEnd"/>
+      <w:r>
+        <w:rPr>
+          <w:lang w:val="en-US"/>
+        </w:rPr>
+        <w:t>* to start the software.</w:t>
       </w:r>
     </w:p>
     <w:p>
@@ -755,6 +1023,7 @@
           <w:lang w:val="en-US"/>
         </w:rPr>
       </w:pPr>
+      <w:proofErr w:type="spellStart"/>
       <w:r>
         <w:rPr>
           <w:rFonts w:ascii="Calibri" w:hAnsi="Calibri" w:cs="Calibri"/>
@@ -762,121 +1031,9 @@
           <w:bCs/>
           <w:lang w:val="en-US"/>
         </w:rPr>
-        <w:t>EEGpal is distributed under the BSD 2-Clause License.</w:t>
-      </w:r>
-    </w:p>
-    <w:p>
-      <w:pPr>
-        <w:spacing w:line="276" w:lineRule="auto"/>
-        <w:rPr>
-          <w:rFonts w:ascii="Calibri" w:hAnsi="Calibri" w:cs="Calibri"/>
-          <w:lang w:val="en-US"/>
-        </w:rPr>
-      </w:pPr>
-      <w:r>
-        <w:rPr>
-          <w:rFonts w:ascii="Calibri" w:hAnsi="Calibri" w:cs="Calibri"/>
-          <w:lang w:val="en-US"/>
-        </w:rPr>
-        <w:t>Third-party software included in this repository is distributed under</w:t>
-      </w:r>
-      <w:r>
-        <w:rPr>
-          <w:rFonts w:ascii="Calibri" w:hAnsi="Calibri" w:cs="Calibri"/>
-          <w:lang w:val="en-US"/>
-        </w:rPr>
-        <w:t xml:space="preserve"> </w:t>
-      </w:r>
-      <w:r>
-        <w:rPr>
-          <w:rFonts w:ascii="Calibri" w:hAnsi="Calibri" w:cs="Calibri"/>
-          <w:lang w:val="en-US"/>
-        </w:rPr>
-        <w:t>its own respective licenses, which may differ from the EEGpal license.</w:t>
-      </w:r>
-      <w:r>
-        <w:rPr>
-          <w:rFonts w:ascii="Calibri" w:hAnsi="Calibri" w:cs="Calibri"/>
-          <w:lang w:val="en-US"/>
-        </w:rPr>
-        <w:t xml:space="preserve"> </w:t>
-      </w:r>
-      <w:r>
-        <w:rPr>
-          <w:rFonts w:ascii="Calibri" w:hAnsi="Calibri" w:cs="Calibri"/>
-          <w:lang w:val="en-US"/>
-        </w:rPr>
-        <w:t>Users are responsible for complying with the license terms applicable</w:t>
-      </w:r>
-      <w:r>
-        <w:rPr>
-          <w:rFonts w:ascii="Calibri" w:hAnsi="Calibri" w:cs="Calibri"/>
-          <w:lang w:val="en-US"/>
-        </w:rPr>
-        <w:t xml:space="preserve"> </w:t>
-      </w:r>
-      <w:r>
-        <w:rPr>
-          <w:rFonts w:ascii="Calibri" w:hAnsi="Calibri" w:cs="Calibri"/>
-          <w:lang w:val="en-US"/>
-        </w:rPr>
-        <w:t>to each third-party component</w:t>
-      </w:r>
-      <w:r>
-        <w:rPr>
-          <w:rFonts w:ascii="Calibri" w:hAnsi="Calibri" w:cs="Calibri"/>
-          <w:lang w:val="en-US"/>
-        </w:rPr>
-        <w:t xml:space="preserve"> (see LICENSE.txt file)</w:t>
-      </w:r>
-      <w:r>
-        <w:rPr>
-          <w:rFonts w:ascii="Calibri" w:hAnsi="Calibri" w:cs="Calibri"/>
-          <w:lang w:val="en-US"/>
-        </w:rPr>
-        <w:t>.</w:t>
-      </w:r>
-    </w:p>
-    <w:p>
-      <w:pPr>
-        <w:spacing w:line="276" w:lineRule="auto"/>
-        <w:rPr>
-          <w:rFonts w:ascii="Calibri" w:hAnsi="Calibri" w:cs="Calibri"/>
-          <w:lang w:val="en-US"/>
-        </w:rPr>
-      </w:pPr>
-    </w:p>
-    <w:p>
-      <w:pPr>
-        <w:pStyle w:val="Heading3"/>
-        <w:rPr>
-          <w:rFonts w:ascii="Calibri" w:hAnsi="Calibri" w:cs="Calibri"/>
-          <w:lang w:val="en-US"/>
-        </w:rPr>
-      </w:pPr>
-      <w:r>
-        <w:rPr>
-          <w:rFonts w:ascii="Calibri" w:hAnsi="Calibri" w:cs="Calibri"/>
-          <w:lang w:val="en-US"/>
-        </w:rPr>
-        <w:t xml:space="preserve">Disclamer </w:t>
-      </w:r>
-    </w:p>
-    <w:p>
-      <w:pPr>
-        <w:spacing w:line="276" w:lineRule="auto"/>
-        <w:rPr>
-          <w:rFonts w:ascii="Calibri" w:hAnsi="Calibri" w:cs="Calibri"/>
-          <w:lang w:val="en-US"/>
-        </w:rPr>
-      </w:pPr>
-      <w:r>
-        <w:rPr>
-          <w:rFonts w:ascii="Calibri" w:hAnsi="Calibri" w:cs="Calibri"/>
-          <w:lang w:val="en-US"/>
-        </w:rPr>
-        <w:t xml:space="preserve">EEGpal is provided as an open-source toolbox to support EEG data analysis and scientific research. While every effort has been made to ensure the quality and reliability of the software, it is provided </w:t>
-      </w:r>
+        <w:t>EEGpal</w:t>
+      </w:r>
+      <w:proofErr w:type="spellEnd"/>
       <w:r>
         <w:rPr>
           <w:rFonts w:ascii="Calibri" w:hAnsi="Calibri" w:cs="Calibri"/>
@@ -884,14 +1041,7 @@
           <w:bCs/>
           <w:lang w:val="en-US"/>
         </w:rPr>
-        <w:t>"as is"</w:t>
-      </w:r>
-      <w:r>
-        <w:rPr>
-          <w:rFonts w:ascii="Calibri" w:hAnsi="Calibri" w:cs="Calibri"/>
-          <w:lang w:val="en-US"/>
-        </w:rPr>
-        <w:t>, without warranty of any kind, express or implied.</w:t>
+        <w:t xml:space="preserve"> is distributed under the BSD 2-Clause License.</w:t>
       </w:r>
     </w:p>
     <w:p>
@@ -902,6 +1052,94 @@
           <w:lang w:val="en-US"/>
         </w:rPr>
       </w:pPr>
+      <w:r>
+        <w:rPr>
+          <w:rFonts w:ascii="Calibri" w:hAnsi="Calibri" w:cs="Calibri"/>
+          <w:lang w:val="en-US"/>
+        </w:rPr>
+        <w:t>Third-party software included in this repository is distributed under</w:t>
+      </w:r>
+      <w:r>
+        <w:rPr>
+          <w:rFonts w:ascii="Calibri" w:hAnsi="Calibri" w:cs="Calibri"/>
+          <w:lang w:val="en-US"/>
+        </w:rPr>
+        <w:t xml:space="preserve"> </w:t>
+      </w:r>
+      <w:r>
+        <w:rPr>
+          <w:rFonts w:ascii="Calibri" w:hAnsi="Calibri" w:cs="Calibri"/>
+          <w:lang w:val="en-US"/>
+        </w:rPr>
+        <w:t xml:space="preserve">its own respective licenses, which may differ from the </w:t>
+      </w:r>
+      <w:proofErr w:type="spellStart"/>
+      <w:r>
+        <w:rPr>
+          <w:rFonts w:ascii="Calibri" w:hAnsi="Calibri" w:cs="Calibri"/>
+          <w:lang w:val="en-US"/>
+        </w:rPr>
+        <w:t>EEGpal</w:t>
+      </w:r>
+      <w:proofErr w:type="spellEnd"/>
+      <w:r>
+        <w:rPr>
+          <w:rFonts w:ascii="Calibri" w:hAnsi="Calibri" w:cs="Calibri"/>
+          <w:lang w:val="en-US"/>
+        </w:rPr>
+        <w:t xml:space="preserve"> license.</w:t>
+      </w:r>
+      <w:r>
+        <w:rPr>
+          <w:rFonts w:ascii="Calibri" w:hAnsi="Calibri" w:cs="Calibri"/>
+          <w:lang w:val="en-US"/>
+        </w:rPr>
+        <w:t xml:space="preserve"> </w:t>
+      </w:r>
+      <w:r>
+        <w:rPr>
+          <w:rFonts w:ascii="Calibri" w:hAnsi="Calibri" w:cs="Calibri"/>
+          <w:lang w:val="en-US"/>
+        </w:rPr>
+        <w:t>Users are responsible for complying with the license terms applicable</w:t>
+      </w:r>
+      <w:r>
+        <w:rPr>
+          <w:rFonts w:ascii="Calibri" w:hAnsi="Calibri" w:cs="Calibri"/>
+          <w:lang w:val="en-US"/>
+        </w:rPr>
+        <w:t xml:space="preserve"> </w:t>
+      </w:r>
+      <w:r>
+        <w:rPr>
+          <w:rFonts w:ascii="Calibri" w:hAnsi="Calibri" w:cs="Calibri"/>
+          <w:lang w:val="en-US"/>
+        </w:rPr>
+        <w:t>to each third-party component</w:t>
+      </w:r>
+      <w:r>
+        <w:rPr>
+          <w:rFonts w:ascii="Calibri" w:hAnsi="Calibri" w:cs="Calibri"/>
+          <w:lang w:val="en-US"/>
+        </w:rPr>
+        <w:t xml:space="preserve"> (see LICENSE.txt file)</w:t>
+      </w:r>
+      <w:r>
+        <w:rPr>
+          <w:rFonts w:ascii="Calibri" w:hAnsi="Calibri" w:cs="Calibri"/>
+          <w:lang w:val="en-US"/>
+        </w:rPr>
+        <w:t>.</w:t>
+      </w:r>
+    </w:p>
+    <w:p>
+      <w:pPr>
+        <w:spacing w:line="276" w:lineRule="auto"/>
+        <w:rPr>
+          <w:rFonts w:ascii="Calibri" w:hAnsi="Calibri" w:cs="Calibri"/>
+          <w:lang w:val="en-US"/>
+        </w:rPr>
+      </w:pPr>
     </w:p>
     <w:p>
       <w:pPr>
@@ -911,22 +1149,22 @@
           <w:lang w:val="en-US"/>
         </w:rPr>
       </w:pPr>
-      <w:r>
-        <w:rPr>
-          <w:rFonts w:ascii="Calibri" w:hAnsi="Calibri" w:cs="Calibri"/>
-          <w:lang w:val="en-US"/>
-        </w:rPr>
-        <w:t xml:space="preserve">Before </w:t>
-      </w:r>
-      <w:proofErr w:type="gramStart"/>
-      <w:r>
-        <w:rPr>
-          <w:rFonts w:ascii="Calibri" w:hAnsi="Calibri" w:cs="Calibri"/>
-          <w:lang w:val="en-US"/>
-        </w:rPr>
-        <w:t>to start</w:t>
-      </w:r>
-      <w:proofErr w:type="gramEnd"/>
+      <w:proofErr w:type="spellStart"/>
+      <w:r>
+        <w:rPr>
+          <w:rFonts w:ascii="Calibri" w:hAnsi="Calibri" w:cs="Calibri"/>
+          <w:lang w:val="en-US"/>
+        </w:rPr>
+        <w:t>Disclamer</w:t>
+      </w:r>
+      <w:proofErr w:type="spellEnd"/>
+      <w:r>
+        <w:rPr>
+          <w:rFonts w:ascii="Calibri" w:hAnsi="Calibri" w:cs="Calibri"/>
+          <w:lang w:val="en-US"/>
+        </w:rPr>
+        <w:t xml:space="preserve"> </w:t>
+      </w:r>
     </w:p>
     <w:p>
       <w:pPr>
@@ -936,122 +1174,213 @@
           <w:lang w:val="en-US"/>
         </w:rPr>
       </w:pPr>
-      <w:r>
-        <w:rPr>
-          <w:rFonts w:ascii="Calibri" w:hAnsi="Calibri" w:cs="Calibri"/>
-          <w:lang w:val="en-US"/>
-        </w:rPr>
-        <w:t xml:space="preserve">This section </w:t>
-      </w:r>
-      <w:r>
-        <w:rPr>
-          <w:rFonts w:ascii="Calibri" w:hAnsi="Calibri" w:cs="Calibri"/>
-          <w:lang w:val="en-US"/>
-        </w:rPr>
-        <w:t>reminds</w:t>
-      </w:r>
-      <w:r>
-        <w:rPr>
-          <w:rFonts w:ascii="Calibri" w:hAnsi="Calibri" w:cs="Calibri"/>
-          <w:lang w:val="en-US"/>
-        </w:rPr>
-        <w:t xml:space="preserve"> the import ter</w:t>
-      </w:r>
-      <w:r>
-        <w:rPr>
-          <w:rFonts w:ascii="Calibri" w:hAnsi="Calibri" w:cs="Calibri"/>
-          <w:lang w:val="en-US"/>
-        </w:rPr>
-        <w:t xml:space="preserve">minology and </w:t>
-      </w:r>
-      <w:proofErr w:type="gramStart"/>
-      <w:r>
-        <w:rPr>
-          <w:rFonts w:ascii="Calibri" w:hAnsi="Calibri" w:cs="Calibri"/>
-          <w:lang w:val="en-US"/>
-        </w:rPr>
-        <w:t>concept to know</w:t>
-      </w:r>
-      <w:proofErr w:type="gramEnd"/>
-      <w:r>
-        <w:rPr>
-          <w:rFonts w:ascii="Calibri" w:hAnsi="Calibri" w:cs="Calibri"/>
-          <w:lang w:val="en-US"/>
-        </w:rPr>
-        <w:t xml:space="preserve"> before </w:t>
-      </w:r>
-      <w:proofErr w:type="gramStart"/>
-      <w:r>
-        <w:rPr>
-          <w:rFonts w:ascii="Calibri" w:hAnsi="Calibri" w:cs="Calibri"/>
-          <w:lang w:val="en-US"/>
-        </w:rPr>
-        <w:t>to use</w:t>
-      </w:r>
-      <w:proofErr w:type="gramEnd"/>
-      <w:r>
-        <w:rPr>
-          <w:rFonts w:ascii="Calibri" w:hAnsi="Calibri" w:cs="Calibri"/>
-          <w:lang w:val="en-US"/>
-        </w:rPr>
-        <w:t xml:space="preserve"> this toolbox.</w:t>
-      </w:r>
-    </w:p>
-    <w:p>
-      <w:pPr>
-        <w:spacing w:line="276" w:lineRule="auto"/>
+      <w:proofErr w:type="spellStart"/>
+      <w:r>
+        <w:rPr>
+          <w:rFonts w:ascii="Calibri" w:hAnsi="Calibri" w:cs="Calibri"/>
+          <w:lang w:val="en-US"/>
+        </w:rPr>
+        <w:t>EEGpal</w:t>
+      </w:r>
+      <w:proofErr w:type="spellEnd"/>
+      <w:r>
+        <w:rPr>
+          <w:rFonts w:ascii="Calibri" w:hAnsi="Calibri" w:cs="Calibri"/>
+          <w:lang w:val="en-US"/>
+        </w:rPr>
+        <w:t xml:space="preserve"> is provided as an open-source toolbox to support EEG data analysis and scientific research. While every effort has been made to ensure the quality and reliability of the software, it is provided </w:t>
+      </w:r>
+      <w:r>
         <w:rPr>
           <w:rFonts w:ascii="Calibri" w:hAnsi="Calibri" w:cs="Calibri"/>
           <w:b/>
           <w:bCs/>
           <w:lang w:val="en-US"/>
         </w:rPr>
-      </w:pPr>
-      <w:r>
+        <w:t>"as is"</w:t>
+      </w:r>
+      <w:r>
+        <w:rPr>
+          <w:rFonts w:ascii="Calibri" w:hAnsi="Calibri" w:cs="Calibri"/>
+          <w:lang w:val="en-US"/>
+        </w:rPr>
+        <w:t>, without warranty of any kind, express or implied.</w:t>
+      </w:r>
+    </w:p>
+    <w:p>
+      <w:pPr>
+        <w:spacing w:line="276" w:lineRule="auto"/>
+        <w:rPr>
+          <w:rFonts w:ascii="Calibri" w:hAnsi="Calibri" w:cs="Calibri"/>
+          <w:lang w:val="en-US"/>
+        </w:rPr>
+      </w:pPr>
+    </w:p>
+    <w:p>
+      <w:pPr>
+        <w:pStyle w:val="Heading3"/>
+        <w:rPr>
+          <w:rFonts w:ascii="Calibri" w:hAnsi="Calibri" w:cs="Calibri"/>
+          <w:lang w:val="en-US"/>
+        </w:rPr>
+      </w:pPr>
+      <w:r>
+        <w:rPr>
+          <w:rFonts w:ascii="Calibri" w:hAnsi="Calibri" w:cs="Calibri"/>
+          <w:lang w:val="en-US"/>
+        </w:rPr>
+        <w:t xml:space="preserve">Before </w:t>
+      </w:r>
+      <w:proofErr w:type="gramStart"/>
+      <w:r>
+        <w:rPr>
+          <w:rFonts w:ascii="Calibri" w:hAnsi="Calibri" w:cs="Calibri"/>
+          <w:lang w:val="en-US"/>
+        </w:rPr>
+        <w:t>to start</w:t>
+      </w:r>
+      <w:proofErr w:type="gramEnd"/>
+    </w:p>
+    <w:p>
+      <w:pPr>
+        <w:spacing w:line="276" w:lineRule="auto"/>
+        <w:rPr>
+          <w:rFonts w:ascii="Calibri" w:hAnsi="Calibri" w:cs="Calibri"/>
+          <w:lang w:val="en-US"/>
+        </w:rPr>
+      </w:pPr>
+      <w:r>
+        <w:rPr>
+          <w:rFonts w:ascii="Calibri" w:hAnsi="Calibri" w:cs="Calibri"/>
+          <w:lang w:val="en-US"/>
+        </w:rPr>
+        <w:t xml:space="preserve">This section </w:t>
+      </w:r>
+      <w:r>
+        <w:rPr>
+          <w:rFonts w:ascii="Calibri" w:hAnsi="Calibri" w:cs="Calibri"/>
+          <w:lang w:val="en-US"/>
+        </w:rPr>
+        <w:t>reminds</w:t>
+      </w:r>
+      <w:r>
+        <w:rPr>
+          <w:rFonts w:ascii="Calibri" w:hAnsi="Calibri" w:cs="Calibri"/>
+          <w:lang w:val="en-US"/>
+        </w:rPr>
+        <w:t xml:space="preserve"> the import ter</w:t>
+      </w:r>
+      <w:r>
+        <w:rPr>
+          <w:rFonts w:ascii="Calibri" w:hAnsi="Calibri" w:cs="Calibri"/>
+          <w:lang w:val="en-US"/>
+        </w:rPr>
+        <w:t xml:space="preserve">minology and </w:t>
+      </w:r>
+      <w:proofErr w:type="gramStart"/>
+      <w:r>
+        <w:rPr>
+          <w:rFonts w:ascii="Calibri" w:hAnsi="Calibri" w:cs="Calibri"/>
+          <w:lang w:val="en-US"/>
+        </w:rPr>
+        <w:t>concept to know</w:t>
+      </w:r>
+      <w:proofErr w:type="gramEnd"/>
+      <w:r>
+        <w:rPr>
+          <w:rFonts w:ascii="Calibri" w:hAnsi="Calibri" w:cs="Calibri"/>
+          <w:lang w:val="en-US"/>
+        </w:rPr>
+        <w:t xml:space="preserve"> before </w:t>
+      </w:r>
+      <w:proofErr w:type="gramStart"/>
+      <w:r>
+        <w:rPr>
+          <w:rFonts w:ascii="Calibri" w:hAnsi="Calibri" w:cs="Calibri"/>
+          <w:lang w:val="en-US"/>
+        </w:rPr>
+        <w:t>to use</w:t>
+      </w:r>
+      <w:proofErr w:type="gramEnd"/>
+      <w:r>
+        <w:rPr>
+          <w:rFonts w:ascii="Calibri" w:hAnsi="Calibri" w:cs="Calibri"/>
+          <w:lang w:val="en-US"/>
+        </w:rPr>
+        <w:t xml:space="preserve"> this toolbox.</w:t>
+      </w:r>
+    </w:p>
+    <w:p>
+      <w:pPr>
+        <w:spacing w:line="276" w:lineRule="auto"/>
         <w:rPr>
           <w:rFonts w:ascii="Calibri" w:hAnsi="Calibri" w:cs="Calibri"/>
           <w:b/>
           <w:bCs/>
           <w:lang w:val="en-US"/>
         </w:rPr>
-        <w:t>What is a Time Frame (TF)?</w:t>
-      </w:r>
-    </w:p>
-    <w:p>
-      <w:pPr>
-        <w:spacing w:line="276" w:lineRule="auto"/>
-        <w:rPr>
-          <w:rFonts w:ascii="Calibri" w:hAnsi="Calibri" w:cs="Calibri"/>
-          <w:lang w:val="en-US"/>
-        </w:rPr>
-      </w:pPr>
-      <w:r>
-        <w:rPr>
-          <w:rFonts w:ascii="Calibri" w:hAnsi="Calibri" w:cs="Calibri"/>
-          <w:lang w:val="en-US"/>
-        </w:rPr>
-        <w:t>The abbreviation TF (or tf) used in the toolbox stands for Time Frame. It corresponds to one sampling point the EEG files. This is the smallest unit of time. Its duration depends on the sampling frequency. For example, if the sampling frequency is 2048 Hz, then 1 TF=1/2048= 0.000488s = 0.488 ms.</w:t>
-      </w:r>
-    </w:p>
-    <w:p>
-      <w:pPr>
-        <w:spacing w:line="276" w:lineRule="auto"/>
+      </w:pPr>
+      <w:r>
         <w:rPr>
           <w:rFonts w:ascii="Calibri" w:hAnsi="Calibri" w:cs="Calibri"/>
           <w:b/>
           <w:bCs/>
           <w:lang w:val="en-US"/>
         </w:rPr>
-      </w:pPr>
-      <w:r>
+        <w:t>What is a Time Frame (TF)?</w:t>
+      </w:r>
+    </w:p>
+    <w:p>
+      <w:pPr>
+        <w:spacing w:line="276" w:lineRule="auto"/>
+        <w:rPr>
+          <w:rFonts w:ascii="Calibri" w:hAnsi="Calibri" w:cs="Calibri"/>
+          <w:lang w:val="en-US"/>
+        </w:rPr>
+      </w:pPr>
+      <w:r>
+        <w:rPr>
+          <w:rFonts w:ascii="Calibri" w:hAnsi="Calibri" w:cs="Calibri"/>
+          <w:lang w:val="en-US"/>
+        </w:rPr>
+        <w:t xml:space="preserve">The abbreviation TF (or </w:t>
+      </w:r>
+      <w:proofErr w:type="spellStart"/>
+      <w:r>
+        <w:rPr>
+          <w:rFonts w:ascii="Calibri" w:hAnsi="Calibri" w:cs="Calibri"/>
+          <w:lang w:val="en-US"/>
+        </w:rPr>
+        <w:t>tf</w:t>
+      </w:r>
+      <w:proofErr w:type="spellEnd"/>
+      <w:r>
+        <w:rPr>
+          <w:rFonts w:ascii="Calibri" w:hAnsi="Calibri" w:cs="Calibri"/>
+          <w:lang w:val="en-US"/>
+        </w:rPr>
+        <w:t xml:space="preserve">) used in the toolbox stands for Time Frame. It corresponds to one sampling point the EEG files. This is the smallest unit of time. Its duration depends on the sampling frequency. For example, if the sampling frequency is 2048 Hz, then 1 TF=1/2048= 0.000488s = 0.488 </w:t>
+      </w:r>
+      <w:proofErr w:type="spellStart"/>
+      <w:r>
+        <w:rPr>
+          <w:rFonts w:ascii="Calibri" w:hAnsi="Calibri" w:cs="Calibri"/>
+          <w:lang w:val="en-US"/>
+        </w:rPr>
+        <w:t>ms.</w:t>
+      </w:r>
+      <w:proofErr w:type="spellEnd"/>
+    </w:p>
+    <w:p>
+      <w:pPr>
+        <w:spacing w:line="276" w:lineRule="auto"/>
         <w:rPr>
           <w:rFonts w:ascii="Calibri" w:hAnsi="Calibri" w:cs="Calibri"/>
           <w:b/>
           <w:bCs/>
           <w:lang w:val="en-US"/>
         </w:rPr>
-        <w:t>File type</w:t>
-      </w:r>
+      </w:pPr>
       <w:r>
         <w:rPr>
           <w:rFonts w:ascii="Calibri" w:hAnsi="Calibri" w:cs="Calibri"/>
@@ -1059,6 +1388,15 @@
           <w:bCs/>
           <w:lang w:val="en-US"/>
         </w:rPr>
+        <w:t>File type</w:t>
+      </w:r>
+      <w:r>
+        <w:rPr>
+          <w:rFonts w:ascii="Calibri" w:hAnsi="Calibri" w:cs="Calibri"/>
+          <w:b/>
+          <w:bCs/>
+          <w:lang w:val="en-US"/>
+        </w:rPr>
         <w:t>s</w:t>
       </w:r>
     </w:p>
@@ -1075,7 +1413,23 @@
           <w:rFonts w:ascii="Calibri" w:hAnsi="Calibri" w:cs="Calibri"/>
           <w:lang w:val="en-US"/>
         </w:rPr>
-        <w:t xml:space="preserve">One of the advantages of the EEGpal toolbox is that it works with a serval EEG file format. For example: </w:t>
+        <w:t xml:space="preserve">One of the advantages of the </w:t>
+      </w:r>
+      <w:proofErr w:type="spellStart"/>
+      <w:r>
+        <w:rPr>
+          <w:rFonts w:ascii="Calibri" w:hAnsi="Calibri" w:cs="Calibri"/>
+          <w:lang w:val="en-US"/>
+        </w:rPr>
+        <w:t>EEGpal</w:t>
+      </w:r>
+      <w:proofErr w:type="spellEnd"/>
+      <w:r>
+        <w:rPr>
+          <w:rFonts w:ascii="Calibri" w:hAnsi="Calibri" w:cs="Calibri"/>
+          <w:lang w:val="en-US"/>
+        </w:rPr>
+        <w:t xml:space="preserve"> toolbox is that it works with a serval EEG file format. For example: </w:t>
       </w:r>
     </w:p>
     <w:p>
@@ -1097,15 +1451,40 @@
           <w:rFonts w:ascii="Calibri" w:hAnsi="Calibri" w:cs="Calibri"/>
           <w:lang w:val="en-US"/>
         </w:rPr>
-        <w:t>.bdf</w:t>
-      </w:r>
+        <w:t>.</w:t>
+      </w:r>
+      <w:proofErr w:type="spellStart"/>
+      <w:r>
+        <w:rPr>
+          <w:rFonts w:ascii="Calibri" w:hAnsi="Calibri" w:cs="Calibri"/>
+          <w:lang w:val="en-US"/>
+        </w:rPr>
+        <w:t>bdf</w:t>
+      </w:r>
+      <w:proofErr w:type="spellEnd"/>
       <w:proofErr w:type="gramEnd"/>
       <w:r>
         <w:rPr>
           <w:rFonts w:ascii="Calibri" w:hAnsi="Calibri" w:cs="Calibri"/>
           <w:lang w:val="en-US"/>
         </w:rPr>
-        <w:t xml:space="preserve"> : Raw Biosemi files</w:t>
+        <w:t xml:space="preserve"> : Raw </w:t>
+      </w:r>
+      <w:proofErr w:type="spellStart"/>
+      <w:r>
+        <w:rPr>
+          <w:rFonts w:ascii="Calibri" w:hAnsi="Calibri" w:cs="Calibri"/>
+          <w:lang w:val="en-US"/>
+        </w:rPr>
+        <w:t>Biosemi</w:t>
+      </w:r>
+      <w:proofErr w:type="spellEnd"/>
+      <w:r>
+        <w:rPr>
+          <w:rFonts w:ascii="Calibri" w:hAnsi="Calibri" w:cs="Calibri"/>
+          <w:lang w:val="en-US"/>
+        </w:rPr>
+        <w:t xml:space="preserve"> files</w:t>
       </w:r>
     </w:p>
     <w:p>
@@ -1127,8 +1506,17 @@
           <w:rFonts w:ascii="Calibri" w:hAnsi="Calibri" w:cs="Calibri"/>
           <w:lang w:val="en-US"/>
         </w:rPr>
-        <w:t>.eph</w:t>
-      </w:r>
+        <w:t>.</w:t>
+      </w:r>
+      <w:proofErr w:type="spellStart"/>
+      <w:r>
+        <w:rPr>
+          <w:rFonts w:ascii="Calibri" w:hAnsi="Calibri" w:cs="Calibri"/>
+          <w:lang w:val="en-US"/>
+        </w:rPr>
+        <w:t>eph</w:t>
+      </w:r>
+      <w:proofErr w:type="spellEnd"/>
       <w:proofErr w:type="gramEnd"/>
       <w:r>
         <w:rPr>
@@ -1149,7 +1537,23 @@
           <w:rFonts w:ascii="Calibri" w:hAnsi="Calibri" w:cs="Calibri"/>
           <w:lang w:val="en-US"/>
         </w:rPr>
-        <w:t xml:space="preserve">used in Cartool. The first line is </w:t>
+        <w:t xml:space="preserve">used in </w:t>
+      </w:r>
+      <w:proofErr w:type="spellStart"/>
+      <w:r>
+        <w:rPr>
+          <w:rFonts w:ascii="Calibri" w:hAnsi="Calibri" w:cs="Calibri"/>
+          <w:lang w:val="en-US"/>
+        </w:rPr>
+        <w:t>Cartool</w:t>
+      </w:r>
+      <w:proofErr w:type="spellEnd"/>
+      <w:r>
+        <w:rPr>
+          <w:rFonts w:ascii="Calibri" w:hAnsi="Calibri" w:cs="Calibri"/>
+          <w:lang w:val="en-US"/>
+        </w:rPr>
+        <w:t xml:space="preserve">. The first line is </w:t>
       </w:r>
       <w:proofErr w:type="gramStart"/>
       <w:r>
@@ -1248,8 +1652,17 @@
           <w:rFonts w:ascii="Calibri" w:hAnsi="Calibri" w:cs="Calibri"/>
           <w:lang w:val="en-US"/>
         </w:rPr>
-        <w:t>used in Cartool</w:t>
-      </w:r>
+        <w:t xml:space="preserve">used in </w:t>
+      </w:r>
+      <w:proofErr w:type="spellStart"/>
+      <w:r>
+        <w:rPr>
+          <w:rFonts w:ascii="Calibri" w:hAnsi="Calibri" w:cs="Calibri"/>
+          <w:lang w:val="en-US"/>
+        </w:rPr>
+        <w:t>Cartool</w:t>
+      </w:r>
+      <w:proofErr w:type="spellEnd"/>
       <w:r>
         <w:rPr>
           <w:rFonts w:ascii="Calibri" w:hAnsi="Calibri" w:cs="Calibri"/>
@@ -1262,7 +1675,23 @@
           <w:rFonts w:ascii="Calibri" w:hAnsi="Calibri" w:cs="Calibri"/>
           <w:lang w:val="en-US"/>
         </w:rPr>
-        <w:t>Koenig, T., Kottlow, M., Stein, M., &amp; Melie-García, L. (2011). Ragu: A Free Tool for the Analysis of EEG and MEG Event-Related Scalp Field Data Using Global Randomization Statistics. Computational Intelligence and Neuroscience, 2011, 1-14. DOI: 10.1155/2011/938925.</w:t>
+        <w:t xml:space="preserve">Koenig, T., </w:t>
+      </w:r>
+      <w:proofErr w:type="spellStart"/>
+      <w:r>
+        <w:rPr>
+          <w:rFonts w:ascii="Calibri" w:hAnsi="Calibri" w:cs="Calibri"/>
+          <w:lang w:val="en-US"/>
+        </w:rPr>
+        <w:t>Kottlow</w:t>
+      </w:r>
+      <w:proofErr w:type="spellEnd"/>
+      <w:r>
+        <w:rPr>
+          <w:rFonts w:ascii="Calibri" w:hAnsi="Calibri" w:cs="Calibri"/>
+          <w:lang w:val="en-US"/>
+        </w:rPr>
+        <w:t>, M., Stein, M., &amp; Melie-García, L. (2011). Ragu: A Free Tool for the Analysis of EEG and MEG Event-Related Scalp Field Data Using Global Randomization Statistics. Computational Intelligence and Neuroscience, 2011, 1-14. DOI: 10.1155/2011/938925.</w:t>
       </w:r>
       <w:r>
         <w:rPr>
@@ -1298,8 +1727,17 @@
           <w:rFonts w:ascii="Calibri" w:hAnsi="Calibri" w:cs="Calibri"/>
           <w:lang w:val="en-US"/>
         </w:rPr>
-        <w:t>.sef</w:t>
-      </w:r>
+        <w:t>.</w:t>
+      </w:r>
+      <w:proofErr w:type="spellStart"/>
+      <w:r>
+        <w:rPr>
+          <w:rFonts w:ascii="Calibri" w:hAnsi="Calibri" w:cs="Calibri"/>
+          <w:lang w:val="en-US"/>
+        </w:rPr>
+        <w:t>sef</w:t>
+      </w:r>
+      <w:proofErr w:type="spellEnd"/>
       <w:proofErr w:type="gramEnd"/>
       <w:r>
         <w:rPr>
@@ -1313,7 +1751,39 @@
           <w:rFonts w:ascii="Calibri" w:hAnsi="Calibri" w:cs="Calibri"/>
           <w:lang w:val="en-US"/>
         </w:rPr>
-        <w:t>Binary EEG file used in Cartool that contains the data and temporal information. It is the default option proposed in EEGpal because this solution uses the least disk space.</w:t>
+        <w:t xml:space="preserve">Binary EEG file used in </w:t>
+      </w:r>
+      <w:proofErr w:type="spellStart"/>
+      <w:r>
+        <w:rPr>
+          <w:rFonts w:ascii="Calibri" w:hAnsi="Calibri" w:cs="Calibri"/>
+          <w:lang w:val="en-US"/>
+        </w:rPr>
+        <w:t>Cartool</w:t>
+      </w:r>
+      <w:proofErr w:type="spellEnd"/>
+      <w:r>
+        <w:rPr>
+          <w:rFonts w:ascii="Calibri" w:hAnsi="Calibri" w:cs="Calibri"/>
+          <w:lang w:val="en-US"/>
+        </w:rPr>
+        <w:t xml:space="preserve"> that contains the data and temporal information. It is the default option proposed in </w:t>
+      </w:r>
+      <w:proofErr w:type="spellStart"/>
+      <w:r>
+        <w:rPr>
+          <w:rFonts w:ascii="Calibri" w:hAnsi="Calibri" w:cs="Calibri"/>
+          <w:lang w:val="en-US"/>
+        </w:rPr>
+        <w:t>EEGpal</w:t>
+      </w:r>
+      <w:proofErr w:type="spellEnd"/>
+      <w:r>
+        <w:rPr>
+          <w:rFonts w:ascii="Calibri" w:hAnsi="Calibri" w:cs="Calibri"/>
+          <w:lang w:val="en-US"/>
+        </w:rPr>
+        <w:t xml:space="preserve"> because this solution uses the least disk space.</w:t>
       </w:r>
     </w:p>
     <w:p>
@@ -1335,8 +1805,17 @@
           <w:rFonts w:ascii="Calibri" w:hAnsi="Calibri" w:cs="Calibri"/>
           <w:lang w:val="en-US"/>
         </w:rPr>
-        <w:t>.set/.fdt</w:t>
-      </w:r>
+        <w:t>.set/.</w:t>
+      </w:r>
+      <w:proofErr w:type="spellStart"/>
+      <w:r>
+        <w:rPr>
+          <w:rFonts w:ascii="Calibri" w:hAnsi="Calibri" w:cs="Calibri"/>
+          <w:lang w:val="en-US"/>
+        </w:rPr>
+        <w:t>fdt</w:t>
+      </w:r>
+      <w:proofErr w:type="spellEnd"/>
       <w:proofErr w:type="gramEnd"/>
       <w:r>
         <w:rPr>
@@ -1345,6 +1824,7 @@
         </w:rPr>
         <w:t xml:space="preserve">: File format used by </w:t>
       </w:r>
+      <w:proofErr w:type="spellStart"/>
       <w:r>
         <w:rPr>
           <w:rFonts w:ascii="Calibri" w:hAnsi="Calibri" w:cs="Calibri"/>
@@ -1352,6 +1832,7 @@
         </w:rPr>
         <w:t>eeglab</w:t>
       </w:r>
+      <w:proofErr w:type="spellEnd"/>
     </w:p>
     <w:p>
       <w:pPr>
@@ -1372,16 +1853,34 @@
           <w:rFonts w:ascii="Calibri" w:hAnsi="Calibri" w:cs="Calibri"/>
           <w:lang w:val="en-US"/>
         </w:rPr>
-        <w:t>.ris</w:t>
-      </w:r>
+        <w:t>.</w:t>
+      </w:r>
+      <w:proofErr w:type="spellStart"/>
+      <w:r>
+        <w:rPr>
+          <w:rFonts w:ascii="Calibri" w:hAnsi="Calibri" w:cs="Calibri"/>
+          <w:lang w:val="en-US"/>
+        </w:rPr>
+        <w:t>ris</w:t>
+      </w:r>
+      <w:proofErr w:type="spellEnd"/>
       <w:proofErr w:type="gramEnd"/>
       <w:r>
         <w:rPr>
           <w:rFonts w:ascii="Calibri" w:hAnsi="Calibri" w:cs="Calibri"/>
           <w:lang w:val="en-US"/>
         </w:rPr>
-        <w:t>: Inverse solution file used in Cartool</w:t>
-      </w:r>
+        <w:t xml:space="preserve">: Inverse solution file used in </w:t>
+      </w:r>
+      <w:proofErr w:type="spellStart"/>
+      <w:r>
+        <w:rPr>
+          <w:rFonts w:ascii="Calibri" w:hAnsi="Calibri" w:cs="Calibri"/>
+          <w:lang w:val="en-US"/>
+        </w:rPr>
+        <w:t>Cartool</w:t>
+      </w:r>
+      <w:proofErr w:type="spellEnd"/>
     </w:p>
     <w:p>
       <w:pPr>
@@ -1402,16 +1901,34 @@
           <w:rFonts w:ascii="Calibri" w:hAnsi="Calibri" w:cs="Calibri"/>
           <w:lang w:val="en-US"/>
         </w:rPr>
-        <w:t>.freq</w:t>
-      </w:r>
+        <w:t>.</w:t>
+      </w:r>
+      <w:proofErr w:type="spellStart"/>
+      <w:r>
+        <w:rPr>
+          <w:rFonts w:ascii="Calibri" w:hAnsi="Calibri" w:cs="Calibri"/>
+          <w:lang w:val="en-US"/>
+        </w:rPr>
+        <w:t>freq</w:t>
+      </w:r>
+      <w:proofErr w:type="spellEnd"/>
       <w:proofErr w:type="gramEnd"/>
       <w:r>
         <w:rPr>
           <w:rFonts w:ascii="Calibri" w:hAnsi="Calibri" w:cs="Calibri"/>
           <w:lang w:val="en-US"/>
         </w:rPr>
-        <w:t>: Frequency analysis file used in Cartool</w:t>
-      </w:r>
+        <w:t xml:space="preserve">: Frequency analysis file used in </w:t>
+      </w:r>
+      <w:proofErr w:type="spellStart"/>
+      <w:r>
+        <w:rPr>
+          <w:rFonts w:ascii="Calibri" w:hAnsi="Calibri" w:cs="Calibri"/>
+          <w:lang w:val="en-US"/>
+        </w:rPr>
+        <w:t>Cartool</w:t>
+      </w:r>
+      <w:proofErr w:type="spellEnd"/>
     </w:p>
     <w:p>
       <w:pPr>
@@ -1432,8 +1949,17 @@
           <w:rFonts w:ascii="Calibri" w:hAnsi="Calibri" w:cs="Calibri"/>
           <w:lang w:val="en-US"/>
         </w:rPr>
-        <w:t>.mrk</w:t>
-      </w:r>
+        <w:t>.</w:t>
+      </w:r>
+      <w:proofErr w:type="spellStart"/>
+      <w:r>
+        <w:rPr>
+          <w:rFonts w:ascii="Calibri" w:hAnsi="Calibri" w:cs="Calibri"/>
+          <w:lang w:val="en-US"/>
+        </w:rPr>
+        <w:t>mrk</w:t>
+      </w:r>
+      <w:proofErr w:type="spellEnd"/>
       <w:proofErr w:type="gramEnd"/>
       <w:r>
         <w:rPr>
@@ -1485,15 +2011,56 @@
           <w:rFonts w:ascii="Calibri" w:hAnsi="Calibri" w:cs="Calibri"/>
           <w:lang w:val="en-US"/>
         </w:rPr>
-        <w:t>.eeg/.vhdr</w:t>
-      </w:r>
+        <w:t>.</w:t>
+      </w:r>
+      <w:proofErr w:type="spellStart"/>
+      <w:r>
+        <w:rPr>
+          <w:rFonts w:ascii="Calibri" w:hAnsi="Calibri" w:cs="Calibri"/>
+          <w:lang w:val="en-US"/>
+        </w:rPr>
+        <w:t>eeg</w:t>
+      </w:r>
+      <w:proofErr w:type="spellEnd"/>
+      <w:r>
+        <w:rPr>
+          <w:rFonts w:ascii="Calibri" w:hAnsi="Calibri" w:cs="Calibri"/>
+          <w:lang w:val="en-US"/>
+        </w:rPr>
+        <w:t>/.</w:t>
+      </w:r>
+      <w:proofErr w:type="spellStart"/>
+      <w:r>
+        <w:rPr>
+          <w:rFonts w:ascii="Calibri" w:hAnsi="Calibri" w:cs="Calibri"/>
+          <w:lang w:val="en-US"/>
+        </w:rPr>
+        <w:t>vhdr</w:t>
+      </w:r>
+      <w:proofErr w:type="spellEnd"/>
       <w:proofErr w:type="gramEnd"/>
       <w:r>
         <w:rPr>
           <w:rFonts w:ascii="Calibri" w:hAnsi="Calibri" w:cs="Calibri"/>
           <w:lang w:val="en-US"/>
         </w:rPr>
-        <w:t xml:space="preserve">: file format from BrainVision recorder. This file format is automatically converted </w:t>
+        <w:t xml:space="preserve">: file format from </w:t>
+      </w:r>
+      <w:proofErr w:type="spellStart"/>
+      <w:r>
+        <w:rPr>
+          <w:rFonts w:ascii="Calibri" w:hAnsi="Calibri" w:cs="Calibri"/>
+          <w:lang w:val="en-US"/>
+        </w:rPr>
+        <w:t>BrainVision</w:t>
+      </w:r>
+      <w:proofErr w:type="spellEnd"/>
+      <w:r>
+        <w:rPr>
+          <w:rFonts w:ascii="Calibri" w:hAnsi="Calibri" w:cs="Calibri"/>
+          <w:lang w:val="en-US"/>
+        </w:rPr>
+        <w:t xml:space="preserve"> recorder. This file format is automatically converted </w:t>
       </w:r>
       <w:proofErr w:type="gramStart"/>
       <w:r>
@@ -1501,8 +2068,17 @@
           <w:rFonts w:ascii="Calibri" w:hAnsi="Calibri" w:cs="Calibri"/>
           <w:lang w:val="en-US"/>
         </w:rPr>
-        <w:t>to .set/.fdt</w:t>
-      </w:r>
+        <w:t>to .set/.</w:t>
+      </w:r>
+      <w:proofErr w:type="spellStart"/>
+      <w:r>
+        <w:rPr>
+          <w:rFonts w:ascii="Calibri" w:hAnsi="Calibri" w:cs="Calibri"/>
+          <w:lang w:val="en-US"/>
+        </w:rPr>
+        <w:t>fdt</w:t>
+      </w:r>
+      <w:proofErr w:type="spellEnd"/>
       <w:proofErr w:type="gramEnd"/>
       <w:r>
         <w:rPr>
@@ -1517,7 +2093,23 @@
           <w:lang w:val="en-US"/>
         </w:rPr>
         <w:lastRenderedPageBreak/>
-        <w:t xml:space="preserve">name (text to number conversion required). However, you can only import this specific file format. You must work with one of the above formats in EEGpal. </w:t>
+        <w:t xml:space="preserve">name (text to number conversion required). However, you can only import this specific file format. You must work with one of the above formats in </w:t>
+      </w:r>
+      <w:proofErr w:type="spellStart"/>
+      <w:r>
+        <w:rPr>
+          <w:rFonts w:ascii="Calibri" w:hAnsi="Calibri" w:cs="Calibri"/>
+          <w:lang w:val="en-US"/>
+        </w:rPr>
+        <w:t>EEGpal</w:t>
+      </w:r>
+      <w:proofErr w:type="spellEnd"/>
+      <w:r>
+        <w:rPr>
+          <w:rFonts w:ascii="Calibri" w:hAnsi="Calibri" w:cs="Calibri"/>
+          <w:lang w:val="en-US"/>
+        </w:rPr>
+        <w:t xml:space="preserve">. </w:t>
       </w:r>
     </w:p>
     <w:p>
@@ -1533,7 +2125,23 @@
           <w:rFonts w:ascii="Calibri" w:hAnsi="Calibri" w:cs="Calibri"/>
           <w:lang w:val="en-US"/>
         </w:rPr>
-        <w:t>The EEGpal toolbox offers the possibility to easily switch from one file format to the other, thanks to the export tool or the choice of output file format within each module.</w:t>
+        <w:t xml:space="preserve">The </w:t>
+      </w:r>
+      <w:proofErr w:type="spellStart"/>
+      <w:r>
+        <w:rPr>
+          <w:rFonts w:ascii="Calibri" w:hAnsi="Calibri" w:cs="Calibri"/>
+          <w:lang w:val="en-US"/>
+        </w:rPr>
+        <w:t>EEGpal</w:t>
+      </w:r>
+      <w:proofErr w:type="spellEnd"/>
+      <w:r>
+        <w:rPr>
+          <w:rFonts w:ascii="Calibri" w:hAnsi="Calibri" w:cs="Calibri"/>
+          <w:lang w:val="en-US"/>
+        </w:rPr>
+        <w:t xml:space="preserve"> toolbox offers the possibility to easily switch from one file format to the other, thanks to the export tool or the choice of output file format within each module.</w:t>
       </w:r>
     </w:p>
     <w:p>
@@ -1634,15 +2242,40 @@
           <w:rFonts w:ascii="Calibri" w:hAnsi="Calibri" w:cs="Calibri"/>
           <w:lang w:val="en-US"/>
         </w:rPr>
-        <w:t>for .bdf</w:t>
-      </w:r>
+        <w:t>for .</w:t>
+      </w:r>
+      <w:proofErr w:type="spellStart"/>
+      <w:r>
+        <w:rPr>
+          <w:rFonts w:ascii="Calibri" w:hAnsi="Calibri" w:cs="Calibri"/>
+          <w:lang w:val="en-US"/>
+        </w:rPr>
+        <w:t>bdf</w:t>
+      </w:r>
+      <w:proofErr w:type="spellEnd"/>
       <w:proofErr w:type="gramEnd"/>
       <w:r>
         <w:rPr>
           <w:rFonts w:ascii="Calibri" w:hAnsi="Calibri" w:cs="Calibri"/>
           <w:lang w:val="en-US"/>
         </w:rPr>
-        <w:t xml:space="preserve"> and .set file formats), while the markers are recorded in a separate text file named eeg_file.mrk (this is the case </w:t>
+        <w:t xml:space="preserve"> and .set file formats), while the markers are recorded in a separate text file named </w:t>
+      </w:r>
+      <w:proofErr w:type="spellStart"/>
+      <w:r>
+        <w:rPr>
+          <w:rFonts w:ascii="Calibri" w:hAnsi="Calibri" w:cs="Calibri"/>
+          <w:lang w:val="en-US"/>
+        </w:rPr>
+        <w:t>eeg_file.mrk</w:t>
+      </w:r>
+      <w:proofErr w:type="spellEnd"/>
+      <w:r>
+        <w:rPr>
+          <w:rFonts w:ascii="Calibri" w:hAnsi="Calibri" w:cs="Calibri"/>
+          <w:lang w:val="en-US"/>
+        </w:rPr>
+        <w:t xml:space="preserve"> (this is the case </w:t>
       </w:r>
       <w:proofErr w:type="gramStart"/>
       <w:r>
@@ -1650,7 +2283,23 @@
           <w:rFonts w:ascii="Calibri" w:hAnsi="Calibri" w:cs="Calibri"/>
           <w:lang w:val="en-US"/>
         </w:rPr>
-        <w:t>for .eph, .ep</w:t>
+        <w:t>for .</w:t>
+      </w:r>
+      <w:proofErr w:type="spellStart"/>
+      <w:r>
+        <w:rPr>
+          <w:rFonts w:ascii="Calibri" w:hAnsi="Calibri" w:cs="Calibri"/>
+          <w:lang w:val="en-US"/>
+        </w:rPr>
+        <w:t>eph</w:t>
+      </w:r>
+      <w:proofErr w:type="spellEnd"/>
+      <w:r>
+        <w:rPr>
+          <w:rFonts w:ascii="Calibri" w:hAnsi="Calibri" w:cs="Calibri"/>
+          <w:lang w:val="en-US"/>
+        </w:rPr>
+        <w:t>, .ep</w:t>
       </w:r>
       <w:proofErr w:type="gramEnd"/>
       <w:r>
@@ -1658,7 +2307,39 @@
           <w:rFonts w:ascii="Calibri" w:hAnsi="Calibri" w:cs="Calibri"/>
           <w:lang w:val="en-US"/>
         </w:rPr>
-        <w:t xml:space="preserve">, .sef file formats). EEGpal automatically detects these two cases and can handle them. </w:t>
+        <w:t>, .</w:t>
+      </w:r>
+      <w:proofErr w:type="spellStart"/>
+      <w:r>
+        <w:rPr>
+          <w:rFonts w:ascii="Calibri" w:hAnsi="Calibri" w:cs="Calibri"/>
+          <w:lang w:val="en-US"/>
+        </w:rPr>
+        <w:t>sef</w:t>
+      </w:r>
+      <w:proofErr w:type="spellEnd"/>
+      <w:r>
+        <w:rPr>
+          <w:rFonts w:ascii="Calibri" w:hAnsi="Calibri" w:cs="Calibri"/>
+          <w:lang w:val="en-US"/>
+        </w:rPr>
+        <w:t xml:space="preserve"> file formats). </w:t>
+      </w:r>
+      <w:proofErr w:type="spellStart"/>
+      <w:r>
+        <w:rPr>
+          <w:rFonts w:ascii="Calibri" w:hAnsi="Calibri" w:cs="Calibri"/>
+          <w:lang w:val="en-US"/>
+        </w:rPr>
+        <w:t>EEGpal</w:t>
+      </w:r>
+      <w:proofErr w:type="spellEnd"/>
+      <w:r>
+        <w:rPr>
+          <w:rFonts w:ascii="Calibri" w:hAnsi="Calibri" w:cs="Calibri"/>
+          <w:lang w:val="en-US"/>
+        </w:rPr>
+        <w:t xml:space="preserve"> automatically detects these two cases and can handle them. </w:t>
       </w:r>
     </w:p>
     <w:p>
@@ -1712,7 +2393,23 @@
           <w:rFonts w:ascii="Calibri" w:hAnsi="Calibri" w:cs="Calibri"/>
           <w:lang w:val="en-US"/>
         </w:rPr>
-        <w:t xml:space="preserve">ach time you perform a processing step with an EEGpal tool or module, a Processing Information File (PIF) is created. This is a text file containing a summary of all input and output files and processing parameters. It allows you to keep track of the steps you have performed. </w:t>
+        <w:t xml:space="preserve">ach time you perform a processing step with an </w:t>
+      </w:r>
+      <w:proofErr w:type="spellStart"/>
+      <w:r>
+        <w:rPr>
+          <w:rFonts w:ascii="Calibri" w:hAnsi="Calibri" w:cs="Calibri"/>
+          <w:lang w:val="en-US"/>
+        </w:rPr>
+        <w:t>EEGpal</w:t>
+      </w:r>
+      <w:proofErr w:type="spellEnd"/>
+      <w:r>
+        <w:rPr>
+          <w:rFonts w:ascii="Calibri" w:hAnsi="Calibri" w:cs="Calibri"/>
+          <w:lang w:val="en-US"/>
+        </w:rPr>
+        <w:t xml:space="preserve"> tool or module, a Processing Information File (PIF) is created. This is a text file containing a summary of all input and output files and processing parameters. It allows you to keep track of the steps you have performed. </w:t>
       </w:r>
     </w:p>
     <w:p>
@@ -1760,7 +2457,7 @@
                     <pic:cNvPicPr/>
                   </pic:nvPicPr>
                   <pic:blipFill>
-                    <a:blip r:embed="rId12"/>
+                    <a:blip r:embed="rId13"/>
                     <a:stretch>
                       <a:fillRect/>
                     </a:stretch>
@@ -1808,7 +2505,27 @@
           <w:lang w:val="en-US"/>
         </w:rPr>
         <w:lastRenderedPageBreak/>
-        <w:t>What is a typical EEG processing pipeline in EEGpal?</w:t>
+        <w:t xml:space="preserve">What is a typical EEG processing pipeline in </w:t>
+      </w:r>
+      <w:proofErr w:type="spellStart"/>
+      <w:r>
+        <w:rPr>
+          <w:rFonts w:ascii="Calibri" w:hAnsi="Calibri" w:cs="Calibri"/>
+          <w:b/>
+          <w:bCs/>
+          <w:lang w:val="en-US"/>
+        </w:rPr>
+        <w:t>EEGpal</w:t>
+      </w:r>
+      <w:proofErr w:type="spellEnd"/>
+      <w:r>
+        <w:rPr>
+          <w:rFonts w:ascii="Calibri" w:hAnsi="Calibri" w:cs="Calibri"/>
+          <w:b/>
+          <w:bCs/>
+          <w:lang w:val="en-US"/>
+        </w:rPr>
+        <w:t>?</w:t>
       </w:r>
     </w:p>
     <w:p>
@@ -1942,7 +2659,7 @@
                     <pic:cNvPicPr/>
                   </pic:nvPicPr>
                   <pic:blipFill>
-                    <a:blip r:embed="rId13"/>
+                    <a:blip r:embed="rId14"/>
                     <a:stretch>
                       <a:fillRect/>
                     </a:stretch>
@@ -2008,7 +2725,23 @@
           <w:rFonts w:ascii="Calibri" w:hAnsi="Calibri" w:cs="Calibri"/>
           <w:lang w:val="en-US"/>
         </w:rPr>
-        <w:t xml:space="preserve"> in the EEGpal main window: </w:t>
+        <w:t xml:space="preserve"> in the </w:t>
+      </w:r>
+      <w:proofErr w:type="spellStart"/>
+      <w:r>
+        <w:rPr>
+          <w:rFonts w:ascii="Calibri" w:hAnsi="Calibri" w:cs="Calibri"/>
+          <w:lang w:val="en-US"/>
+        </w:rPr>
+        <w:t>EEGpal</w:t>
+      </w:r>
+      <w:proofErr w:type="spellEnd"/>
+      <w:r>
+        <w:rPr>
+          <w:rFonts w:ascii="Calibri" w:hAnsi="Calibri" w:cs="Calibri"/>
+          <w:lang w:val="en-US"/>
+        </w:rPr>
+        <w:t xml:space="preserve"> main window: </w:t>
       </w:r>
     </w:p>
     <w:p>
@@ -2316,7 +3049,23 @@
           <w:rFonts w:ascii="Calibri" w:hAnsi="Calibri" w:cs="Calibri"/>
           <w:lang w:val="en-US"/>
         </w:rPr>
-        <w:t xml:space="preserve">: Save or load all the parameters that you have set in the various EEGpal modules. You can then program a batch to automatically run all the preprocessing steps </w:t>
+        <w:t xml:space="preserve">: Save or load all the parameters that you have set in the various </w:t>
+      </w:r>
+      <w:proofErr w:type="spellStart"/>
+      <w:r>
+        <w:rPr>
+          <w:rFonts w:ascii="Calibri" w:hAnsi="Calibri" w:cs="Calibri"/>
+          <w:lang w:val="en-US"/>
+        </w:rPr>
+        <w:t>EEGpal</w:t>
+      </w:r>
+      <w:proofErr w:type="spellEnd"/>
+      <w:r>
+        <w:rPr>
+          <w:rFonts w:ascii="Calibri" w:hAnsi="Calibri" w:cs="Calibri"/>
+          <w:lang w:val="en-US"/>
+        </w:rPr>
+        <w:t xml:space="preserve"> modules. You can then program a batch to automatically run all the preprocessing steps </w:t>
       </w:r>
     </w:p>
     <w:p>
@@ -2365,7 +3114,7 @@
                     <pic:cNvPicPr/>
                   </pic:nvPicPr>
                   <pic:blipFill>
-                    <a:blip r:embed="rId14"/>
+                    <a:blip r:embed="rId15"/>
                     <a:stretch>
                       <a:fillRect/>
                     </a:stretch>
@@ -2564,7 +3313,23 @@
           <w:rFonts w:ascii="Calibri" w:hAnsi="Calibri" w:cs="Calibri"/>
           <w:lang w:val="en-US"/>
         </w:rPr>
-        <w:t xml:space="preserve">Press the Input Folder button and select the directory containing all the EEG files you wish to import. These files can be placed in sub-directories. The toolbox will select all files corresponding to the search criteria defined in 1 and 2, whether they are in the main folder or in sub-folders. It takes some time to fill the list in the central panel. Give Matlab time to complete this list before doing anything. </w:t>
+        <w:t xml:space="preserve">Press the Input Folder button and select the directory containing all the EEG files you wish to import. These files can be placed in sub-directories. The toolbox will select all files corresponding to the search criteria defined in 1 and 2, whether they are in the main folder or in sub-folders. It takes some time to fill the list in the central panel. Give </w:t>
+      </w:r>
+      <w:proofErr w:type="spellStart"/>
+      <w:r>
+        <w:rPr>
+          <w:rFonts w:ascii="Calibri" w:hAnsi="Calibri" w:cs="Calibri"/>
+          <w:lang w:val="en-US"/>
+        </w:rPr>
+        <w:t>Matlab</w:t>
+      </w:r>
+      <w:proofErr w:type="spellEnd"/>
+      <w:r>
+        <w:rPr>
+          <w:rFonts w:ascii="Calibri" w:hAnsi="Calibri" w:cs="Calibri"/>
+          <w:lang w:val="en-US"/>
+        </w:rPr>
+        <w:t xml:space="preserve"> time to complete this list before doing anything. </w:t>
       </w:r>
     </w:p>
     <w:p>
@@ -2672,7 +3437,7 @@
                     <pic:cNvPicPr/>
                   </pic:nvPicPr>
                   <pic:blipFill>
-                    <a:blip r:embed="rId15"/>
+                    <a:blip r:embed="rId16"/>
                     <a:stretch>
                       <a:fillRect/>
                     </a:stretch>
@@ -2711,7 +3476,23 @@
           <w:rFonts w:ascii="Calibri" w:hAnsi="Calibri" w:cs="Calibri"/>
           <w:lang w:val="en-US"/>
         </w:rPr>
-        <w:t>To specify different subjects in the EEGPal toolbox, identify the participant code in the EEG name of the first entry in the data table.</w:t>
+        <w:t xml:space="preserve">To specify different subjects in the </w:t>
+      </w:r>
+      <w:proofErr w:type="spellStart"/>
+      <w:r>
+        <w:rPr>
+          <w:rFonts w:ascii="Calibri" w:hAnsi="Calibri" w:cs="Calibri"/>
+          <w:lang w:val="en-US"/>
+        </w:rPr>
+        <w:t>EEGPal</w:t>
+      </w:r>
+      <w:proofErr w:type="spellEnd"/>
+      <w:r>
+        <w:rPr>
+          <w:rFonts w:ascii="Calibri" w:hAnsi="Calibri" w:cs="Calibri"/>
+          <w:lang w:val="en-US"/>
+        </w:rPr>
+        <w:t xml:space="preserve"> toolbox, identify the participant code in the EEG name of the first entry in the data table.</w:t>
       </w:r>
       <w:r>
         <w:rPr>
@@ -2883,7 +3664,23 @@
           <w:rFonts w:ascii="Calibri" w:hAnsi="Calibri" w:cs="Calibri"/>
           <w:lang w:val="en-US"/>
         </w:rPr>
-        <w:t xml:space="preserve">Note: defining the participants is especially important for the ICA, Epoching and Full Design +Statistics modules. These steps are indeed required to </w:t>
+        <w:t xml:space="preserve">Note: defining the participants is especially important for the ICA, </w:t>
+      </w:r>
+      <w:proofErr w:type="spellStart"/>
+      <w:r>
+        <w:rPr>
+          <w:rFonts w:ascii="Calibri" w:hAnsi="Calibri" w:cs="Calibri"/>
+          <w:lang w:val="en-US"/>
+        </w:rPr>
+        <w:t>Epoching</w:t>
+      </w:r>
+      <w:proofErr w:type="spellEnd"/>
+      <w:r>
+        <w:rPr>
+          <w:rFonts w:ascii="Calibri" w:hAnsi="Calibri" w:cs="Calibri"/>
+          <w:lang w:val="en-US"/>
+        </w:rPr>
+        <w:t xml:space="preserve"> and Full Design +Statistics modules. These steps are indeed required to </w:t>
       </w:r>
       <w:proofErr w:type="gramStart"/>
       <w:r>
@@ -2959,7 +3756,7 @@
                     <pic:cNvPicPr/>
                   </pic:nvPicPr>
                   <pic:blipFill>
-                    <a:blip r:embed="rId16"/>
+                    <a:blip r:embed="rId17"/>
                     <a:stretch>
                       <a:fillRect/>
                     </a:stretch>
@@ -3006,7 +3803,23 @@
           <w:rFonts w:ascii="Calibri" w:hAnsi="Calibri" w:cs="Calibri"/>
           <w:lang w:val="en-US"/>
         </w:rPr>
-        <w:t>the .xyz, .els</w:t>
+        <w:t>the .</w:t>
+      </w:r>
+      <w:proofErr w:type="spellStart"/>
+      <w:r>
+        <w:rPr>
+          <w:rFonts w:ascii="Calibri" w:hAnsi="Calibri" w:cs="Calibri"/>
+          <w:lang w:val="en-US"/>
+        </w:rPr>
+        <w:t>xyz</w:t>
+      </w:r>
+      <w:proofErr w:type="spellEnd"/>
+      <w:r>
+        <w:rPr>
+          <w:rFonts w:ascii="Calibri" w:hAnsi="Calibri" w:cs="Calibri"/>
+          <w:lang w:val="en-US"/>
+        </w:rPr>
+        <w:t>, .els</w:t>
       </w:r>
       <w:proofErr w:type="gramEnd"/>
       <w:r>
@@ -3059,7 +3872,23 @@
           <w:rFonts w:ascii="Calibri" w:hAnsi="Calibri" w:cs="Calibri"/>
           <w:lang w:val="en-US"/>
         </w:rPr>
-        <w:t xml:space="preserve">In the current situation there are already two coordinate files for a 64 channel Biosemi configuration in the </w:t>
+        <w:t xml:space="preserve">In the current situation there are already two coordinate files for a 64 channel </w:t>
+      </w:r>
+      <w:proofErr w:type="spellStart"/>
+      <w:r>
+        <w:rPr>
+          <w:rFonts w:ascii="Calibri" w:hAnsi="Calibri" w:cs="Calibri"/>
+          <w:lang w:val="en-US"/>
+        </w:rPr>
+        <w:t>Biosemi</w:t>
+      </w:r>
+      <w:proofErr w:type="spellEnd"/>
+      <w:r>
+        <w:rPr>
+          <w:rFonts w:ascii="Calibri" w:hAnsi="Calibri" w:cs="Calibri"/>
+          <w:lang w:val="en-US"/>
+        </w:rPr>
+        <w:t xml:space="preserve"> configuration in the </w:t>
       </w:r>
       <w:r>
         <w:rPr>
@@ -3075,7 +3904,23 @@
           <w:rFonts w:ascii="Calibri" w:hAnsi="Calibri" w:cs="Calibri"/>
           <w:lang w:val="en-US"/>
         </w:rPr>
-        <w:t xml:space="preserve"> sub-folder of the EEGpal. The </w:t>
+        <w:t xml:space="preserve"> sub-folder of the </w:t>
+      </w:r>
+      <w:proofErr w:type="spellStart"/>
+      <w:r>
+        <w:rPr>
+          <w:rFonts w:ascii="Calibri" w:hAnsi="Calibri" w:cs="Calibri"/>
+          <w:lang w:val="en-US"/>
+        </w:rPr>
+        <w:t>EEGpal</w:t>
+      </w:r>
+      <w:proofErr w:type="spellEnd"/>
+      <w:r>
+        <w:rPr>
+          <w:rFonts w:ascii="Calibri" w:hAnsi="Calibri" w:cs="Calibri"/>
+          <w:lang w:val="en-US"/>
+        </w:rPr>
+        <w:t xml:space="preserve">. The </w:t>
       </w:r>
       <w:proofErr w:type="gramStart"/>
       <w:r>
@@ -3085,9 +3930,8 @@
           <w:iCs/>
           <w:lang w:val="en-US"/>
         </w:rPr>
-        <w:t>Biosemi64_Spherical_Name_Cz</w:t>
-      </w:r>
-      <w:proofErr w:type="gramEnd"/>
+        <w:t>Biosemi64_Spherical_Name_Cz.xyz</w:t>
+      </w:r>
       <w:r>
         <w:rPr>
           <w:rFonts w:ascii="Calibri" w:hAnsi="Calibri" w:cs="Calibri"/>
@@ -3095,7 +3939,96 @@
           <w:iCs/>
           <w:lang w:val="en-US"/>
         </w:rPr>
-        <w:t>.xyz</w:t>
+        <w:t xml:space="preserve"> </w:t>
+      </w:r>
+      <w:r>
+        <w:rPr>
+          <w:rFonts w:ascii="Calibri" w:hAnsi="Calibri" w:cs="Calibri"/>
+          <w:lang w:val="en-US"/>
+        </w:rPr>
+        <w:t xml:space="preserve"> file</w:t>
+      </w:r>
+      <w:proofErr w:type="gramEnd"/>
+      <w:r>
+        <w:rPr>
+          <w:rFonts w:ascii="Calibri" w:hAnsi="Calibri" w:cs="Calibri"/>
+          <w:lang w:val="en-US"/>
+        </w:rPr>
+        <w:t xml:space="preserve"> contains the coordinates found on the official </w:t>
+      </w:r>
+      <w:proofErr w:type="spellStart"/>
+      <w:r>
+        <w:rPr>
+          <w:rFonts w:ascii="Calibri" w:hAnsi="Calibri" w:cs="Calibri"/>
+          <w:lang w:val="en-US"/>
+        </w:rPr>
+        <w:t>Biosemi</w:t>
+      </w:r>
+      <w:proofErr w:type="spellEnd"/>
+      <w:r>
+        <w:rPr>
+          <w:rFonts w:ascii="Calibri" w:hAnsi="Calibri" w:cs="Calibri"/>
+          <w:lang w:val="en-US"/>
+        </w:rPr>
+        <w:t xml:space="preserve"> website with a spherical distribution of electrodes</w:t>
+      </w:r>
+      <w:r>
+        <w:rPr>
+          <w:rFonts w:ascii="Calibri" w:hAnsi="Calibri" w:cs="Calibri"/>
+          <w:lang w:val="en-US"/>
+        </w:rPr>
+        <w:t xml:space="preserve"> with international electrode name</w:t>
+      </w:r>
+      <w:r>
+        <w:rPr>
+          <w:rFonts w:ascii="Calibri" w:hAnsi="Calibri" w:cs="Calibri"/>
+          <w:lang w:val="en-US"/>
+        </w:rPr>
+        <w:t>.</w:t>
+      </w:r>
+      <w:r>
+        <w:rPr>
+          <w:rFonts w:ascii="Calibri" w:hAnsi="Calibri" w:cs="Calibri"/>
+          <w:lang w:val="en-US"/>
+        </w:rPr>
+        <w:t xml:space="preserve"> The file </w:t>
+      </w:r>
+      <w:r>
+        <w:rPr>
+          <w:rFonts w:ascii="Calibri" w:hAnsi="Calibri" w:cs="Calibri"/>
+          <w:lang w:val="en-US"/>
+        </w:rPr>
+        <w:t>Biosemi64_Spherical_Name_AB.locs</w:t>
+      </w:r>
+      <w:r>
+        <w:rPr>
+          <w:rFonts w:ascii="Calibri" w:hAnsi="Calibri" w:cs="Calibri"/>
+          <w:lang w:val="en-US"/>
+        </w:rPr>
+        <w:t xml:space="preserve"> is the same as the before but in EEGLAB format and with </w:t>
+      </w:r>
+      <w:proofErr w:type="spellStart"/>
+      <w:r>
+        <w:rPr>
+          <w:rFonts w:ascii="Calibri" w:hAnsi="Calibri" w:cs="Calibri"/>
+          <w:lang w:val="en-US"/>
+        </w:rPr>
+        <w:t>Biosemi</w:t>
+      </w:r>
+      <w:proofErr w:type="spellEnd"/>
+      <w:r>
+        <w:rPr>
+          <w:rFonts w:ascii="Calibri" w:hAnsi="Calibri" w:cs="Calibri"/>
+          <w:lang w:val="en-US"/>
+        </w:rPr>
+        <w:t xml:space="preserve"> electrode name (AB)</w:t>
+      </w:r>
+      <w:r>
+        <w:rPr>
+          <w:rFonts w:ascii="Calibri" w:hAnsi="Calibri" w:cs="Calibri"/>
+          <w:lang w:val="en-US"/>
+        </w:rPr>
+        <w:t xml:space="preserve"> The file </w:t>
       </w:r>
       <w:r>
         <w:rPr>
@@ -3104,41 +4037,6 @@
           <w:iCs/>
           <w:lang w:val="en-US"/>
         </w:rPr>
-        <w:t xml:space="preserve"> </w:t>
-      </w:r>
-      <w:r>
-        <w:rPr>
-          <w:rFonts w:ascii="Calibri" w:hAnsi="Calibri" w:cs="Calibri"/>
-          <w:lang w:val="en-US"/>
-        </w:rPr>
-        <w:t xml:space="preserve"> file contains the coordinates found on the official Biosemi website with a spherical distribution of electrodes</w:t>
-      </w:r>
-      <w:r>
-        <w:rPr>
-          <w:rFonts w:ascii="Calibri" w:hAnsi="Calibri" w:cs="Calibri"/>
-          <w:lang w:val="en-US"/>
-        </w:rPr>
-        <w:t xml:space="preserve"> with international electrode name</w:t>
-      </w:r>
-      <w:r>
-        <w:rPr>
-          <w:rFonts w:ascii="Calibri" w:hAnsi="Calibri" w:cs="Calibri"/>
-          <w:lang w:val="en-US"/>
-        </w:rPr>
-        <w:t>.</w:t>
-      </w:r>
-      <w:r>
-        <w:rPr>
-          <w:rFonts w:ascii="Calibri" w:hAnsi="Calibri" w:cs="Calibri"/>
-          <w:lang w:val="en-US"/>
-        </w:rPr>
-        <w:t xml:space="preserve"> The file </w:t>
-      </w:r>
-      <w:r>
-        <w:rPr>
-          <w:rFonts w:ascii="Calibri" w:hAnsi="Calibri" w:cs="Calibri"/>
-          <w:lang w:val="en-US"/>
-        </w:rPr>
         <w:t>Biosemi64_Spherical_Name_AB.locs</w:t>
       </w:r>
       <w:r>
@@ -3146,14 +4044,69 @@
           <w:rFonts w:ascii="Calibri" w:hAnsi="Calibri" w:cs="Calibri"/>
           <w:lang w:val="en-US"/>
         </w:rPr>
-        <w:t xml:space="preserve"> is the same as the before but in EEGLAB format and with Biosemi electrode name (AB)</w:t>
-      </w:r>
-      <w:r>
-        <w:rPr>
-          <w:rFonts w:ascii="Calibri" w:hAnsi="Calibri" w:cs="Calibri"/>
-          <w:lang w:val="en-US"/>
-        </w:rPr>
-        <w:t xml:space="preserve"> The file </w:t>
+        <w:t xml:space="preserve"> is an oval distribution of the electrodes after </w:t>
+      </w:r>
+      <w:proofErr w:type="spellStart"/>
+      <w:r>
+        <w:rPr>
+          <w:rFonts w:ascii="Calibri" w:hAnsi="Calibri" w:cs="Calibri"/>
+          <w:lang w:val="en-US"/>
+        </w:rPr>
+        <w:t>coregistration</w:t>
+      </w:r>
+      <w:proofErr w:type="spellEnd"/>
+      <w:r>
+        <w:rPr>
+          <w:rFonts w:ascii="Calibri" w:hAnsi="Calibri" w:cs="Calibri"/>
+          <w:lang w:val="en-US"/>
+        </w:rPr>
+        <w:t xml:space="preserve"> with the MNI template in </w:t>
+      </w:r>
+      <w:proofErr w:type="spellStart"/>
+      <w:r>
+        <w:rPr>
+          <w:rFonts w:ascii="Calibri" w:hAnsi="Calibri" w:cs="Calibri"/>
+          <w:lang w:val="en-US"/>
+        </w:rPr>
+        <w:t>Cartool</w:t>
+      </w:r>
+      <w:proofErr w:type="spellEnd"/>
+      <w:r>
+        <w:rPr>
+          <w:rFonts w:ascii="Calibri" w:hAnsi="Calibri" w:cs="Calibri"/>
+          <w:lang w:val="en-US"/>
+        </w:rPr>
+        <w:t xml:space="preserve"> (more physiologically accurate)</w:t>
+      </w:r>
+      <w:r>
+        <w:rPr>
+          <w:rFonts w:ascii="Calibri" w:hAnsi="Calibri" w:cs="Calibri"/>
+          <w:lang w:val="en-US"/>
+        </w:rPr>
+        <w:t xml:space="preserve"> with </w:t>
+      </w:r>
+      <w:proofErr w:type="spellStart"/>
+      <w:r>
+        <w:rPr>
+          <w:rFonts w:ascii="Calibri" w:hAnsi="Calibri" w:cs="Calibri"/>
+          <w:lang w:val="en-US"/>
+        </w:rPr>
+        <w:t>Biosemi</w:t>
+      </w:r>
+      <w:proofErr w:type="spellEnd"/>
+      <w:r>
+        <w:rPr>
+          <w:rFonts w:ascii="Calibri" w:hAnsi="Calibri" w:cs="Calibri"/>
+          <w:lang w:val="en-US"/>
+        </w:rPr>
+        <w:t xml:space="preserve"> electrode name (AB)</w:t>
+      </w:r>
+      <w:r>
+        <w:rPr>
+          <w:rFonts w:ascii="Calibri" w:hAnsi="Calibri" w:cs="Calibri"/>
+          <w:lang w:val="en-US"/>
+        </w:rPr>
+        <w:t xml:space="preserve">. </w:t>
       </w:r>
       <w:r>
         <w:rPr>
@@ -3162,36 +4115,6 @@
           <w:iCs/>
           <w:lang w:val="en-US"/>
         </w:rPr>
-        <w:t>Biosemi64_Spherical_Name_AB.locs</w:t>
-      </w:r>
-      <w:r>
-        <w:rPr>
-          <w:rFonts w:ascii="Calibri" w:hAnsi="Calibri" w:cs="Calibri"/>
-          <w:lang w:val="en-US"/>
-        </w:rPr>
-        <w:t xml:space="preserve"> is an oval distribution of the electrodes after coregistration with the MNI template in Cartool (more physiologically accurate)</w:t>
-      </w:r>
-      <w:r>
-        <w:rPr>
-          <w:rFonts w:ascii="Calibri" w:hAnsi="Calibri" w:cs="Calibri"/>
-          <w:lang w:val="en-US"/>
-        </w:rPr>
-        <w:t xml:space="preserve"> with Biosemi electrode name (AB)</w:t>
-      </w:r>
-      <w:r>
-        <w:rPr>
-          <w:rFonts w:ascii="Calibri" w:hAnsi="Calibri" w:cs="Calibri"/>
-          <w:lang w:val="en-US"/>
-        </w:rPr>
-        <w:t xml:space="preserve">. </w:t>
-      </w:r>
-      <w:r>
-        <w:rPr>
-          <w:rFonts w:ascii="Calibri" w:hAnsi="Calibri" w:cs="Calibri"/>
-          <w:i/>
-          <w:iCs/>
-          <w:lang w:val="en-US"/>
-        </w:rPr>
         <w:t>BrainVision64elec.locs</w:t>
       </w:r>
       <w:r>
@@ -3199,7 +4122,23 @@
           <w:rFonts w:ascii="Calibri" w:hAnsi="Calibri" w:cs="Calibri"/>
           <w:lang w:val="en-US"/>
         </w:rPr>
-        <w:t xml:space="preserve"> contain a 64 configuration with a BrainVision system.</w:t>
+        <w:t xml:space="preserve"> contain a 64 configuration with a </w:t>
+      </w:r>
+      <w:proofErr w:type="spellStart"/>
+      <w:r>
+        <w:rPr>
+          <w:rFonts w:ascii="Calibri" w:hAnsi="Calibri" w:cs="Calibri"/>
+          <w:lang w:val="en-US"/>
+        </w:rPr>
+        <w:t>BrainVision</w:t>
+      </w:r>
+      <w:proofErr w:type="spellEnd"/>
+      <w:r>
+        <w:rPr>
+          <w:rFonts w:ascii="Calibri" w:hAnsi="Calibri" w:cs="Calibri"/>
+          <w:lang w:val="en-US"/>
+        </w:rPr>
+        <w:t xml:space="preserve"> system.</w:t>
       </w:r>
       <w:r>
         <w:rPr>
@@ -3214,7 +4153,23 @@
           <w:lang w:val="en-US"/>
         </w:rPr>
         <w:br/>
-        <w:t>You can add your own coordinate file directly in the Resource sub-folder of EEGpal to gain time.</w:t>
+        <w:t xml:space="preserve">You can add your own coordinate file directly in the Resource sub-folder of </w:t>
+      </w:r>
+      <w:proofErr w:type="spellStart"/>
+      <w:r>
+        <w:rPr>
+          <w:rFonts w:ascii="Calibri" w:hAnsi="Calibri" w:cs="Calibri"/>
+          <w:lang w:val="en-US"/>
+        </w:rPr>
+        <w:t>EEGpal</w:t>
+      </w:r>
+      <w:proofErr w:type="spellEnd"/>
+      <w:r>
+        <w:rPr>
+          <w:rFonts w:ascii="Calibri" w:hAnsi="Calibri" w:cs="Calibri"/>
+          <w:lang w:val="en-US"/>
+        </w:rPr>
+        <w:t xml:space="preserve"> to gain time.</w:t>
       </w:r>
     </w:p>
     <w:p>
@@ -3430,7 +4385,7 @@
                     <pic:cNvPicPr/>
                   </pic:nvPicPr>
                   <pic:blipFill>
-                    <a:blip r:embed="rId17"/>
+                    <a:blip r:embed="rId18"/>
                     <a:stretch>
                       <a:fillRect/>
                     </a:stretch>
@@ -3469,7 +4424,71 @@
           <w:rFonts w:ascii="Calibri" w:hAnsi="Calibri" w:cs="Calibri"/>
           <w:lang w:val="en-US"/>
         </w:rPr>
-        <w:t>Select the output format (.sef, .eph, .ep for Cartool or .set for eeglab)</w:t>
+        <w:t>Select the output format (.</w:t>
+      </w:r>
+      <w:proofErr w:type="spellStart"/>
+      <w:r>
+        <w:rPr>
+          <w:rFonts w:ascii="Calibri" w:hAnsi="Calibri" w:cs="Calibri"/>
+          <w:lang w:val="en-US"/>
+        </w:rPr>
+        <w:t>sef</w:t>
+      </w:r>
+      <w:proofErr w:type="spellEnd"/>
+      <w:r>
+        <w:rPr>
+          <w:rFonts w:ascii="Calibri" w:hAnsi="Calibri" w:cs="Calibri"/>
+          <w:lang w:val="en-US"/>
+        </w:rPr>
+        <w:t>, .</w:t>
+      </w:r>
+      <w:proofErr w:type="spellStart"/>
+      <w:r>
+        <w:rPr>
+          <w:rFonts w:ascii="Calibri" w:hAnsi="Calibri" w:cs="Calibri"/>
+          <w:lang w:val="en-US"/>
+        </w:rPr>
+        <w:t>eph</w:t>
+      </w:r>
+      <w:proofErr w:type="spellEnd"/>
+      <w:r>
+        <w:rPr>
+          <w:rFonts w:ascii="Calibri" w:hAnsi="Calibri" w:cs="Calibri"/>
+          <w:lang w:val="en-US"/>
+        </w:rPr>
+        <w:t xml:space="preserve">, .ep for </w:t>
+      </w:r>
+      <w:proofErr w:type="spellStart"/>
+      <w:r>
+        <w:rPr>
+          <w:rFonts w:ascii="Calibri" w:hAnsi="Calibri" w:cs="Calibri"/>
+          <w:lang w:val="en-US"/>
+        </w:rPr>
+        <w:t>Cartool</w:t>
+      </w:r>
+      <w:proofErr w:type="spellEnd"/>
+      <w:r>
+        <w:rPr>
+          <w:rFonts w:ascii="Calibri" w:hAnsi="Calibri" w:cs="Calibri"/>
+          <w:lang w:val="en-US"/>
+        </w:rPr>
+        <w:t xml:space="preserve"> or .set for </w:t>
+      </w:r>
+      <w:proofErr w:type="spellStart"/>
+      <w:r>
+        <w:rPr>
+          <w:rFonts w:ascii="Calibri" w:hAnsi="Calibri" w:cs="Calibri"/>
+          <w:lang w:val="en-US"/>
+        </w:rPr>
+        <w:t>eeglab</w:t>
+      </w:r>
+      <w:proofErr w:type="spellEnd"/>
+      <w:r>
+        <w:rPr>
+          <w:rFonts w:ascii="Calibri" w:hAnsi="Calibri" w:cs="Calibri"/>
+          <w:lang w:val="en-US"/>
+        </w:rPr>
+        <w:t>)</w:t>
       </w:r>
     </w:p>
     <w:p>
@@ -3577,7 +4596,7 @@
                     <pic:cNvPicPr/>
                   </pic:nvPicPr>
                   <pic:blipFill>
-                    <a:blip r:embed="rId18"/>
+                    <a:blip r:embed="rId19"/>
                     <a:stretch>
                       <a:fillRect/>
                     </a:stretch>
@@ -3612,7 +4631,23 @@
           <w:rFonts w:ascii="Calibri" w:hAnsi="Calibri" w:cs="Calibri"/>
           <w:lang w:val="en-US"/>
         </w:rPr>
-        <w:t xml:space="preserve">The first preprocessing step is to detect any bridges (where two or more electrodes are connected due to gel leakage, resulting in them recording the same signal). It is specially important to detect and remove these bridge if you perform ICA decomposition or Inverse solution analysis. </w:t>
+        <w:t xml:space="preserve">The first preprocessing step is to detect any bridges (where two or more electrodes are connected due to gel leakage, resulting in them recording the same signal). It is </w:t>
+      </w:r>
+      <w:proofErr w:type="spellStart"/>
+      <w:r>
+        <w:rPr>
+          <w:rFonts w:ascii="Calibri" w:hAnsi="Calibri" w:cs="Calibri"/>
+          <w:lang w:val="en-US"/>
+        </w:rPr>
+        <w:t>specially</w:t>
+      </w:r>
+      <w:proofErr w:type="spellEnd"/>
+      <w:r>
+        <w:rPr>
+          <w:rFonts w:ascii="Calibri" w:hAnsi="Calibri" w:cs="Calibri"/>
+          <w:lang w:val="en-US"/>
+        </w:rPr>
+        <w:t xml:space="preserve"> important to detect and remove these bridge if you perform ICA decomposition or Inverse solution analysis. </w:t>
       </w:r>
     </w:p>
     <w:p>
@@ -3652,14 +4687,62 @@
           <w:rFonts w:ascii="Calibri" w:hAnsi="Calibri" w:cs="Calibri"/>
           <w:lang w:val="en-US"/>
         </w:rPr>
-        <w:t xml:space="preserve">module calls the eeglab script eBridge </w:t>
-      </w:r>
-      <w:r>
-        <w:rPr>
-          <w:rFonts w:ascii="Calibri" w:hAnsi="Calibri" w:cs="Calibri"/>
-          <w:lang w:val="en-US"/>
-        </w:rPr>
-        <w:t xml:space="preserve">(Alschuler et al (2014). Clin Neurophysiol, 125(3), 484-490.) </w:t>
+        <w:t xml:space="preserve">module calls the </w:t>
+      </w:r>
+      <w:proofErr w:type="spellStart"/>
+      <w:r>
+        <w:rPr>
+          <w:rFonts w:ascii="Calibri" w:hAnsi="Calibri" w:cs="Calibri"/>
+          <w:lang w:val="en-US"/>
+        </w:rPr>
+        <w:t>eeglab</w:t>
+      </w:r>
+      <w:proofErr w:type="spellEnd"/>
+      <w:r>
+        <w:rPr>
+          <w:rFonts w:ascii="Calibri" w:hAnsi="Calibri" w:cs="Calibri"/>
+          <w:lang w:val="en-US"/>
+        </w:rPr>
+        <w:t xml:space="preserve"> script </w:t>
+      </w:r>
+      <w:proofErr w:type="spellStart"/>
+      <w:r>
+        <w:rPr>
+          <w:rFonts w:ascii="Calibri" w:hAnsi="Calibri" w:cs="Calibri"/>
+          <w:lang w:val="en-US"/>
+        </w:rPr>
+        <w:t>eBridge</w:t>
+      </w:r>
+      <w:proofErr w:type="spellEnd"/>
+      <w:r>
+        <w:rPr>
+          <w:rFonts w:ascii="Calibri" w:hAnsi="Calibri" w:cs="Calibri"/>
+          <w:lang w:val="en-US"/>
+        </w:rPr>
+        <w:t xml:space="preserve"> </w:t>
+      </w:r>
+      <w:r>
+        <w:rPr>
+          <w:rFonts w:ascii="Calibri" w:hAnsi="Calibri" w:cs="Calibri"/>
+          <w:lang w:val="en-US"/>
+        </w:rPr>
+        <w:t xml:space="preserve">(Alschuler et al (2014). Clin </w:t>
+      </w:r>
+      <w:proofErr w:type="spellStart"/>
+      <w:r>
+        <w:rPr>
+          <w:rFonts w:ascii="Calibri" w:hAnsi="Calibri" w:cs="Calibri"/>
+          <w:lang w:val="en-US"/>
+        </w:rPr>
+        <w:t>Neurophysiol</w:t>
+      </w:r>
+      <w:proofErr w:type="spellEnd"/>
+      <w:r>
+        <w:rPr>
+          <w:rFonts w:ascii="Calibri" w:hAnsi="Calibri" w:cs="Calibri"/>
+          <w:lang w:val="en-US"/>
+        </w:rPr>
+        <w:t xml:space="preserve">, 125(3), 484-490.) </w:t>
       </w:r>
       <w:r>
         <w:rPr>
@@ -3803,7 +4886,7 @@
                     <pic:cNvPicPr/>
                   </pic:nvPicPr>
                   <pic:blipFill>
-                    <a:blip r:embed="rId19"/>
+                    <a:blip r:embed="rId20"/>
                     <a:stretch>
                       <a:fillRect/>
                     </a:stretch>
@@ -3838,12 +4921,21 @@
           <w:lang w:val="en-US"/>
         </w:rPr>
       </w:pPr>
-      <w:r>
-        <w:rPr>
-          <w:rFonts w:ascii="Calibri" w:hAnsi="Calibri" w:cs="Calibri"/>
-          <w:lang w:val="en-US"/>
-        </w:rPr>
-        <w:t>EEGpal is a program that is easy to use, and these manuals will help new users to learn how to use it. They also provide information about the background knowledge required for using the program.</w:t>
+      <w:proofErr w:type="spellStart"/>
+      <w:r>
+        <w:rPr>
+          <w:rFonts w:ascii="Calibri" w:hAnsi="Calibri" w:cs="Calibri"/>
+          <w:lang w:val="en-US"/>
+        </w:rPr>
+        <w:t>EEGpal</w:t>
+      </w:r>
+      <w:proofErr w:type="spellEnd"/>
+      <w:r>
+        <w:rPr>
+          <w:rFonts w:ascii="Calibri" w:hAnsi="Calibri" w:cs="Calibri"/>
+          <w:lang w:val="en-US"/>
+        </w:rPr>
+        <w:t xml:space="preserve"> is a program that is easy to use, and these manuals will help new users to learn how to use it. They also provide information about the background knowledge required for using the program.</w:t>
       </w:r>
     </w:p>
     <w:p>
@@ -3912,7 +5004,7 @@
                     <pic:cNvPicPr/>
                   </pic:nvPicPr>
                   <pic:blipFill>
-                    <a:blip r:embed="rId20"/>
+                    <a:blip r:embed="rId21"/>
                     <a:stretch>
                       <a:fillRect/>
                     </a:stretch>
@@ -3945,7 +5037,23 @@
           <w:rFonts w:ascii="Calibri" w:hAnsi="Calibri" w:cs="Calibri"/>
           <w:lang w:val="en-US"/>
         </w:rPr>
-        <w:t xml:space="preserve">The Processing/Analysis parameter plays an important role in how EEGpal functions. It stores all the parameters that you enter into the various processing and analysis modules. When you open a module and set the processing parameters (for example, adding a notch filter at 50 Hz in the Filtering+ module), clicking the </w:t>
+        <w:t xml:space="preserve">The Processing/Analysis parameter plays an important role in how </w:t>
+      </w:r>
+      <w:proofErr w:type="spellStart"/>
+      <w:r>
+        <w:rPr>
+          <w:rFonts w:ascii="Calibri" w:hAnsi="Calibri" w:cs="Calibri"/>
+          <w:lang w:val="en-US"/>
+        </w:rPr>
+        <w:t>EEGpal</w:t>
+      </w:r>
+      <w:proofErr w:type="spellEnd"/>
+      <w:r>
+        <w:rPr>
+          <w:rFonts w:ascii="Calibri" w:hAnsi="Calibri" w:cs="Calibri"/>
+          <w:lang w:val="en-US"/>
+        </w:rPr>
+        <w:t xml:space="preserve"> functions. It stores all the parameters that you enter into the various processing and analysis modules. When you open a module and set the processing parameters (for example, adding a notch filter at 50 Hz in the Filtering+ module), clicking the </w:t>
       </w:r>
       <w:r>
         <w:rPr>
@@ -3975,7 +5083,23 @@
           <w:rFonts w:ascii="Calibri" w:hAnsi="Calibri" w:cs="Calibri"/>
           <w:lang w:val="en-US"/>
         </w:rPr>
-        <w:t>1) will save the changes to the parameter file in the main window. This means that when you open the Filtering+ module again, it will be restored to the exact state it was in when you left it. This is useful for restoring all your processing choices when you open EEGpal again later.</w:t>
+        <w:t xml:space="preserve">1) will save the changes to the parameter file in the main window. This means that when you open the Filtering+ module again, it will be restored to the exact state it was in when you left it. This is useful for restoring all your processing choices when you open </w:t>
+      </w:r>
+      <w:proofErr w:type="spellStart"/>
+      <w:r>
+        <w:rPr>
+          <w:rFonts w:ascii="Calibri" w:hAnsi="Calibri" w:cs="Calibri"/>
+          <w:lang w:val="en-US"/>
+        </w:rPr>
+        <w:t>EEGpal</w:t>
+      </w:r>
+      <w:proofErr w:type="spellEnd"/>
+      <w:r>
+        <w:rPr>
+          <w:rFonts w:ascii="Calibri" w:hAnsi="Calibri" w:cs="Calibri"/>
+          <w:lang w:val="en-US"/>
+        </w:rPr>
+        <w:t xml:space="preserve"> again later.</w:t>
       </w:r>
       <w:r>
         <w:rPr>
@@ -4062,6 +5186,7 @@
         </w:rPr>
         <w:t xml:space="preserve"> button. Click this to transfer your chosen parameters to the </w:t>
       </w:r>
+      <w:proofErr w:type="spellStart"/>
       <w:r>
         <w:rPr>
           <w:rFonts w:ascii="Calibri" w:hAnsi="Calibri" w:cs="Calibri"/>
@@ -4071,12 +5196,29 @@
         </w:rPr>
         <w:t>SessionParameters</w:t>
       </w:r>
-      <w:r>
-        <w:rPr>
-          <w:rFonts w:ascii="Calibri" w:hAnsi="Calibri" w:cs="Calibri"/>
-          <w:lang w:val="en-US"/>
-        </w:rPr>
-        <w:t xml:space="preserve"> variable in the EEGpal main window. Please note that selecting the </w:t>
+      <w:proofErr w:type="spellEnd"/>
+      <w:r>
+        <w:rPr>
+          <w:rFonts w:ascii="Calibri" w:hAnsi="Calibri" w:cs="Calibri"/>
+          <w:lang w:val="en-US"/>
+        </w:rPr>
+        <w:t xml:space="preserve"> variable in the </w:t>
+      </w:r>
+      <w:proofErr w:type="spellStart"/>
+      <w:r>
+        <w:rPr>
+          <w:rFonts w:ascii="Calibri" w:hAnsi="Calibri" w:cs="Calibri"/>
+          <w:lang w:val="en-US"/>
+        </w:rPr>
+        <w:t>EEGpal</w:t>
+      </w:r>
+      <w:proofErr w:type="spellEnd"/>
+      <w:r>
+        <w:rPr>
+          <w:rFonts w:ascii="Calibri" w:hAnsi="Calibri" w:cs="Calibri"/>
+          <w:lang w:val="en-US"/>
+        </w:rPr>
+        <w:t xml:space="preserve"> main window. Please note that selecting the </w:t>
       </w:r>
       <w:r>
         <w:rPr>
@@ -4344,7 +5486,23 @@
           <w:rFonts w:ascii="Calibri" w:hAnsi="Calibri" w:cs="Calibri"/>
           <w:lang w:val="en-US"/>
         </w:rPr>
-        <w:t>The small tick mark displayed behind the button indicates whether EEGpal is currently processing a batch.</w:t>
+        <w:t xml:space="preserve">The small tick mark displayed behind the button indicates whether </w:t>
+      </w:r>
+      <w:proofErr w:type="spellStart"/>
+      <w:r>
+        <w:rPr>
+          <w:rFonts w:ascii="Calibri" w:hAnsi="Calibri" w:cs="Calibri"/>
+          <w:lang w:val="en-US"/>
+        </w:rPr>
+        <w:t>EEGpal</w:t>
+      </w:r>
+      <w:proofErr w:type="spellEnd"/>
+      <w:r>
+        <w:rPr>
+          <w:rFonts w:ascii="Calibri" w:hAnsi="Calibri" w:cs="Calibri"/>
+          <w:lang w:val="en-US"/>
+        </w:rPr>
+        <w:t xml:space="preserve"> is currently processing a batch.</w:t>
       </w:r>
       <w:r>
         <w:rPr>
@@ -4476,7 +5634,7 @@
           <w:bCs/>
           <w:lang w:val="en-US"/>
         </w:rPr>
-        <w:t xml:space="preserve"> (all systems except Biosemi)</w:t>
+        <w:t xml:space="preserve"> </w:t>
       </w:r>
     </w:p>
     <w:p>
@@ -4496,7 +5654,23 @@
           <w:rFonts w:ascii="Calibri" w:hAnsi="Calibri" w:cs="Calibri"/>
           <w:lang w:val="en-US"/>
         </w:rPr>
-        <w:t xml:space="preserve">Import raw data into the main EEGpal windows and identify the subject as explained in the chapter </w:t>
+        <w:t xml:space="preserve">Import raw data into the main </w:t>
+      </w:r>
+      <w:proofErr w:type="spellStart"/>
+      <w:r>
+        <w:rPr>
+          <w:rFonts w:ascii="Calibri" w:hAnsi="Calibri" w:cs="Calibri"/>
+          <w:lang w:val="en-US"/>
+        </w:rPr>
+        <w:t>EEGpal</w:t>
+      </w:r>
+      <w:proofErr w:type="spellEnd"/>
+      <w:r>
+        <w:rPr>
+          <w:rFonts w:ascii="Calibri" w:hAnsi="Calibri" w:cs="Calibri"/>
+          <w:lang w:val="en-US"/>
+        </w:rPr>
+        <w:t xml:space="preserve"> windows and identify the subject as explained in the chapter </w:t>
       </w:r>
       <w:r>
         <w:rPr>
@@ -4603,7 +5777,119 @@
           <w:rFonts w:ascii="Calibri" w:hAnsi="Calibri" w:cs="Calibri"/>
           <w:lang w:val="en-US"/>
         </w:rPr>
-        <w:t>If you are working with the Biosemi system, EEGLAB and FieldTrip community tend to start by referencing the signal to the Cz electrode. This is because the common mode correction is not perfect (see https://www.fieldtriptoolbox.org/faq/preproc/dataformat/biosemi_reference/ and https://www.biosemi.com/faq/cms&amp;drl.htm). However, this has the consequence of removing one electrode, which must be ignored in ICA decomposition (decreasing the rank). If you use ICA to remove large artefacts, such as those caused by the eyes or muscles, the final results are the same whether or not this initial re-referencing is performed. Biosemi specifies that rereferencing is required, which is always done on the average reference before epoching. Whether or not to add this supplementary reference to Cz is up to you.</w:t>
+        <w:t xml:space="preserve">If you are working with the </w:t>
+      </w:r>
+      <w:proofErr w:type="spellStart"/>
+      <w:r>
+        <w:rPr>
+          <w:rFonts w:ascii="Calibri" w:hAnsi="Calibri" w:cs="Calibri"/>
+          <w:lang w:val="en-US"/>
+        </w:rPr>
+        <w:t>Biosemi</w:t>
+      </w:r>
+      <w:proofErr w:type="spellEnd"/>
+      <w:r>
+        <w:rPr>
+          <w:rFonts w:ascii="Calibri" w:hAnsi="Calibri" w:cs="Calibri"/>
+          <w:lang w:val="en-US"/>
+        </w:rPr>
+        <w:t xml:space="preserve"> system, EEGLAB and </w:t>
+      </w:r>
+      <w:proofErr w:type="spellStart"/>
+      <w:r>
+        <w:rPr>
+          <w:rFonts w:ascii="Calibri" w:hAnsi="Calibri" w:cs="Calibri"/>
+          <w:lang w:val="en-US"/>
+        </w:rPr>
+        <w:t>FieldTrip</w:t>
+      </w:r>
+      <w:proofErr w:type="spellEnd"/>
+      <w:r>
+        <w:rPr>
+          <w:rFonts w:ascii="Calibri" w:hAnsi="Calibri" w:cs="Calibri"/>
+          <w:lang w:val="en-US"/>
+        </w:rPr>
+        <w:t xml:space="preserve"> community tend to start by referencing the signal to the </w:t>
+      </w:r>
+      <w:proofErr w:type="spellStart"/>
+      <w:r>
+        <w:rPr>
+          <w:rFonts w:ascii="Calibri" w:hAnsi="Calibri" w:cs="Calibri"/>
+          <w:lang w:val="en-US"/>
+        </w:rPr>
+        <w:t>Cz</w:t>
+      </w:r>
+      <w:proofErr w:type="spellEnd"/>
+      <w:r>
+        <w:rPr>
+          <w:rFonts w:ascii="Calibri" w:hAnsi="Calibri" w:cs="Calibri"/>
+          <w:lang w:val="en-US"/>
+        </w:rPr>
+        <w:t xml:space="preserve"> electrode. This is because the common mode correction is not perfect (see https://www.fieldtriptoolbox.org/faq/preproc/dataformat/biosemi_reference/ and https://www.biosemi.com/faq/cms&amp;drl.htm). However, this has the consequence of removing one electrode, which must be ignored in ICA decomposition (decreasing the rank). If you use ICA to remove large artefacts, such as those caused by the eyes or muscles, the final results are the same whether or not this initial re-referencing is performed. </w:t>
+      </w:r>
+      <w:proofErr w:type="spellStart"/>
+      <w:r>
+        <w:rPr>
+          <w:rFonts w:ascii="Calibri" w:hAnsi="Calibri" w:cs="Calibri"/>
+          <w:lang w:val="en-US"/>
+        </w:rPr>
+        <w:t>Biosemi</w:t>
+      </w:r>
+      <w:proofErr w:type="spellEnd"/>
+      <w:r>
+        <w:rPr>
+          <w:rFonts w:ascii="Calibri" w:hAnsi="Calibri" w:cs="Calibri"/>
+          <w:lang w:val="en-US"/>
+        </w:rPr>
+        <w:t xml:space="preserve"> specifies that </w:t>
+      </w:r>
+      <w:proofErr w:type="spellStart"/>
+      <w:r>
+        <w:rPr>
+          <w:rFonts w:ascii="Calibri" w:hAnsi="Calibri" w:cs="Calibri"/>
+          <w:lang w:val="en-US"/>
+        </w:rPr>
+        <w:t>rereferencing</w:t>
+      </w:r>
+      <w:proofErr w:type="spellEnd"/>
+      <w:r>
+        <w:rPr>
+          <w:rFonts w:ascii="Calibri" w:hAnsi="Calibri" w:cs="Calibri"/>
+          <w:lang w:val="en-US"/>
+        </w:rPr>
+        <w:t xml:space="preserve"> is required, which is always done on the average reference before </w:t>
+      </w:r>
+      <w:proofErr w:type="spellStart"/>
+      <w:r>
+        <w:rPr>
+          <w:rFonts w:ascii="Calibri" w:hAnsi="Calibri" w:cs="Calibri"/>
+          <w:lang w:val="en-US"/>
+        </w:rPr>
+        <w:t>epoching</w:t>
+      </w:r>
+      <w:proofErr w:type="spellEnd"/>
+      <w:r>
+        <w:rPr>
+          <w:rFonts w:ascii="Calibri" w:hAnsi="Calibri" w:cs="Calibri"/>
+          <w:lang w:val="en-US"/>
+        </w:rPr>
+        <w:t xml:space="preserve">. Whether or not to add this supplementary reference to </w:t>
+      </w:r>
+      <w:proofErr w:type="spellStart"/>
+      <w:r>
+        <w:rPr>
+          <w:rFonts w:ascii="Calibri" w:hAnsi="Calibri" w:cs="Calibri"/>
+          <w:lang w:val="en-US"/>
+        </w:rPr>
+        <w:t>Cz</w:t>
+      </w:r>
+      <w:proofErr w:type="spellEnd"/>
+      <w:r>
+        <w:rPr>
+          <w:rFonts w:ascii="Calibri" w:hAnsi="Calibri" w:cs="Calibri"/>
+          <w:lang w:val="en-US"/>
+        </w:rPr>
+        <w:t xml:space="preserve"> is up to you.</w:t>
       </w:r>
       <w:r>
         <w:rPr>
@@ -4611,7 +5897,71 @@
           <w:lang w:val="en-US"/>
         </w:rPr>
         <w:br/>
-        <w:t xml:space="preserve">When you use the Batch system of EEGpal, start the process by the Rereference_Reref1 programmed to reref the data on Cz electrode. nthe </w:t>
+        <w:t xml:space="preserve">When you use the Batch system of </w:t>
+      </w:r>
+      <w:proofErr w:type="spellStart"/>
+      <w:r>
+        <w:rPr>
+          <w:rFonts w:ascii="Calibri" w:hAnsi="Calibri" w:cs="Calibri"/>
+          <w:lang w:val="en-US"/>
+        </w:rPr>
+        <w:t>EEGpal</w:t>
+      </w:r>
+      <w:proofErr w:type="spellEnd"/>
+      <w:r>
+        <w:rPr>
+          <w:rFonts w:ascii="Calibri" w:hAnsi="Calibri" w:cs="Calibri"/>
+          <w:lang w:val="en-US"/>
+        </w:rPr>
+        <w:t xml:space="preserve">, start the process by the Rereference_Reref1 programmed to </w:t>
+      </w:r>
+      <w:proofErr w:type="spellStart"/>
+      <w:r>
+        <w:rPr>
+          <w:rFonts w:ascii="Calibri" w:hAnsi="Calibri" w:cs="Calibri"/>
+          <w:lang w:val="en-US"/>
+        </w:rPr>
+        <w:t>reref</w:t>
+      </w:r>
+      <w:proofErr w:type="spellEnd"/>
+      <w:r>
+        <w:rPr>
+          <w:rFonts w:ascii="Calibri" w:hAnsi="Calibri" w:cs="Calibri"/>
+          <w:lang w:val="en-US"/>
+        </w:rPr>
+        <w:t xml:space="preserve"> the data on </w:t>
+      </w:r>
+      <w:proofErr w:type="spellStart"/>
+      <w:r>
+        <w:rPr>
+          <w:rFonts w:ascii="Calibri" w:hAnsi="Calibri" w:cs="Calibri"/>
+          <w:lang w:val="en-US"/>
+        </w:rPr>
+        <w:t>Cz</w:t>
+      </w:r>
+      <w:proofErr w:type="spellEnd"/>
+      <w:r>
+        <w:rPr>
+          <w:rFonts w:ascii="Calibri" w:hAnsi="Calibri" w:cs="Calibri"/>
+          <w:lang w:val="en-US"/>
+        </w:rPr>
+        <w:t xml:space="preserve"> electrode. </w:t>
+      </w:r>
+      <w:proofErr w:type="spellStart"/>
+      <w:r>
+        <w:rPr>
+          <w:rFonts w:ascii="Calibri" w:hAnsi="Calibri" w:cs="Calibri"/>
+          <w:lang w:val="en-US"/>
+        </w:rPr>
+        <w:t>nthe</w:t>
+      </w:r>
+      <w:proofErr w:type="spellEnd"/>
+      <w:r>
+        <w:rPr>
+          <w:rFonts w:ascii="Calibri" w:hAnsi="Calibri" w:cs="Calibri"/>
+          <w:lang w:val="en-US"/>
+        </w:rPr>
+        <w:t xml:space="preserve"> </w:t>
       </w:r>
       <w:r>
         <w:rPr>
@@ -4743,8 +6093,17 @@
           <w:rFonts w:ascii="Calibri" w:hAnsi="Calibri" w:cs="Calibri"/>
           <w:lang w:val="en-US"/>
         </w:rPr>
-        <w:t xml:space="preserve"> and 40 Hz. Add a Line noise removal either by a Notch filter at 50 Hz or by using cleanline</w:t>
-      </w:r>
+        <w:t xml:space="preserve"> and 40 Hz. Add a Line noise removal either by a Notch filter at 50 Hz or by using </w:t>
+      </w:r>
+      <w:proofErr w:type="spellStart"/>
+      <w:r>
+        <w:rPr>
+          <w:rFonts w:ascii="Calibri" w:hAnsi="Calibri" w:cs="Calibri"/>
+          <w:lang w:val="en-US"/>
+        </w:rPr>
+        <w:t>cleanline</w:t>
+      </w:r>
+      <w:proofErr w:type="spellEnd"/>
     </w:p>
     <w:p>
       <w:pPr>
@@ -4763,7 +6122,23 @@
           <w:rFonts w:ascii="Calibri" w:hAnsi="Calibri" w:cs="Calibri"/>
           <w:lang w:val="en-US"/>
         </w:rPr>
-        <w:t xml:space="preserve">Inspect visually the result file in Cartool to check if there </w:t>
+        <w:t xml:space="preserve">Inspect visually the result file in </w:t>
+      </w:r>
+      <w:proofErr w:type="spellStart"/>
+      <w:r>
+        <w:rPr>
+          <w:rFonts w:ascii="Calibri" w:hAnsi="Calibri" w:cs="Calibri"/>
+          <w:lang w:val="en-US"/>
+        </w:rPr>
+        <w:t>Cartool</w:t>
+      </w:r>
+      <w:proofErr w:type="spellEnd"/>
+      <w:r>
+        <w:rPr>
+          <w:rFonts w:ascii="Calibri" w:hAnsi="Calibri" w:cs="Calibri"/>
+          <w:lang w:val="en-US"/>
+        </w:rPr>
+        <w:t xml:space="preserve"> to check if there </w:t>
       </w:r>
       <w:r>
         <w:rPr>
@@ -4913,6 +6288,7 @@
         </w:rPr>
         <w:t xml:space="preserve">Use the </w:t>
       </w:r>
+      <w:proofErr w:type="spellStart"/>
       <w:r>
         <w:rPr>
           <w:rFonts w:ascii="Calibri" w:hAnsi="Calibri" w:cs="Calibri"/>
@@ -4922,12 +6298,45 @@
         </w:rPr>
         <w:t>Epoching</w:t>
       </w:r>
-      <w:r>
-        <w:rPr>
-          <w:rFonts w:ascii="Calibri" w:hAnsi="Calibri" w:cs="Calibri"/>
-          <w:lang w:val="en-US"/>
-        </w:rPr>
-        <w:t xml:space="preserve"> module to perform a temporary Epoching and inspects visually in Cartool the ERP files. Selected the bad electrodes which negatively impact the ERP to be interpolated</w:t>
+      <w:proofErr w:type="spellEnd"/>
+      <w:r>
+        <w:rPr>
+          <w:rFonts w:ascii="Calibri" w:hAnsi="Calibri" w:cs="Calibri"/>
+          <w:lang w:val="en-US"/>
+        </w:rPr>
+        <w:t xml:space="preserve"> module to perform a temporary </w:t>
+      </w:r>
+      <w:proofErr w:type="spellStart"/>
+      <w:r>
+        <w:rPr>
+          <w:rFonts w:ascii="Calibri" w:hAnsi="Calibri" w:cs="Calibri"/>
+          <w:lang w:val="en-US"/>
+        </w:rPr>
+        <w:t>Epoching</w:t>
+      </w:r>
+      <w:proofErr w:type="spellEnd"/>
+      <w:r>
+        <w:rPr>
+          <w:rFonts w:ascii="Calibri" w:hAnsi="Calibri" w:cs="Calibri"/>
+          <w:lang w:val="en-US"/>
+        </w:rPr>
+        <w:t xml:space="preserve"> and inspects visually in </w:t>
+      </w:r>
+      <w:proofErr w:type="spellStart"/>
+      <w:r>
+        <w:rPr>
+          <w:rFonts w:ascii="Calibri" w:hAnsi="Calibri" w:cs="Calibri"/>
+          <w:lang w:val="en-US"/>
+        </w:rPr>
+        <w:t>Cartool</w:t>
+      </w:r>
+      <w:proofErr w:type="spellEnd"/>
+      <w:r>
+        <w:rPr>
+          <w:rFonts w:ascii="Calibri" w:hAnsi="Calibri" w:cs="Calibri"/>
+          <w:lang w:val="en-US"/>
+        </w:rPr>
+        <w:t xml:space="preserve"> the ERP files. Selected the bad electrodes which negatively impact the ERP to be interpolated</w:t>
       </w:r>
     </w:p>
     <w:p>
@@ -4985,6 +6394,7 @@
         </w:rPr>
         <w:t xml:space="preserve">Use the </w:t>
       </w:r>
+      <w:proofErr w:type="spellStart"/>
       <w:r>
         <w:rPr>
           <w:rFonts w:ascii="Calibri" w:hAnsi="Calibri" w:cs="Calibri"/>
@@ -4994,6 +6404,7 @@
         </w:rPr>
         <w:t>Refef</w:t>
       </w:r>
+      <w:proofErr w:type="spellEnd"/>
       <w:r>
         <w:rPr>
           <w:rFonts w:ascii="Calibri" w:hAnsi="Calibri" w:cs="Calibri"/>
@@ -5019,16 +6430,39 @@
           <w:rFonts w:ascii="Calibri" w:hAnsi="Calibri" w:cs="Calibri"/>
           <w:lang w:val="en-US"/>
         </w:rPr>
-        <w:t>Use the Epoching module to compute the final ERPs</w:t>
-      </w:r>
-    </w:p>
-    <w:p>
-      <w:pPr>
-        <w:rPr>
-          <w:rFonts w:ascii="Calibri" w:hAnsi="Calibri" w:cs="Calibri"/>
-          <w:lang w:val="en-US"/>
-        </w:rPr>
-      </w:pPr>
+        <w:t xml:space="preserve">Use the </w:t>
+      </w:r>
+      <w:proofErr w:type="spellStart"/>
+      <w:r>
+        <w:rPr>
+          <w:rFonts w:ascii="Calibri" w:hAnsi="Calibri" w:cs="Calibri"/>
+          <w:lang w:val="en-US"/>
+        </w:rPr>
+        <w:t>Epoching</w:t>
+      </w:r>
+      <w:proofErr w:type="spellEnd"/>
+      <w:r>
+        <w:rPr>
+          <w:rFonts w:ascii="Calibri" w:hAnsi="Calibri" w:cs="Calibri"/>
+          <w:lang w:val="en-US"/>
+        </w:rPr>
+        <w:t xml:space="preserve"> module to compute the final ERPs</w:t>
+      </w:r>
+    </w:p>
+    <w:p>
+      <w:pPr>
+        <w:rPr>
+          <w:rFonts w:ascii="Calibri" w:hAnsi="Calibri" w:cs="Calibri"/>
+          <w:lang w:val="en-US"/>
+        </w:rPr>
+      </w:pPr>
+      <w:r>
+        <w:rPr>
+          <w:rFonts w:ascii="Calibri" w:hAnsi="Calibri" w:cs="Calibri"/>
+          <w:lang w:val="en-US"/>
+        </w:rPr>
+        <w:br w:type="page"/>
+      </w:r>
     </w:p>
     <w:p>
       <w:pPr>
@@ -5046,6 +6480,7 @@
           <w:bCs/>
           <w:lang w:val="en-US"/>
         </w:rPr>
+        <w:lastRenderedPageBreak/>
         <w:t>Preprocessing</w:t>
       </w:r>
       <w:r>
@@ -5073,8 +6508,9 @@
           <w:bCs/>
           <w:lang w:val="en-US"/>
         </w:rPr>
-        <w:t xml:space="preserve"> Biosemi</w:t>
-      </w:r>
+        <w:t xml:space="preserve"> </w:t>
+      </w:r>
+      <w:proofErr w:type="spellStart"/>
       <w:r>
         <w:rPr>
           <w:rFonts w:ascii="Calibri" w:hAnsi="Calibri" w:cs="Calibri"/>
@@ -5082,6 +6518,16 @@
           <w:bCs/>
           <w:lang w:val="en-US"/>
         </w:rPr>
+        <w:t>Biosemi</w:t>
+      </w:r>
+      <w:proofErr w:type="spellEnd"/>
+      <w:r>
+        <w:rPr>
+          <w:rFonts w:ascii="Calibri" w:hAnsi="Calibri" w:cs="Calibri"/>
+          <w:b/>
+          <w:bCs/>
+          <w:lang w:val="en-US"/>
+        </w:rPr>
         <w:t xml:space="preserve"> according to the EEGLAB community</w:t>
       </w:r>
     </w:p>
@@ -5097,22 +6543,401 @@
           <w:rFonts w:ascii="Calibri" w:hAnsi="Calibri" w:cs="Calibri"/>
           <w:lang w:val="en-US"/>
         </w:rPr>
-        <w:t xml:space="preserve">If you are working with the Biosemi system, EEGLAB and FieldTrip community tend to start by referencing the signal to the Cz electrode. This is because the common mode correction is not perfect </w:t>
-      </w:r>
-      <w:r>
-        <w:rPr>
-          <w:rFonts w:ascii="Calibri" w:hAnsi="Calibri" w:cs="Calibri"/>
-          <w:lang w:val="en-US"/>
-        </w:rPr>
-        <w:lastRenderedPageBreak/>
-        <w:t xml:space="preserve">(see https://www.fieldtriptoolbox.org/faq/preproc/dataformat/biosemi_reference/ and https://www.biosemi.com/faq/cms&amp;drl.htm). However, this has the consequence of removing one electrode, which must be ignored in ICA decomposition (decreasing the rank). If you use ICA to remove large artefacts, such as those caused by the eyes or muscles, the final results are the same whether or not this initial re-referencing is performed. Biosemi specifies that rereferencing is required, which is always done on the average reference before epoching. </w:t>
-      </w:r>
-      <w:r>
-        <w:rPr>
-          <w:rFonts w:ascii="Calibri" w:hAnsi="Calibri" w:cs="Calibri"/>
-          <w:lang w:val="en-US"/>
-        </w:rPr>
-        <w:t>Whether or not to include this additional reference to Cz is your decision.</w:t>
+        <w:t xml:space="preserve">If you are working with </w:t>
+      </w:r>
+      <w:r>
+        <w:rPr>
+          <w:rFonts w:ascii="Calibri" w:hAnsi="Calibri" w:cs="Calibri"/>
+          <w:lang w:val="en-US"/>
+        </w:rPr>
+        <w:t xml:space="preserve">data recorded with </w:t>
+      </w:r>
+      <w:r>
+        <w:rPr>
+          <w:rFonts w:ascii="Calibri" w:hAnsi="Calibri" w:cs="Calibri"/>
+          <w:lang w:val="en-US"/>
+        </w:rPr>
+        <w:t xml:space="preserve">the </w:t>
+      </w:r>
+      <w:proofErr w:type="spellStart"/>
+      <w:r>
+        <w:rPr>
+          <w:rFonts w:ascii="Calibri" w:hAnsi="Calibri" w:cs="Calibri"/>
+          <w:lang w:val="en-US"/>
+        </w:rPr>
+        <w:t>Biosemi</w:t>
+      </w:r>
+      <w:proofErr w:type="spellEnd"/>
+      <w:r>
+        <w:rPr>
+          <w:rFonts w:ascii="Calibri" w:hAnsi="Calibri" w:cs="Calibri"/>
+          <w:lang w:val="en-US"/>
+        </w:rPr>
+        <w:t xml:space="preserve"> system, EEGLAB and </w:t>
+      </w:r>
+      <w:proofErr w:type="spellStart"/>
+      <w:r>
+        <w:rPr>
+          <w:rFonts w:ascii="Calibri" w:hAnsi="Calibri" w:cs="Calibri"/>
+          <w:lang w:val="en-US"/>
+        </w:rPr>
+        <w:t>FieldTrip</w:t>
+      </w:r>
+      <w:proofErr w:type="spellEnd"/>
+      <w:r>
+        <w:rPr>
+          <w:rFonts w:ascii="Calibri" w:hAnsi="Calibri" w:cs="Calibri"/>
+          <w:lang w:val="en-US"/>
+        </w:rPr>
+        <w:t xml:space="preserve"> community tend to start by referencing the signal to the </w:t>
+      </w:r>
+      <w:proofErr w:type="spellStart"/>
+      <w:r>
+        <w:rPr>
+          <w:rFonts w:ascii="Calibri" w:hAnsi="Calibri" w:cs="Calibri"/>
+          <w:lang w:val="en-US"/>
+        </w:rPr>
+        <w:t>Cz</w:t>
+      </w:r>
+      <w:proofErr w:type="spellEnd"/>
+      <w:r>
+        <w:rPr>
+          <w:rFonts w:ascii="Calibri" w:hAnsi="Calibri" w:cs="Calibri"/>
+          <w:lang w:val="en-US"/>
+        </w:rPr>
+        <w:t xml:space="preserve"> electrode. This is because the common mode correction is not perfect (see https://www.fieldtriptoolbox.org/faq/preproc/dataformat/biosemi_reference/ and https://www.biosemi.com/faq/cms&amp;drl.htm). However, this has the consequence of removing one electrode, which must be ignored in ICA decomposition (decreasing the rank)</w:t>
+      </w:r>
+      <w:r>
+        <w:rPr>
+          <w:rFonts w:ascii="Calibri" w:hAnsi="Calibri" w:cs="Calibri"/>
+          <w:lang w:val="en-US"/>
+        </w:rPr>
+        <w:t xml:space="preserve"> + </w:t>
+      </w:r>
+      <w:proofErr w:type="gramStart"/>
+      <w:r>
+        <w:rPr>
+          <w:rFonts w:ascii="Calibri" w:hAnsi="Calibri" w:cs="Calibri"/>
+          <w:lang w:val="en-US"/>
+        </w:rPr>
+        <w:t>delete</w:t>
+      </w:r>
+      <w:proofErr w:type="gramEnd"/>
+      <w:r>
+        <w:rPr>
+          <w:rFonts w:ascii="Calibri" w:hAnsi="Calibri" w:cs="Calibri"/>
+          <w:lang w:val="en-US"/>
+        </w:rPr>
+        <w:t xml:space="preserve"> the signal from the </w:t>
+      </w:r>
+      <w:proofErr w:type="spellStart"/>
+      <w:r>
+        <w:rPr>
+          <w:rFonts w:ascii="Calibri" w:hAnsi="Calibri" w:cs="Calibri"/>
+          <w:lang w:val="en-US"/>
+        </w:rPr>
+        <w:t>Cz</w:t>
+      </w:r>
+      <w:proofErr w:type="spellEnd"/>
+      <w:r>
+        <w:rPr>
+          <w:rFonts w:ascii="Calibri" w:hAnsi="Calibri" w:cs="Calibri"/>
+          <w:lang w:val="en-US"/>
+        </w:rPr>
+        <w:t xml:space="preserve"> channel (which will need to be interpolated)</w:t>
+      </w:r>
+      <w:r>
+        <w:rPr>
+          <w:rFonts w:ascii="Calibri" w:hAnsi="Calibri" w:cs="Calibri"/>
+          <w:lang w:val="en-US"/>
+        </w:rPr>
+        <w:t xml:space="preserve">. </w:t>
+      </w:r>
+    </w:p>
+    <w:p>
+      <w:pPr>
+        <w:rPr>
+          <w:rFonts w:ascii="Calibri" w:hAnsi="Calibri" w:cs="Calibri"/>
+          <w:lang w:val="en-US"/>
+        </w:rPr>
+      </w:pPr>
+      <w:r>
+        <w:rPr>
+          <w:rFonts w:ascii="Calibri" w:hAnsi="Calibri" w:cs="Calibri"/>
+          <w:lang w:val="en-US"/>
+        </w:rPr>
+        <w:t xml:space="preserve">In practice, </w:t>
+      </w:r>
+      <w:r>
+        <w:rPr>
+          <w:rFonts w:ascii="Calibri" w:hAnsi="Calibri" w:cs="Calibri"/>
+          <w:lang w:val="en-US"/>
+        </w:rPr>
+        <w:t>we</w:t>
+      </w:r>
+      <w:r>
+        <w:rPr>
+          <w:rFonts w:ascii="Calibri" w:hAnsi="Calibri" w:cs="Calibri"/>
+          <w:lang w:val="en-US"/>
+        </w:rPr>
+        <w:t xml:space="preserve"> compared the following processing </w:t>
+      </w:r>
+      <w:r>
+        <w:rPr>
+          <w:rFonts w:ascii="Calibri" w:hAnsi="Calibri" w:cs="Calibri"/>
+          <w:lang w:val="en-US"/>
+        </w:rPr>
+        <w:t xml:space="preserve">(with </w:t>
+      </w:r>
+      <w:proofErr w:type="spellStart"/>
+      <w:r>
+        <w:rPr>
+          <w:rFonts w:ascii="Calibri" w:hAnsi="Calibri" w:cs="Calibri"/>
+          <w:lang w:val="en-US"/>
+        </w:rPr>
+        <w:t>Cz</w:t>
+      </w:r>
+      <w:proofErr w:type="spellEnd"/>
+      <w:r>
+        <w:rPr>
+          <w:rFonts w:ascii="Calibri" w:hAnsi="Calibri" w:cs="Calibri"/>
+          <w:lang w:val="en-US"/>
+        </w:rPr>
+        <w:t xml:space="preserve"> </w:t>
+      </w:r>
+      <w:proofErr w:type="spellStart"/>
+      <w:r>
+        <w:rPr>
+          <w:rFonts w:ascii="Calibri" w:hAnsi="Calibri" w:cs="Calibri"/>
+          <w:lang w:val="en-US"/>
+        </w:rPr>
+        <w:t>reref</w:t>
+      </w:r>
+      <w:proofErr w:type="spellEnd"/>
+      <w:r>
+        <w:rPr>
+          <w:rFonts w:ascii="Calibri" w:hAnsi="Calibri" w:cs="Calibri"/>
+          <w:lang w:val="en-US"/>
+        </w:rPr>
+        <w:t xml:space="preserve"> at beginning) </w:t>
+      </w:r>
+      <w:r>
+        <w:rPr>
+          <w:rFonts w:ascii="Calibri" w:hAnsi="Calibri" w:cs="Calibri"/>
+          <w:lang w:val="en-US"/>
+        </w:rPr>
+        <w:t>with the previous one</w:t>
+      </w:r>
+      <w:r>
+        <w:rPr>
+          <w:rFonts w:ascii="Calibri" w:hAnsi="Calibri" w:cs="Calibri"/>
+          <w:lang w:val="en-US"/>
+        </w:rPr>
+        <w:t xml:space="preserve"> (without </w:t>
+      </w:r>
+      <w:proofErr w:type="spellStart"/>
+      <w:r>
+        <w:rPr>
+          <w:rFonts w:ascii="Calibri" w:hAnsi="Calibri" w:cs="Calibri"/>
+          <w:lang w:val="en-US"/>
+        </w:rPr>
+        <w:t>Cz</w:t>
+      </w:r>
+      <w:proofErr w:type="spellEnd"/>
+      <w:r>
+        <w:rPr>
+          <w:rFonts w:ascii="Calibri" w:hAnsi="Calibri" w:cs="Calibri"/>
+          <w:lang w:val="en-US"/>
+        </w:rPr>
+        <w:t xml:space="preserve"> </w:t>
+      </w:r>
+      <w:proofErr w:type="spellStart"/>
+      <w:r>
+        <w:rPr>
+          <w:rFonts w:ascii="Calibri" w:hAnsi="Calibri" w:cs="Calibri"/>
+          <w:lang w:val="en-US"/>
+        </w:rPr>
+        <w:t>reref</w:t>
+      </w:r>
+      <w:proofErr w:type="spellEnd"/>
+      <w:r>
+        <w:rPr>
+          <w:rFonts w:ascii="Calibri" w:hAnsi="Calibri" w:cs="Calibri"/>
+          <w:lang w:val="en-US"/>
+        </w:rPr>
+        <w:t xml:space="preserve"> at the beginning)</w:t>
+      </w:r>
+      <w:r>
+        <w:rPr>
+          <w:rFonts w:ascii="Calibri" w:hAnsi="Calibri" w:cs="Calibri"/>
+          <w:lang w:val="en-US"/>
+        </w:rPr>
+        <w:t xml:space="preserve"> on one study recorded in a faraday cage</w:t>
+      </w:r>
+      <w:r>
+        <w:rPr>
+          <w:rFonts w:ascii="Calibri" w:hAnsi="Calibri" w:cs="Calibri"/>
+          <w:lang w:val="en-US"/>
+        </w:rPr>
+        <w:t xml:space="preserve">. If you use Independent Component Analysis (ICA) to remove large artefacts, such as those caused by the eyes or muscles, the </w:t>
+      </w:r>
+      <w:proofErr w:type="gramStart"/>
+      <w:r>
+        <w:rPr>
+          <w:rFonts w:ascii="Calibri" w:hAnsi="Calibri" w:cs="Calibri"/>
+          <w:lang w:val="en-US"/>
+        </w:rPr>
+        <w:t>final results</w:t>
+      </w:r>
+      <w:proofErr w:type="gramEnd"/>
+      <w:r>
+        <w:rPr>
+          <w:rFonts w:ascii="Calibri" w:hAnsi="Calibri" w:cs="Calibri"/>
+          <w:lang w:val="en-US"/>
+        </w:rPr>
+        <w:t xml:space="preserve"> are the same. </w:t>
+      </w:r>
+      <w:proofErr w:type="spellStart"/>
+      <w:r>
+        <w:rPr>
+          <w:rFonts w:ascii="Calibri" w:hAnsi="Calibri" w:cs="Calibri"/>
+          <w:lang w:val="en-US"/>
+        </w:rPr>
+        <w:t>Biosemi</w:t>
+      </w:r>
+      <w:proofErr w:type="spellEnd"/>
+      <w:r>
+        <w:rPr>
+          <w:rFonts w:ascii="Calibri" w:hAnsi="Calibri" w:cs="Calibri"/>
+          <w:lang w:val="en-US"/>
+        </w:rPr>
+        <w:t xml:space="preserve"> specifies that </w:t>
+      </w:r>
+      <w:proofErr w:type="spellStart"/>
+      <w:r>
+        <w:rPr>
+          <w:rFonts w:ascii="Calibri" w:hAnsi="Calibri" w:cs="Calibri"/>
+          <w:lang w:val="en-US"/>
+        </w:rPr>
+        <w:t>rereferencing</w:t>
+      </w:r>
+      <w:proofErr w:type="spellEnd"/>
+      <w:r>
+        <w:rPr>
+          <w:rFonts w:ascii="Calibri" w:hAnsi="Calibri" w:cs="Calibri"/>
+          <w:lang w:val="en-US"/>
+        </w:rPr>
+        <w:t xml:space="preserve"> is required, which is always performed on the average reference prior to </w:t>
+      </w:r>
+      <w:proofErr w:type="spellStart"/>
+      <w:r>
+        <w:rPr>
+          <w:rFonts w:ascii="Calibri" w:hAnsi="Calibri" w:cs="Calibri"/>
+          <w:lang w:val="en-US"/>
+        </w:rPr>
+        <w:t>epoching</w:t>
+      </w:r>
+      <w:proofErr w:type="spellEnd"/>
+      <w:r>
+        <w:rPr>
+          <w:rFonts w:ascii="Calibri" w:hAnsi="Calibri" w:cs="Calibri"/>
+          <w:lang w:val="en-US"/>
+        </w:rPr>
+        <w:t xml:space="preserve">. </w:t>
+      </w:r>
+      <w:r>
+        <w:rPr>
+          <w:rFonts w:ascii="Calibri" w:hAnsi="Calibri" w:cs="Calibri"/>
+          <w:lang w:val="en-US"/>
+        </w:rPr>
+        <w:t xml:space="preserve">However, we observed that the preprocessing of data recorded outside of a </w:t>
+      </w:r>
+      <w:proofErr w:type="spellStart"/>
+      <w:r>
+        <w:rPr>
+          <w:rFonts w:ascii="Calibri" w:hAnsi="Calibri" w:cs="Calibri"/>
+          <w:lang w:val="en-US"/>
+        </w:rPr>
+        <w:t>Farady</w:t>
+      </w:r>
+      <w:proofErr w:type="spellEnd"/>
+      <w:r>
+        <w:rPr>
+          <w:rFonts w:ascii="Calibri" w:hAnsi="Calibri" w:cs="Calibri"/>
+          <w:lang w:val="en-US"/>
+        </w:rPr>
+        <w:t xml:space="preserve"> cage (with a lot of 50Hz noise) gives better results with the following procedure (with </w:t>
+      </w:r>
+      <w:proofErr w:type="spellStart"/>
+      <w:r>
+        <w:rPr>
+          <w:rFonts w:ascii="Calibri" w:hAnsi="Calibri" w:cs="Calibri"/>
+          <w:lang w:val="en-US"/>
+        </w:rPr>
+        <w:t>reref</w:t>
+      </w:r>
+      <w:proofErr w:type="spellEnd"/>
+      <w:r>
+        <w:rPr>
+          <w:rFonts w:ascii="Calibri" w:hAnsi="Calibri" w:cs="Calibri"/>
+          <w:lang w:val="en-US"/>
+        </w:rPr>
+        <w:t xml:space="preserve"> to </w:t>
+      </w:r>
+      <w:proofErr w:type="spellStart"/>
+      <w:r>
+        <w:rPr>
+          <w:rFonts w:ascii="Calibri" w:hAnsi="Calibri" w:cs="Calibri"/>
+          <w:lang w:val="en-US"/>
+        </w:rPr>
+        <w:t>Cz</w:t>
+      </w:r>
+      <w:proofErr w:type="spellEnd"/>
+      <w:r>
+        <w:rPr>
+          <w:rFonts w:ascii="Calibri" w:hAnsi="Calibri" w:cs="Calibri"/>
+          <w:lang w:val="en-US"/>
+        </w:rPr>
+        <w:t xml:space="preserve"> at the beginning).</w:t>
+      </w:r>
+      <w:r>
+        <w:rPr>
+          <w:rFonts w:ascii="Calibri" w:hAnsi="Calibri" w:cs="Calibri"/>
+          <w:lang w:val="en-US"/>
+        </w:rPr>
+        <w:br/>
+      </w:r>
+      <w:proofErr w:type="gramStart"/>
+      <w:r>
+        <w:rPr>
+          <w:rFonts w:ascii="Calibri" w:hAnsi="Calibri" w:cs="Calibri"/>
+          <w:lang w:val="en-US"/>
+        </w:rPr>
+        <w:t>Whether or not</w:t>
+      </w:r>
+      <w:proofErr w:type="gramEnd"/>
+      <w:r>
+        <w:rPr>
+          <w:rFonts w:ascii="Calibri" w:hAnsi="Calibri" w:cs="Calibri"/>
+          <w:lang w:val="en-US"/>
+        </w:rPr>
+        <w:t xml:space="preserve"> to include an additional reference to </w:t>
+      </w:r>
+      <w:proofErr w:type="spellStart"/>
+      <w:r>
+        <w:rPr>
+          <w:rFonts w:ascii="Calibri" w:hAnsi="Calibri" w:cs="Calibri"/>
+          <w:lang w:val="en-US"/>
+        </w:rPr>
+        <w:t>Cz</w:t>
+      </w:r>
+      <w:proofErr w:type="spellEnd"/>
+      <w:r>
+        <w:rPr>
+          <w:rFonts w:ascii="Calibri" w:hAnsi="Calibri" w:cs="Calibri"/>
+          <w:lang w:val="en-US"/>
+        </w:rPr>
+        <w:t xml:space="preserve"> is your decision.</w:t>
       </w:r>
     </w:p>
     <w:p>
@@ -5132,7 +6957,23 @@
           <w:rFonts w:ascii="Calibri" w:hAnsi="Calibri" w:cs="Calibri"/>
           <w:lang w:val="en-US"/>
         </w:rPr>
-        <w:t xml:space="preserve">Import raw data into the main EEGpal windows and identify the subject as explained in the chapter </w:t>
+        <w:t xml:space="preserve">Import raw data into the main </w:t>
+      </w:r>
+      <w:proofErr w:type="spellStart"/>
+      <w:r>
+        <w:rPr>
+          <w:rFonts w:ascii="Calibri" w:hAnsi="Calibri" w:cs="Calibri"/>
+          <w:lang w:val="en-US"/>
+        </w:rPr>
+        <w:t>EEGpal</w:t>
+      </w:r>
+      <w:proofErr w:type="spellEnd"/>
+      <w:r>
+        <w:rPr>
+          <w:rFonts w:ascii="Calibri" w:hAnsi="Calibri" w:cs="Calibri"/>
+          <w:lang w:val="en-US"/>
+        </w:rPr>
+        <w:t xml:space="preserve"> windows and identify the subject as explained in the chapter </w:t>
       </w:r>
       <w:r>
         <w:rPr>
@@ -5204,7 +7045,39 @@
           <w:rFonts w:ascii="Calibri" w:hAnsi="Calibri" w:cs="Calibri"/>
           <w:lang w:val="en-US"/>
         </w:rPr>
-        <w:t xml:space="preserve">Start the process by the Rereference_Reref1 programmed to reref the data on Cz electrode. </w:t>
+        <w:t xml:space="preserve">Perform a </w:t>
+      </w:r>
+      <w:r>
+        <w:rPr>
+          <w:rFonts w:ascii="Calibri" w:hAnsi="Calibri" w:cs="Calibri"/>
+          <w:i/>
+          <w:iCs/>
+          <w:lang w:val="en-US"/>
+        </w:rPr>
+        <w:t>Bridge Detection</w:t>
+      </w:r>
+      <w:r>
+        <w:rPr>
+          <w:rFonts w:ascii="Calibri" w:hAnsi="Calibri" w:cs="Calibri"/>
+          <w:lang w:val="en-US"/>
+        </w:rPr>
+        <w:t xml:space="preserve"> </w:t>
+      </w:r>
+      <w:proofErr w:type="gramStart"/>
+      <w:r>
+        <w:rPr>
+          <w:rFonts w:ascii="Calibri" w:hAnsi="Calibri" w:cs="Calibri"/>
+          <w:lang w:val="en-US"/>
+        </w:rPr>
+        <w:t>in order to</w:t>
+      </w:r>
+      <w:proofErr w:type="gramEnd"/>
+      <w:r>
+        <w:rPr>
+          <w:rFonts w:ascii="Calibri" w:hAnsi="Calibri" w:cs="Calibri"/>
+          <w:lang w:val="en-US"/>
+        </w:rPr>
+        <w:t xml:space="preserve"> check if there is any unwanted connection between channels</w:t>
       </w:r>
     </w:p>
     <w:p>
@@ -5224,23 +7097,39 @@
           <w:rFonts w:ascii="Calibri" w:hAnsi="Calibri" w:cs="Calibri"/>
           <w:lang w:val="en-US"/>
         </w:rPr>
-        <w:t xml:space="preserve">Perform a </w:t>
-      </w:r>
-      <w:r>
-        <w:rPr>
-          <w:rFonts w:ascii="Calibri" w:hAnsi="Calibri" w:cs="Calibri"/>
-          <w:i/>
-          <w:iCs/>
-          <w:lang w:val="en-US"/>
-        </w:rPr>
-        <w:t>Bridge Detection</w:t>
-      </w:r>
-      <w:r>
-        <w:rPr>
-          <w:rFonts w:ascii="Calibri" w:hAnsi="Calibri" w:cs="Calibri"/>
-          <w:lang w:val="en-US"/>
-        </w:rPr>
-        <w:t xml:space="preserve"> in order to check if there is any unwanted connection between channels</w:t>
+        <w:t xml:space="preserve">Start the process by the Rereference_Reref1 programmed to </w:t>
+      </w:r>
+      <w:proofErr w:type="spellStart"/>
+      <w:r>
+        <w:rPr>
+          <w:rFonts w:ascii="Calibri" w:hAnsi="Calibri" w:cs="Calibri"/>
+          <w:lang w:val="en-US"/>
+        </w:rPr>
+        <w:t>reref</w:t>
+      </w:r>
+      <w:proofErr w:type="spellEnd"/>
+      <w:r>
+        <w:rPr>
+          <w:rFonts w:ascii="Calibri" w:hAnsi="Calibri" w:cs="Calibri"/>
+          <w:lang w:val="en-US"/>
+        </w:rPr>
+        <w:t xml:space="preserve"> the data on </w:t>
+      </w:r>
+      <w:proofErr w:type="spellStart"/>
+      <w:r>
+        <w:rPr>
+          <w:rFonts w:ascii="Calibri" w:hAnsi="Calibri" w:cs="Calibri"/>
+          <w:lang w:val="en-US"/>
+        </w:rPr>
+        <w:t>Cz</w:t>
+      </w:r>
+      <w:proofErr w:type="spellEnd"/>
+      <w:r>
+        <w:rPr>
+          <w:rFonts w:ascii="Calibri" w:hAnsi="Calibri" w:cs="Calibri"/>
+          <w:lang w:val="en-US"/>
+        </w:rPr>
+        <w:t xml:space="preserve"> electrode. </w:t>
       </w:r>
     </w:p>
     <w:p>
@@ -5276,7 +7165,23 @@
           <w:rFonts w:ascii="Calibri" w:hAnsi="Calibri" w:cs="Calibri"/>
           <w:lang w:val="en-US"/>
         </w:rPr>
-        <w:t xml:space="preserve"> for the first clean of the data. Filter to keep the signal between 0.</w:t>
+        <w:t xml:space="preserve"> for the first </w:t>
+      </w:r>
+      <w:proofErr w:type="gramStart"/>
+      <w:r>
+        <w:rPr>
+          <w:rFonts w:ascii="Calibri" w:hAnsi="Calibri" w:cs="Calibri"/>
+          <w:lang w:val="en-US"/>
+        </w:rPr>
+        <w:t>clean</w:t>
+      </w:r>
+      <w:proofErr w:type="gramEnd"/>
+      <w:r>
+        <w:rPr>
+          <w:rFonts w:ascii="Calibri" w:hAnsi="Calibri" w:cs="Calibri"/>
+          <w:lang w:val="en-US"/>
+        </w:rPr>
+        <w:t xml:space="preserve"> of the data. Filter to keep the signal between 0.</w:t>
       </w:r>
       <w:r>
         <w:rPr>
@@ -5290,8 +7195,17 @@
           <w:rFonts w:ascii="Calibri" w:hAnsi="Calibri" w:cs="Calibri"/>
           <w:lang w:val="en-US"/>
         </w:rPr>
-        <w:t xml:space="preserve"> and 40 Hz. Add a Line noise removal either by a Notch filter at 50 Hz or by using cleanline</w:t>
-      </w:r>
+        <w:t xml:space="preserve"> and 40 Hz. Add a Line noise removal either by a Notch filter at 50 Hz or by using </w:t>
+      </w:r>
+      <w:proofErr w:type="spellStart"/>
+      <w:r>
+        <w:rPr>
+          <w:rFonts w:ascii="Calibri" w:hAnsi="Calibri" w:cs="Calibri"/>
+          <w:lang w:val="en-US"/>
+        </w:rPr>
+        <w:t>cleanline</w:t>
+      </w:r>
+      <w:proofErr w:type="spellEnd"/>
     </w:p>
     <w:p>
       <w:pPr>
@@ -5310,7 +7224,23 @@
           <w:rFonts w:ascii="Calibri" w:hAnsi="Calibri" w:cs="Calibri"/>
           <w:lang w:val="en-US"/>
         </w:rPr>
-        <w:t>Inspect visually the result file in Cartool to check if there are wrong channels (behave totally differently as the neighbors for some time)</w:t>
+        <w:t xml:space="preserve">Inspect visually the result file in </w:t>
+      </w:r>
+      <w:proofErr w:type="spellStart"/>
+      <w:r>
+        <w:rPr>
+          <w:rFonts w:ascii="Calibri" w:hAnsi="Calibri" w:cs="Calibri"/>
+          <w:lang w:val="en-US"/>
+        </w:rPr>
+        <w:t>Cartool</w:t>
+      </w:r>
+      <w:proofErr w:type="spellEnd"/>
+      <w:r>
+        <w:rPr>
+          <w:rFonts w:ascii="Calibri" w:hAnsi="Calibri" w:cs="Calibri"/>
+          <w:lang w:val="en-US"/>
+        </w:rPr>
+        <w:t xml:space="preserve"> to check if there are wrong channels (behave totally differently as the neighbors for some time)</w:t>
       </w:r>
     </w:p>
     <w:p>
@@ -5411,6 +7341,7 @@
         </w:rPr>
         <w:t xml:space="preserve"> Use the </w:t>
       </w:r>
+      <w:proofErr w:type="spellStart"/>
       <w:r>
         <w:rPr>
           <w:rFonts w:ascii="Calibri" w:hAnsi="Calibri" w:cs="Calibri"/>
@@ -5420,12 +7351,45 @@
         </w:rPr>
         <w:t>Epoching</w:t>
       </w:r>
-      <w:r>
-        <w:rPr>
-          <w:rFonts w:ascii="Calibri" w:hAnsi="Calibri" w:cs="Calibri"/>
-          <w:lang w:val="en-US"/>
-        </w:rPr>
-        <w:t xml:space="preserve"> module to perform a temporary Epoching and inspects visually in Cartool the ERP files. Selected the bad electrodes which negatively impact the ERP to be interpolated</w:t>
+      <w:proofErr w:type="spellEnd"/>
+      <w:r>
+        <w:rPr>
+          <w:rFonts w:ascii="Calibri" w:hAnsi="Calibri" w:cs="Calibri"/>
+          <w:lang w:val="en-US"/>
+        </w:rPr>
+        <w:t xml:space="preserve"> module to perform a temporary </w:t>
+      </w:r>
+      <w:proofErr w:type="spellStart"/>
+      <w:r>
+        <w:rPr>
+          <w:rFonts w:ascii="Calibri" w:hAnsi="Calibri" w:cs="Calibri"/>
+          <w:lang w:val="en-US"/>
+        </w:rPr>
+        <w:t>Epoching</w:t>
+      </w:r>
+      <w:proofErr w:type="spellEnd"/>
+      <w:r>
+        <w:rPr>
+          <w:rFonts w:ascii="Calibri" w:hAnsi="Calibri" w:cs="Calibri"/>
+          <w:lang w:val="en-US"/>
+        </w:rPr>
+        <w:t xml:space="preserve"> and inspects visually in </w:t>
+      </w:r>
+      <w:proofErr w:type="spellStart"/>
+      <w:r>
+        <w:rPr>
+          <w:rFonts w:ascii="Calibri" w:hAnsi="Calibri" w:cs="Calibri"/>
+          <w:lang w:val="en-US"/>
+        </w:rPr>
+        <w:t>Cartool</w:t>
+      </w:r>
+      <w:proofErr w:type="spellEnd"/>
+      <w:r>
+        <w:rPr>
+          <w:rFonts w:ascii="Calibri" w:hAnsi="Calibri" w:cs="Calibri"/>
+          <w:lang w:val="en-US"/>
+        </w:rPr>
+        <w:t xml:space="preserve"> the ERP files. Selected the bad electrodes which negatively impact the ERP to be interpolated</w:t>
       </w:r>
     </w:p>
     <w:p>
@@ -5468,7 +7432,23 @@
           <w:rFonts w:ascii="Calibri" w:hAnsi="Calibri" w:cs="Calibri"/>
           <w:lang w:val="en-US"/>
         </w:rPr>
-        <w:t>You also need to interpolate the Cz electrode signal in all the files, as its information was lost in step 3. The Interpolation module should detect this and complete the interpolation table accordingly. If not, do it manually.</w:t>
+        <w:t xml:space="preserve">You also need to interpolate the </w:t>
+      </w:r>
+      <w:proofErr w:type="spellStart"/>
+      <w:r>
+        <w:rPr>
+          <w:rFonts w:ascii="Calibri" w:hAnsi="Calibri" w:cs="Calibri"/>
+          <w:lang w:val="en-US"/>
+        </w:rPr>
+        <w:t>Cz</w:t>
+      </w:r>
+      <w:proofErr w:type="spellEnd"/>
+      <w:r>
+        <w:rPr>
+          <w:rFonts w:ascii="Calibri" w:hAnsi="Calibri" w:cs="Calibri"/>
+          <w:lang w:val="en-US"/>
+        </w:rPr>
+        <w:t xml:space="preserve"> electrode signal in all the files, as its information was lost in step 3. The Interpolation module should detect this and complete the interpolation table accordingly. If not, do it manually.</w:t>
       </w:r>
     </w:p>
     <w:p>
@@ -5490,6 +7470,7 @@
         </w:rPr>
         <w:t xml:space="preserve">Use the </w:t>
       </w:r>
+      <w:proofErr w:type="spellStart"/>
       <w:r>
         <w:rPr>
           <w:rFonts w:ascii="Calibri" w:hAnsi="Calibri" w:cs="Calibri"/>
@@ -5499,6 +7480,7 @@
         </w:rPr>
         <w:t>Refef</w:t>
       </w:r>
+      <w:proofErr w:type="spellEnd"/>
       <w:r>
         <w:rPr>
           <w:rFonts w:ascii="Calibri" w:hAnsi="Calibri" w:cs="Calibri"/>
@@ -5511,7 +7493,23 @@
           <w:rFonts w:ascii="Calibri" w:hAnsi="Calibri" w:cs="Calibri"/>
           <w:lang w:val="en-US"/>
         </w:rPr>
-        <w:t xml:space="preserve">. If you work in Batch mode, use the second pannel Reref2 to specify different parameters as in 3. Then in the BATCH parameters tool, use the Rereference_Reref2. </w:t>
+        <w:t xml:space="preserve">. If you work in Batch mode, use the second </w:t>
+      </w:r>
+      <w:proofErr w:type="spellStart"/>
+      <w:r>
+        <w:rPr>
+          <w:rFonts w:ascii="Calibri" w:hAnsi="Calibri" w:cs="Calibri"/>
+          <w:lang w:val="en-US"/>
+        </w:rPr>
+        <w:t>pannel</w:t>
+      </w:r>
+      <w:proofErr w:type="spellEnd"/>
+      <w:r>
+        <w:rPr>
+          <w:rFonts w:ascii="Calibri" w:hAnsi="Calibri" w:cs="Calibri"/>
+          <w:lang w:val="en-US"/>
+        </w:rPr>
+        <w:t xml:space="preserve"> Reref2 to specify different parameters as in 3. Then in the BATCH parameters tool, use the Rereference_Reref2. </w:t>
       </w:r>
     </w:p>
     <w:p>
@@ -5531,7 +7529,23 @@
           <w:rFonts w:ascii="Calibri" w:hAnsi="Calibri" w:cs="Calibri"/>
           <w:lang w:val="en-US"/>
         </w:rPr>
-        <w:t>Use the Epoching module to compute the final ERPs</w:t>
+        <w:t xml:space="preserve">Use the </w:t>
+      </w:r>
+      <w:proofErr w:type="spellStart"/>
+      <w:r>
+        <w:rPr>
+          <w:rFonts w:ascii="Calibri" w:hAnsi="Calibri" w:cs="Calibri"/>
+          <w:lang w:val="en-US"/>
+        </w:rPr>
+        <w:t>Epoching</w:t>
+      </w:r>
+      <w:proofErr w:type="spellEnd"/>
+      <w:r>
+        <w:rPr>
+          <w:rFonts w:ascii="Calibri" w:hAnsi="Calibri" w:cs="Calibri"/>
+          <w:lang w:val="en-US"/>
+        </w:rPr>
+        <w:t xml:space="preserve"> module to compute the final ERPs</w:t>
       </w:r>
     </w:p>
     <w:p>
@@ -5543,7 +7557,7 @@
       </w:pPr>
     </w:p>
     <w:sectPr>
-      <w:footerReference w:type="default" r:id="rId21"/>
+      <w:footerReference w:type="default" r:id="rId22"/>
       <w:pgSz w:w="11906" w:h="16838"/>
       <w:pgMar w:top="1417" w:right="1417" w:bottom="1417" w:left="1417" w:header="708" w:footer="708" w:gutter="0"/>
       <w:cols w:space="708"/>

</xml_diff>